<commit_message>
Update Getting Started: export-fo symbols, doc gen options
</commit_message>
<xml_diff>
--- a/docs/Docx4j_GettingStarted.docx
+++ b/docs/Docx4j_GettingStarted.docx
@@ -1,6 +1,6 @@
 
 <file path=word/document.xml><?xml version="1.0" encoding="utf-8"?>
-<w:document xmlns:wpc="http://schemas.microsoft.com/office/word/2010/wordprocessingCanvas" xmlns:cx="http://schemas.microsoft.com/office/drawing/2014/chartex" xmlns:cx1="http://schemas.microsoft.com/office/drawing/2015/9/8/chartex" xmlns:cx2="http://schemas.microsoft.com/office/drawing/2015/10/21/chartex" xmlns:cx3="http://schemas.microsoft.com/office/drawing/2016/5/9/chartex" xmlns:cx4="http://schemas.microsoft.com/office/drawing/2016/5/10/chartex" xmlns:cx5="http://schemas.microsoft.com/office/drawing/2016/5/11/chartex" xmlns:cx6="http://schemas.microsoft.com/office/drawing/2016/5/12/chartex" xmlns:cx7="http://schemas.microsoft.com/office/drawing/2016/5/13/chartex" xmlns:cx8="http://schemas.microsoft.com/office/drawing/2016/5/14/chartex" xmlns:mc="http://schemas.openxmlformats.org/markup-compatibility/2006" xmlns:aink="http://schemas.microsoft.com/office/drawing/2016/ink" xmlns:am3d="http://schemas.microsoft.com/office/drawing/2017/model3d" xmlns:o="urn:schemas-microsoft-com:office:office" xmlns:oel="http://schemas.microsoft.com/office/2019/extlst" xmlns:r="http://schemas.openxmlformats.org/officeDocument/2006/relationships" xmlns:m="http://schemas.openxmlformats.org/officeDocument/2006/math" xmlns:v="urn:schemas-microsoft-com:vml" xmlns:wp14="http://schemas.microsoft.com/office/word/2010/wordprocessingDrawing" xmlns:wp="http://schemas.openxmlformats.org/drawingml/2006/wordprocessingDrawing" xmlns:w10="urn:schemas-microsoft-com:office:word" xmlns:w="http://schemas.openxmlformats.org/wordprocessingml/2006/main" xmlns:w14="http://schemas.microsoft.com/office/word/2010/wordml" xmlns:w15="http://schemas.microsoft.com/office/word/2012/wordml" xmlns:w16cex="http://schemas.microsoft.com/office/word/2018/wordml/cex" xmlns:w16cid="http://schemas.microsoft.com/office/word/2016/wordml/cid" xmlns:w16="http://schemas.microsoft.com/office/word/2018/wordml" xmlns:w16sdtdh="http://schemas.microsoft.com/office/word/2020/wordml/sdtdatahash" xmlns:w16se="http://schemas.microsoft.com/office/word/2015/wordml/symex" xmlns:wpg="http://schemas.microsoft.com/office/word/2010/wordprocessingGroup" xmlns:wpi="http://schemas.microsoft.com/office/word/2010/wordprocessingInk" xmlns:wne="http://schemas.microsoft.com/office/word/2006/wordml" xmlns:wps="http://schemas.microsoft.com/office/word/2010/wordprocessingShape" mc:Ignorable="w14 w15 w16se w16cid w16 w16cex w16sdtdh wp14">
+<w:document xmlns:wpc="http://schemas.microsoft.com/office/word/2010/wordprocessingCanvas" xmlns:cx="http://schemas.microsoft.com/office/drawing/2014/chartex" xmlns:cx1="http://schemas.microsoft.com/office/drawing/2015/9/8/chartex" xmlns:cx2="http://schemas.microsoft.com/office/drawing/2015/10/21/chartex" xmlns:cx3="http://schemas.microsoft.com/office/drawing/2016/5/9/chartex" xmlns:cx4="http://schemas.microsoft.com/office/drawing/2016/5/10/chartex" xmlns:cx5="http://schemas.microsoft.com/office/drawing/2016/5/11/chartex" xmlns:cx6="http://schemas.microsoft.com/office/drawing/2016/5/12/chartex" xmlns:cx7="http://schemas.microsoft.com/office/drawing/2016/5/13/chartex" xmlns:cx8="http://schemas.microsoft.com/office/drawing/2016/5/14/chartex" xmlns:mc="http://schemas.openxmlformats.org/markup-compatibility/2006" xmlns:aink="http://schemas.microsoft.com/office/drawing/2016/ink" xmlns:am3d="http://schemas.microsoft.com/office/drawing/2017/model3d" xmlns:o="urn:schemas-microsoft-com:office:office" xmlns:oel="http://schemas.microsoft.com/office/2019/extlst" xmlns:r="http://schemas.openxmlformats.org/officeDocument/2006/relationships" xmlns:m="http://schemas.openxmlformats.org/officeDocument/2006/math" xmlns:v="urn:schemas-microsoft-com:vml" xmlns:wp14="http://schemas.microsoft.com/office/word/2010/wordprocessingDrawing" xmlns:wp="http://schemas.openxmlformats.org/drawingml/2006/wordprocessingDrawing" xmlns:w10="urn:schemas-microsoft-com:office:word" xmlns:w="http://schemas.openxmlformats.org/wordprocessingml/2006/main" xmlns:w14="http://schemas.microsoft.com/office/word/2010/wordml" xmlns:w15="http://schemas.microsoft.com/office/word/2012/wordml" xmlns:w16cex="http://schemas.microsoft.com/office/word/2018/wordml/cex" xmlns:w16cid="http://schemas.microsoft.com/office/word/2016/wordml/cid" xmlns:w16="http://schemas.microsoft.com/office/word/2018/wordml" xmlns:w16du="http://schemas.microsoft.com/office/word/2023/wordml/word16du" xmlns:w16sdtdh="http://schemas.microsoft.com/office/word/2020/wordml/sdtdatahash" xmlns:w16sdtfl="http://schemas.microsoft.com/office/word/2024/wordml/sdtformatlock" xmlns:w16se="http://schemas.microsoft.com/office/word/2015/wordml/symex" xmlns:wpg="http://schemas.microsoft.com/office/word/2010/wordprocessingGroup" xmlns:wpi="http://schemas.microsoft.com/office/word/2010/wordprocessingInk" xmlns:wne="http://schemas.microsoft.com/office/word/2006/wordml" xmlns:wps="http://schemas.microsoft.com/office/word/2010/wordprocessingShape" mc:Ignorable="w14 w15 w16se w16cid w16 w16cex w16sdtdh w16sdtfl w16du wp14">
   <w:body>
     <w:p>
       <w:pPr>
@@ -592,7 +592,7 @@
                 <w:noProof/>
                 <w:webHidden/>
               </w:rPr>
-              <w:t>6</w:t>
+              <w:t>7</w:t>
             </w:r>
             <w:r>
               <w:rPr>
@@ -730,7 +730,7 @@
                 <w:noProof/>
                 <w:webHidden/>
               </w:rPr>
-              <w:t>7</w:t>
+              <w:t>8</w:t>
             </w:r>
             <w:r>
               <w:rPr>
@@ -1213,7 +1213,7 @@
                 <w:noProof/>
                 <w:webHidden/>
               </w:rPr>
-              <w:t>10</w:t>
+              <w:t>11</w:t>
             </w:r>
             <w:r>
               <w:rPr>
@@ -1282,7 +1282,7 @@
                 <w:noProof/>
                 <w:webHidden/>
               </w:rPr>
-              <w:t>10</w:t>
+              <w:t>11</w:t>
             </w:r>
             <w:r>
               <w:rPr>
@@ -1701,7 +1701,7 @@
                 <w:noProof/>
                 <w:webHidden/>
               </w:rPr>
-              <w:t>13</w:t>
+              <w:t>14</w:t>
             </w:r>
             <w:r>
               <w:rPr>
@@ -3108,7 +3108,7 @@
                 <w:noProof/>
                 <w:webHidden/>
               </w:rPr>
-              <w:t>30</w:t>
+              <w:t>31</w:t>
             </w:r>
             <w:r>
               <w:rPr>
@@ -3178,7 +3178,7 @@
                 <w:noProof/>
                 <w:webHidden/>
               </w:rPr>
-              <w:t>32</w:t>
+              <w:t>33</w:t>
             </w:r>
             <w:r>
               <w:rPr>
@@ -3596,7 +3596,7 @@
                 <w:noProof/>
                 <w:webHidden/>
               </w:rPr>
-              <w:t>34</w:t>
+              <w:t>35</w:t>
             </w:r>
             <w:r>
               <w:rPr>
@@ -3803,7 +3803,7 @@
                 <w:noProof/>
                 <w:webHidden/>
               </w:rPr>
-              <w:t>37</w:t>
+              <w:t>38</w:t>
             </w:r>
             <w:r>
               <w:rPr>
@@ -4013,7 +4013,7 @@
                 <w:noProof/>
                 <w:webHidden/>
               </w:rPr>
-              <w:t>39</w:t>
+              <w:t>40</w:t>
             </w:r>
             <w:r>
               <w:rPr>
@@ -4082,7 +4082,7 @@
                 <w:noProof/>
                 <w:webHidden/>
               </w:rPr>
-              <w:t>40</w:t>
+              <w:t>41</w:t>
             </w:r>
             <w:r>
               <w:rPr>
@@ -4151,7 +4151,7 @@
                 <w:noProof/>
                 <w:webHidden/>
               </w:rPr>
-              <w:t>40</w:t>
+              <w:t>41</w:t>
             </w:r>
             <w:r>
               <w:rPr>
@@ -4220,7 +4220,7 @@
                 <w:noProof/>
                 <w:webHidden/>
               </w:rPr>
-              <w:t>40</w:t>
+              <w:t>41</w:t>
             </w:r>
             <w:r>
               <w:rPr>
@@ -4289,7 +4289,7 @@
                 <w:noProof/>
                 <w:webHidden/>
               </w:rPr>
-              <w:t>40</w:t>
+              <w:t>41</w:t>
             </w:r>
             <w:r>
               <w:rPr>
@@ -4359,7 +4359,7 @@
                 <w:noProof/>
                 <w:webHidden/>
               </w:rPr>
-              <w:t>40</w:t>
+              <w:t>41</w:t>
             </w:r>
             <w:r>
               <w:rPr>
@@ -4497,7 +4497,7 @@
                 <w:noProof/>
                 <w:webHidden/>
               </w:rPr>
-              <w:t>41</w:t>
+              <w:t>42</w:t>
             </w:r>
             <w:r>
               <w:rPr>
@@ -4566,7 +4566,7 @@
                 <w:noProof/>
                 <w:webHidden/>
               </w:rPr>
-              <w:t>41</w:t>
+              <w:t>42</w:t>
             </w:r>
             <w:r>
               <w:rPr>
@@ -4636,7 +4636,7 @@
                 <w:noProof/>
                 <w:webHidden/>
               </w:rPr>
-              <w:t>41</w:t>
+              <w:t>42</w:t>
             </w:r>
             <w:r>
               <w:rPr>
@@ -4775,7 +4775,7 @@
                 <w:noProof/>
                 <w:webHidden/>
               </w:rPr>
-              <w:t>42</w:t>
+              <w:t>43</w:t>
             </w:r>
             <w:r>
               <w:rPr>
@@ -4845,7 +4845,7 @@
                 <w:noProof/>
                 <w:webHidden/>
               </w:rPr>
-              <w:t>43</w:t>
+              <w:t>44</w:t>
             </w:r>
             <w:r>
               <w:rPr>
@@ -4915,7 +4915,7 @@
                 <w:noProof/>
                 <w:webHidden/>
               </w:rPr>
-              <w:t>43</w:t>
+              <w:t>44</w:t>
             </w:r>
             <w:r>
               <w:rPr>
@@ -5047,7 +5047,19 @@
         <w:rPr>
           <w:b/>
         </w:rPr>
-        <w:t>11.4.x</w:t>
+        <w:t>11.</w:t>
+      </w:r>
+      <w:r>
+        <w:rPr>
+          <w:b/>
+        </w:rPr>
+        <w:t>5</w:t>
+      </w:r>
+      <w:r>
+        <w:rPr>
+          <w:b/>
+        </w:rPr>
+        <w:t>.x</w:t>
       </w:r>
       <w:r>
         <w:t>.</w:t>
@@ -5068,7 +5080,13 @@
         <w:t xml:space="preserve"> (hence the name)</w:t>
       </w:r>
       <w:r>
-        <w:t>; the 11.4 series is for Java 11 and later.</w:t>
+        <w:t>; the 11.</w:t>
+      </w:r>
+      <w:r>
+        <w:t>5</w:t>
+      </w:r>
+      <w:r>
+        <w:t xml:space="preserve"> series is for Java 11 and later.</w:t>
       </w:r>
       <w:r>
         <w:t xml:space="preserve"> </w:t>
@@ -5083,26 +5101,60 @@
           <w:b/>
           <w:bCs/>
         </w:rPr>
-        <w:t>11.4 series</w:t>
-      </w:r>
-      <w:r>
-        <w:t xml:space="preserve"> is that it </w:t>
+        <w:t>11.</w:t>
       </w:r>
       <w:r>
         <w:rPr>
           <w:b/>
           <w:bCs/>
         </w:rPr>
-        <w:t>uses Jakarta XML Binding API 3.0</w:t>
-      </w:r>
-      <w:r>
-        <w:t xml:space="preserve">, as opposed to JAXB 2.x used in earlier versions (which import javax.xml.bind.*). Since this release uses </w:t>
+        <w:t>5</w:t>
       </w:r>
       <w:r>
         <w:rPr>
           <w:b/>
           <w:bCs/>
         </w:rPr>
+        <w:t xml:space="preserve"> series</w:t>
+      </w:r>
+      <w:r>
+        <w:t xml:space="preserve"> is that it </w:t>
+      </w:r>
+      <w:r>
+        <w:rPr>
+          <w:b/>
+          <w:bCs/>
+        </w:rPr>
+        <w:t xml:space="preserve">uses Jakarta XML Binding API </w:t>
+      </w:r>
+      <w:r>
+        <w:rPr>
+          <w:b/>
+          <w:bCs/>
+        </w:rPr>
+        <w:t>4</w:t>
+      </w:r>
+      <w:r>
+        <w:rPr>
+          <w:b/>
+          <w:bCs/>
+        </w:rPr>
+        <w:t>.0</w:t>
+      </w:r>
+      <w:r>
+        <w:t xml:space="preserve">, as opposed to JAXB 2.x used in </w:t>
+      </w:r>
+      <w:r>
+        <w:t>docx4j 8.x</w:t>
+      </w:r>
+      <w:r>
+        <w:t xml:space="preserve"> (which import javax.xml.bind.*). Since this release uses </w:t>
+      </w:r>
+      <w:r>
+        <w:rPr>
+          <w:b/>
+          <w:bCs/>
+        </w:rPr>
         <w:t>jakarta.xml.bind</w:t>
       </w:r>
       <w:r>
@@ -5114,7 +5166,13 @@
     </w:p>
     <w:p>
       <w:r>
-        <w:t>We recommend you adopt the 11.4 series:</w:t>
+        <w:t>We recommend you adopt the 11.</w:t>
+      </w:r>
+      <w:r>
+        <w:t>5</w:t>
+      </w:r>
+      <w:r>
+        <w:t xml:space="preserve"> series:</w:t>
       </w:r>
     </w:p>
     <w:p>
@@ -5166,6 +5224,54 @@
       </w:pPr>
       <w:r>
         <w:t>Java 17 (released Sept 2021),</w:t>
+      </w:r>
+    </w:p>
+    <w:p>
+      <w:pPr>
+        <w:pStyle w:val="ListParagraph"/>
+        <w:numPr>
+          <w:ilvl w:val="1"/>
+          <w:numId w:val="34"/>
+        </w:numPr>
+      </w:pPr>
+      <w:r>
+        <w:t xml:space="preserve">Java </w:t>
+      </w:r>
+      <w:r>
+        <w:t>21</w:t>
+      </w:r>
+      <w:r>
+        <w:t xml:space="preserve"> (released Sept 202</w:t>
+      </w:r>
+      <w:r>
+        <w:t>3</w:t>
+      </w:r>
+      <w:r>
+        <w:t>),</w:t>
+      </w:r>
+    </w:p>
+    <w:p>
+      <w:pPr>
+        <w:pStyle w:val="ListParagraph"/>
+        <w:numPr>
+          <w:ilvl w:val="1"/>
+          <w:numId w:val="34"/>
+        </w:numPr>
+      </w:pPr>
+      <w:r>
+        <w:t xml:space="preserve">Java </w:t>
+      </w:r>
+      <w:r>
+        <w:t>25</w:t>
+      </w:r>
+      <w:r>
+        <w:t xml:space="preserve"> (released Sept 202</w:t>
+      </w:r>
+      <w:r>
+        <w:t>5</w:t>
+      </w:r>
+      <w:r>
+        <w:t>),</w:t>
       </w:r>
       <w:r>
         <w:br/>
@@ -6128,7 +6234,13 @@
     </w:p>
     <w:p>
       <w:r>
-        <w:t>Docx4j supports each of the 3 JAXB implementations:</w:t>
+        <w:t xml:space="preserve">Docx4j supports </w:t>
+      </w:r>
+      <w:r>
+        <w:t>2 major</w:t>
+      </w:r>
+      <w:r>
+        <w:t xml:space="preserve"> JAXB implementations:</w:t>
       </w:r>
     </w:p>
     <w:p>
@@ -6140,22 +6252,21 @@
         </w:numPr>
       </w:pPr>
       <w:r>
-        <w:t xml:space="preserve">the JAXB in Java 8 implementation; to use this, you need the </w:t>
-      </w:r>
-      <w:r>
-        <w:t>docx4j-JAXB-Internal</w:t>
-      </w:r>
-      <w:r>
-        <w:t xml:space="preserve"> jar. You can also use this with Java 9.  But not Java 11, since </w:t>
-      </w:r>
-      <w:r>
-        <w:t>Java 11 does not ship JAXB anymore.</w:t>
-      </w:r>
-      <w:r>
-        <w:t xml:space="preserve"> </w:t>
-      </w:r>
-      <w:r>
-        <w:br/>
+        <w:t>the Sun/Oracle/"Reference" implementation</w:t>
+      </w:r>
+      <w:r>
+        <w:t xml:space="preserve">; to use this you need </w:t>
+      </w:r>
+      <w:r>
+        <w:t>docx4j-JAXB-ReferenceImpl</w:t>
+      </w:r>
+    </w:p>
+    <w:p>
+      <w:pPr>
+        <w:ind w:left="720"/>
+      </w:pPr>
+      <w:r>
+        <w:t>You can also use the JAXB reference implementation (eg v2.2.4).  If you want to use that in preference to the version included in the JDK, do so using the endorsed directory mechanism.</w:t>
       </w:r>
     </w:p>
     <w:p>
@@ -6167,21 +6278,21 @@
         </w:numPr>
       </w:pPr>
       <w:r>
-        <w:t>the Sun/Oracle/"Reference" implementation</w:t>
-      </w:r>
-      <w:r>
-        <w:t xml:space="preserve">; to use this you need </w:t>
-      </w:r>
-      <w:r>
-        <w:t>docx4j-JAXB-ReferenceImpl</w:t>
-      </w:r>
-    </w:p>
-    <w:p>
-      <w:pPr>
-        <w:ind w:left="720"/>
-      </w:pPr>
-      <w:r>
-        <w:t>You can also use the JAXB reference implementation (eg v2.2.4).  If you want to use that in preference to the version included in the JDK, do so using the endorsed directory mechanism.</w:t>
+        <w:t>Moxy</w:t>
+      </w:r>
+      <w:r>
+        <w:t xml:space="preserve">.  To use this, you need </w:t>
+      </w:r>
+      <w:r>
+        <w:t>docx4j-JAXB-MOXy</w:t>
+      </w:r>
+      <w:r>
+        <w:t>.</w:t>
+      </w:r>
+    </w:p>
+    <w:p>
+      <w:r>
+        <w:t>There is also:</w:t>
       </w:r>
     </w:p>
     <w:p>
@@ -6193,16 +6304,13 @@
         </w:numPr>
       </w:pPr>
       <w:r>
-        <w:t>Moxy</w:t>
-      </w:r>
-      <w:r>
-        <w:t xml:space="preserve">.  To use this, you need </w:t>
-      </w:r>
-      <w:r>
-        <w:t>docx4j-JAXB-MOXy</w:t>
-      </w:r>
-      <w:r>
-        <w:t>.</w:t>
+        <w:t xml:space="preserve">the JAXB in Java 8 implementation; to use this, you need the </w:t>
+      </w:r>
+      <w:r>
+        <w:t>docx4j-JAXB-Internal</w:t>
+      </w:r>
+      <w:r>
+        <w:t xml:space="preserve"> jar. You can also use this with Java 9.  But not Java 11, since Java 11 does not ship JAXB anymore. </w:t>
       </w:r>
       <w:r>
         <w:br/>
@@ -6229,10 +6337,10 @@
           <w:b/>
           <w:bCs/>
         </w:rPr>
-        <w:t>docx4j v11.4.x uses Jakarta XML Binding API 3.0</w:t>
-      </w:r>
-      <w:r>
-        <w:t>, as opposed to JAXB 2.x used in earlier versions (which import javax.xml.bind.*). Since this release uses jakarta.xml.bind, rather than javax.xml.bind, if you have existing code which imports javax.xml.bind, you'll need to search/replace across your code base, replacing javax.xml.bind with jakarta.xml.bind. You'll also need to replace your JAXB jars (which Maven will do for you automatically; otherwise get them from the relevant zip file).</w:t>
+        <w:t>docx4j v11.5 uses Jakarta XML Binding API 4.0</w:t>
+      </w:r>
+      <w:r>
+        <w:t xml:space="preserve"> (and v11.4 uses Jakarta XML Binding API 3.0), as opposed to JAXB 2.x used in earlier versions (which import javax.xml.bind.*). Since v11.4 and v11.5 uses jakarta.xml.bind, rather than javax.xml.bind, if you have existing code which imports javax.xml.bind, you'll need to search/replace across your code base, replacing javax.xml.bind with jakarta.xml.bind. You'll also need to replace your JAXB jars (which Maven will do for you automatically; otherwise get them from the relevant zip file).</w:t>
       </w:r>
     </w:p>
     <w:p>
@@ -6273,12 +6381,30 @@
         <w:rPr>
           <w:b/>
         </w:rPr>
-        <w:t>11.4.x.</w:t>
-      </w:r>
-    </w:p>
-    <w:p>
-      <w:r>
-        <w:t>We recommend you adopt the 11.4 series if possible:</w:t>
+        <w:t>11.</w:t>
+      </w:r>
+      <w:r>
+        <w:rPr>
+          <w:b/>
+        </w:rPr>
+        <w:t>5</w:t>
+      </w:r>
+      <w:r>
+        <w:rPr>
+          <w:b/>
+        </w:rPr>
+        <w:t>.x.</w:t>
+      </w:r>
+    </w:p>
+    <w:p>
+      <w:r>
+        <w:t>We recommend you adopt the 11.</w:t>
+      </w:r>
+      <w:r>
+        <w:t>5</w:t>
+      </w:r>
+      <w:r>
+        <w:t xml:space="preserve"> series if possible:</w:t>
       </w:r>
     </w:p>
     <w:p>
@@ -6328,6 +6454,30 @@
       <w:r>
         <w:t>Java 17 (released Sept 2021),</w:t>
       </w:r>
+    </w:p>
+    <w:p>
+      <w:pPr>
+        <w:pStyle w:val="ListParagraph"/>
+        <w:numPr>
+          <w:ilvl w:val="1"/>
+          <w:numId w:val="34"/>
+        </w:numPr>
+      </w:pPr>
+      <w:r>
+        <w:t>Java 21 (released Sept 2023),</w:t>
+      </w:r>
+    </w:p>
+    <w:p>
+      <w:pPr>
+        <w:pStyle w:val="ListParagraph"/>
+        <w:numPr>
+          <w:ilvl w:val="1"/>
+          <w:numId w:val="34"/>
+        </w:numPr>
+      </w:pPr>
+      <w:r>
+        <w:t>Java 25 (released Sept 2025),</w:t>
+      </w:r>
       <w:r>
         <w:br/>
         <w:t>(as well as the non LTS versions after Java 11)</w:t>
@@ -6338,7 +6488,19 @@
         <w:rPr>
           <w:lang w:val="en-US"/>
         </w:rPr>
-        <w:t xml:space="preserve">To use docx4j 11.4.9, ensure any code references </w:t>
+        <w:t>To use docx4j 11.</w:t>
+      </w:r>
+      <w:r>
+        <w:rPr>
+          <w:lang w:val="en-US"/>
+        </w:rPr>
+        <w:t>5.7</w:t>
+      </w:r>
+      <w:r>
+        <w:rPr>
+          <w:lang w:val="en-US"/>
+        </w:rPr>
+        <w:t xml:space="preserve">, ensure any code references </w:t>
       </w:r>
       <w:r>
         <w:rPr>
@@ -6602,7 +6764,16 @@
           <w:szCs w:val="16"/>
           <w:lang w:val="en-US"/>
         </w:rPr>
-        <w:t>11.4.9</w:t>
+        <w:t>11.</w:t>
+      </w:r>
+      <w:r>
+        <w:rPr>
+          <w:rFonts w:ascii="Consolas" w:hAnsi="Consolas"/>
+          <w:sz w:val="16"/>
+          <w:szCs w:val="16"/>
+          <w:lang w:val="en-US"/>
+        </w:rPr>
+        <w:t>5.7</w:t>
       </w:r>
       <w:r>
         <w:rPr>
@@ -6886,7 +7057,7 @@
           <w:szCs w:val="16"/>
           <w:lang w:val="en-US"/>
         </w:rPr>
-        <w:t>11.4.9</w:t>
+        <w:t>11.5.7</w:t>
       </w:r>
       <w:r>
         <w:rPr>
@@ -6946,7 +7117,13 @@
         <w:rPr>
           <w:lang w:val="en-US"/>
         </w:rPr>
-        <w:t>8.3.8</w:t>
+        <w:t>8.3.</w:t>
+      </w:r>
+      <w:r>
+        <w:rPr>
+          <w:lang w:val="en-US"/>
+        </w:rPr>
+        <w:t>15</w:t>
       </w:r>
       <w:r>
         <w:rPr>
@@ -7179,7 +7356,16 @@
           <w:szCs w:val="16"/>
           <w:lang w:val="en-US"/>
         </w:rPr>
-        <w:t>8.3.8</w:t>
+        <w:t>8.3.</w:t>
+      </w:r>
+      <w:r>
+        <w:rPr>
+          <w:rFonts w:ascii="Consolas" w:hAnsi="Consolas"/>
+          <w:sz w:val="16"/>
+          <w:szCs w:val="16"/>
+          <w:lang w:val="en-US"/>
+        </w:rPr>
+        <w:t>15</w:t>
       </w:r>
       <w:r>
         <w:rPr>
@@ -7463,7 +7649,7 @@
           <w:szCs w:val="16"/>
           <w:lang w:val="en-US"/>
         </w:rPr>
-        <w:t>8.3.8</w:t>
+        <w:t>8.3.15</w:t>
       </w:r>
       <w:r>
         <w:rPr>
@@ -7747,7 +7933,7 @@
           <w:szCs w:val="16"/>
           <w:lang w:val="en-US"/>
         </w:rPr>
-        <w:t>8.3.8</w:t>
+        <w:t>8.3.15</w:t>
       </w:r>
       <w:r>
         <w:rPr>
@@ -8348,16 +8534,7 @@
           <w:sz w:val="19"/>
           <w:szCs w:val="19"/>
         </w:rPr>
-        <w:t xml:space="preserve"> </w:t>
-      </w:r>
-      <w:r>
-        <w:rPr>
-          <w:rFonts w:ascii="Consolas" w:eastAsia="Times New Roman" w:hAnsi="Consolas" w:cs="Times New Roman"/>
-          <w:color w:val="000000"/>
-          <w:sz w:val="19"/>
-          <w:szCs w:val="19"/>
-        </w:rPr>
-        <w:t>ch.qos.logback</w:t>
+        <w:t xml:space="preserve"> ch.qos.logback</w:t>
       </w:r>
       <w:r>
         <w:rPr>
@@ -8366,16 +8543,7 @@
           <w:sz w:val="19"/>
           <w:szCs w:val="19"/>
         </w:rPr>
-        <w:t xml:space="preserve"> </w:t>
-      </w:r>
-      <w:r>
-        <w:rPr>
-          <w:rFonts w:ascii="Consolas" w:hAnsi="Consolas" w:cs="Consolas"/>
-          <w:color w:val="0000FF"/>
-          <w:sz w:val="19"/>
-          <w:szCs w:val="19"/>
-        </w:rPr>
-        <w:t>&lt;/</w:t>
+        <w:t xml:space="preserve"> &lt;/</w:t>
       </w:r>
       <w:r>
         <w:rPr>
@@ -8442,16 +8610,7 @@
           <w:sz w:val="19"/>
           <w:szCs w:val="19"/>
         </w:rPr>
-        <w:t xml:space="preserve"> </w:t>
-      </w:r>
-      <w:r>
-        <w:rPr>
-          <w:rFonts w:ascii="Consolas" w:eastAsia="Times New Roman" w:hAnsi="Consolas" w:cs="Times New Roman"/>
-          <w:color w:val="000000"/>
-          <w:sz w:val="19"/>
-          <w:szCs w:val="19"/>
-        </w:rPr>
-        <w:t>logback-classic</w:t>
+        <w:t xml:space="preserve"> logback-classic</w:t>
       </w:r>
       <w:r>
         <w:rPr>
@@ -8460,16 +8619,7 @@
           <w:sz w:val="19"/>
           <w:szCs w:val="19"/>
         </w:rPr>
-        <w:t xml:space="preserve"> </w:t>
-      </w:r>
-      <w:r>
-        <w:rPr>
-          <w:rFonts w:ascii="Consolas" w:hAnsi="Consolas" w:cs="Consolas"/>
-          <w:color w:val="0000FF"/>
-          <w:sz w:val="19"/>
-          <w:szCs w:val="19"/>
-        </w:rPr>
-        <w:t>&lt;/</w:t>
+        <w:t xml:space="preserve"> &lt;/</w:t>
       </w:r>
       <w:r>
         <w:rPr>
@@ -8682,37 +8832,7 @@
           <w:szCs w:val="18"/>
           <w:shd w:val="clear" w:color="auto" w:fill="FFFFFF"/>
         </w:rPr>
-        <w:t>logback-classic</w:t>
-      </w:r>
-      <w:r>
-        <w:rPr>
-          <w:rFonts w:ascii="Consolas" w:hAnsi="Consolas"/>
-          <w:color w:val="24292F"/>
-          <w:sz w:val="18"/>
-          <w:szCs w:val="18"/>
-          <w:shd w:val="clear" w:color="auto" w:fill="FFFFFF"/>
-        </w:rPr>
-        <w:t xml:space="preserve"> </w:t>
-      </w:r>
-      <w:r>
-        <w:rPr>
-          <w:rFonts w:ascii="Consolas" w:hAnsi="Consolas"/>
-          <w:color w:val="24292F"/>
-          <w:sz w:val="18"/>
-          <w:szCs w:val="18"/>
-          <w:shd w:val="clear" w:color="auto" w:fill="FFFFFF"/>
-        </w:rPr>
-        <w:t>1.2.10</w:t>
-      </w:r>
-      <w:r>
-        <w:rPr>
-          <w:rFonts w:ascii="Consolas" w:hAnsi="Consolas"/>
-          <w:color w:val="24292F"/>
-          <w:sz w:val="18"/>
-          <w:szCs w:val="18"/>
-          <w:shd w:val="clear" w:color="auto" w:fill="FFFFFF"/>
-        </w:rPr>
-        <w:t>.</w:t>
+        <w:t>logback-classic 1.2.10.</w:t>
       </w:r>
     </w:p>
     <w:p>
@@ -8724,7 +8844,7 @@
           <w:rPr>
             <w:rStyle w:val="Hyperlink"/>
           </w:rPr>
-          <w:t>https://github.com/plutext/docx4j/blob/VERSION_11_4_8/docx4j-samples-resources/src/main/resources/logback.xml</w:t>
+          <w:t>https://github.com/plutext/docx4j/blob/VERSION_11_5_7/docx4j-samples-resources/src/main/resources/logback.xml</w:t>
         </w:r>
       </w:hyperlink>
       <w:r>
@@ -25751,12 +25871,247 @@
         </w:r>
       </w:hyperlink>
     </w:p>
+    <w:p>
+      <w:r>
+        <w:t xml:space="preserve">These jars are in the zip file, in dir optional/export-fo  </w:t>
+      </w:r>
+    </w:p>
+    <w:p>
+      <w:r>
+        <w:rPr>
+          <w:b/>
+          <w:bCs/>
+        </w:rPr>
+        <w:t>Bullet/symbol handling</w:t>
+      </w:r>
+      <w:r>
+        <w:rPr>
+          <w:b/>
+          <w:bCs/>
+        </w:rPr>
+        <w:t xml:space="preserve">.  </w:t>
+      </w:r>
+      <w:r>
+        <w:t>d</w:t>
+      </w:r>
+      <w:r>
+        <w:t>ocx4j</w:t>
+      </w:r>
+      <w:r>
+        <w:t>-export-fo</w:t>
+      </w:r>
+      <w:r>
+        <w:t xml:space="preserve"> 11.5.7 introduced </w:t>
+      </w:r>
+      <w:r>
+        <w:t>better handling of the symbols in the following fonts:</w:t>
+      </w:r>
+    </w:p>
+    <w:p>
+      <w:pPr>
+        <w:pStyle w:val="ListParagraph"/>
+        <w:numPr>
+          <w:ilvl w:val="0"/>
+          <w:numId w:val="35"/>
+        </w:numPr>
+      </w:pPr>
+      <w:r>
+        <w:t>Symbol</w:t>
+      </w:r>
+    </w:p>
+    <w:p>
+      <w:pPr>
+        <w:pStyle w:val="ListParagraph"/>
+        <w:numPr>
+          <w:ilvl w:val="0"/>
+          <w:numId w:val="35"/>
+        </w:numPr>
+      </w:pPr>
+      <w:r>
+        <w:t>Webdings</w:t>
+      </w:r>
+    </w:p>
+    <w:p>
+      <w:pPr>
+        <w:pStyle w:val="ListParagraph"/>
+        <w:numPr>
+          <w:ilvl w:val="0"/>
+          <w:numId w:val="35"/>
+        </w:numPr>
+      </w:pPr>
+      <w:r>
+        <w:t xml:space="preserve">Wingdings, </w:t>
+      </w:r>
+      <w:r>
+        <w:t>Wingdings</w:t>
+      </w:r>
+      <w:r>
+        <w:t xml:space="preserve"> 2</w:t>
+      </w:r>
+      <w:r>
+        <w:t>, Wingdings</w:t>
+      </w:r>
+      <w:r>
+        <w:t xml:space="preserve"> 3</w:t>
+      </w:r>
+    </w:p>
+    <w:p>
+      <w:r>
+        <w:t>by mapping them to glyphs present in certain substitute fonts.</w:t>
+      </w:r>
+    </w:p>
+    <w:p>
+      <w:r>
+        <w:t>For this to work, you need to ensure your system has the following fonts installed</w:t>
+      </w:r>
+      <w:r>
+        <w:t xml:space="preserve"> at the OS level</w:t>
+      </w:r>
+      <w:r>
+        <w:t>:</w:t>
+      </w:r>
+    </w:p>
+    <w:tbl>
+      <w:tblPr>
+        <w:tblStyle w:val="TableGrid"/>
+        <w:tblW w:w="0" w:type="auto"/>
+        <w:tblLook w:val="04A0" w:firstRow="1" w:lastRow="0" w:firstColumn="1" w:lastColumn="0" w:noHBand="0" w:noVBand="1"/>
+      </w:tblPr>
+      <w:tblGrid>
+        <w:gridCol w:w="3081"/>
+        <w:gridCol w:w="3081"/>
+        <w:gridCol w:w="3081"/>
+      </w:tblGrid>
+      <w:tr>
+        <w:tc>
+          <w:tcPr>
+            <w:tcW w:w="3081" w:type="dxa"/>
+            <w:shd w:val="clear" w:color="auto" w:fill="EEECE1" w:themeFill="background2"/>
+          </w:tcPr>
+          <w:p>
+            <w:r>
+              <w:t>Document Font</w:t>
+            </w:r>
+          </w:p>
+        </w:tc>
+        <w:tc>
+          <w:tcPr>
+            <w:tcW w:w="3081" w:type="dxa"/>
+            <w:shd w:val="clear" w:color="auto" w:fill="EEECE1" w:themeFill="background2"/>
+          </w:tcPr>
+          <w:p>
+            <w:r>
+              <w:t>Linux</w:t>
+            </w:r>
+          </w:p>
+        </w:tc>
+        <w:tc>
+          <w:tcPr>
+            <w:tcW w:w="3081" w:type="dxa"/>
+            <w:shd w:val="clear" w:color="auto" w:fill="EEECE1" w:themeFill="background2"/>
+          </w:tcPr>
+          <w:p>
+            <w:r>
+              <w:t>Windows</w:t>
+            </w:r>
+          </w:p>
+        </w:tc>
+      </w:tr>
+      <w:tr>
+        <w:tc>
+          <w:tcPr>
+            <w:tcW w:w="3081" w:type="dxa"/>
+          </w:tcPr>
+          <w:p>
+            <w:pPr>
+              <w:rPr>
+                <w:b/>
+                <w:bCs/>
+              </w:rPr>
+            </w:pPr>
+            <w:r>
+              <w:rPr>
+                <w:b/>
+                <w:bCs/>
+              </w:rPr>
+              <w:t>Webdings, Wingdings 1-3</w:t>
+            </w:r>
+          </w:p>
+        </w:tc>
+        <w:tc>
+          <w:tcPr>
+            <w:tcW w:w="3081" w:type="dxa"/>
+          </w:tcPr>
+          <w:p>
+            <w:r>
+              <w:t>Noto Sans Symbols 2 Regular</w:t>
+            </w:r>
+            <w:r>
+              <w:t>,</w:t>
+            </w:r>
+            <w:r>
+              <w:br/>
+            </w:r>
+            <w:r>
+              <w:t>Noto Sans Symbols Regular</w:t>
+            </w:r>
+          </w:p>
+        </w:tc>
+        <w:tc>
+          <w:tcPr>
+            <w:tcW w:w="3081" w:type="dxa"/>
+          </w:tcPr>
+          <w:p>
+            <w:r>
+              <w:t>Segoe UI Symbol</w:t>
+            </w:r>
+          </w:p>
+        </w:tc>
+      </w:tr>
+      <w:tr>
+        <w:tc>
+          <w:tcPr>
+            <w:tcW w:w="3081" w:type="dxa"/>
+          </w:tcPr>
+          <w:p>
+            <w:pPr>
+              <w:rPr>
+                <w:b/>
+                <w:bCs/>
+              </w:rPr>
+            </w:pPr>
+            <w:r>
+              <w:rPr>
+                <w:b/>
+                <w:bCs/>
+              </w:rPr>
+              <w:t>Symbol</w:t>
+            </w:r>
+          </w:p>
+        </w:tc>
+        <w:tc>
+          <w:tcPr>
+            <w:tcW w:w="3081" w:type="dxa"/>
+          </w:tcPr>
+          <w:p>
+            <w:r>
+              <w:t>DejaVu Serif</w:t>
+            </w:r>
+          </w:p>
+        </w:tc>
+        <w:tc>
+          <w:tcPr>
+            <w:tcW w:w="3081" w:type="dxa"/>
+          </w:tcPr>
+          <w:p>
+            <w:r>
+              <w:t>Segoe UI Symbol</w:t>
+            </w:r>
+          </w:p>
+        </w:tc>
+      </w:tr>
+    </w:tbl>
     <w:p/>
-    <w:p>
-      <w:r>
-        <w:t xml:space="preserve">These jars are in the zip file, in dir optional/export-fo  </w:t>
-      </w:r>
-    </w:p>
     <w:p>
       <w:pPr>
         <w:pStyle w:val="Heading1"/>
@@ -32877,7 +33232,6 @@
         <w:tc>
           <w:tcPr>
             <w:tcW w:w="759" w:type="pct"/>
-            <w:shd w:val="clear" w:color="auto" w:fill="auto"/>
           </w:tcPr>
           <w:p>
             <w:pPr>
@@ -32898,7 +33252,6 @@
         <w:tc>
           <w:tcPr>
             <w:tcW w:w="4241" w:type="pct"/>
-            <w:shd w:val="clear" w:color="auto" w:fill="auto"/>
           </w:tcPr>
           <w:p>
             <w:pPr>
@@ -32919,7 +33272,6 @@
         <w:tc>
           <w:tcPr>
             <w:tcW w:w="759" w:type="pct"/>
-            <w:shd w:val="clear" w:color="auto" w:fill="auto"/>
           </w:tcPr>
           <w:p>
             <w:pPr>
@@ -32945,7 +33297,6 @@
         <w:tc>
           <w:tcPr>
             <w:tcW w:w="4241" w:type="pct"/>
-            <w:shd w:val="clear" w:color="auto" w:fill="auto"/>
           </w:tcPr>
           <w:p>
             <w:pPr>
@@ -32966,7 +33317,6 @@
         <w:tc>
           <w:tcPr>
             <w:tcW w:w="759" w:type="pct"/>
-            <w:shd w:val="clear" w:color="auto" w:fill="auto"/>
           </w:tcPr>
           <w:p>
             <w:pPr>
@@ -32992,7 +33342,6 @@
         <w:tc>
           <w:tcPr>
             <w:tcW w:w="4241" w:type="pct"/>
-            <w:shd w:val="clear" w:color="auto" w:fill="auto"/>
           </w:tcPr>
           <w:p>
             <w:pPr>
@@ -33013,7 +33362,6 @@
         <w:tc>
           <w:tcPr>
             <w:tcW w:w="759" w:type="pct"/>
-            <w:shd w:val="clear" w:color="auto" w:fill="auto"/>
           </w:tcPr>
           <w:p>
             <w:pPr>
@@ -33039,7 +33387,6 @@
         <w:tc>
           <w:tcPr>
             <w:tcW w:w="4241" w:type="pct"/>
-            <w:shd w:val="clear" w:color="auto" w:fill="auto"/>
           </w:tcPr>
           <w:p>
             <w:pPr>
@@ -33060,7 +33407,6 @@
         <w:tc>
           <w:tcPr>
             <w:tcW w:w="759" w:type="pct"/>
-            <w:shd w:val="clear" w:color="auto" w:fill="auto"/>
           </w:tcPr>
           <w:p>
             <w:pPr>
@@ -33081,7 +33427,6 @@
         <w:tc>
           <w:tcPr>
             <w:tcW w:w="4241" w:type="pct"/>
-            <w:shd w:val="clear" w:color="auto" w:fill="auto"/>
           </w:tcPr>
           <w:p>
             <w:pPr>
@@ -33133,7 +33478,6 @@
         <w:tc>
           <w:tcPr>
             <w:tcW w:w="759" w:type="pct"/>
-            <w:shd w:val="clear" w:color="auto" w:fill="auto"/>
           </w:tcPr>
           <w:p>
             <w:pPr>
@@ -33152,7 +33496,6 @@
         <w:tc>
           <w:tcPr>
             <w:tcW w:w="4241" w:type="pct"/>
-            <w:shd w:val="clear" w:color="auto" w:fill="auto"/>
           </w:tcPr>
           <w:p>
             <w:pPr>
@@ -33173,7 +33516,6 @@
         <w:tc>
           <w:tcPr>
             <w:tcW w:w="759" w:type="pct"/>
-            <w:shd w:val="clear" w:color="auto" w:fill="auto"/>
           </w:tcPr>
           <w:p>
             <w:pPr>
@@ -33192,7 +33534,6 @@
         <w:tc>
           <w:tcPr>
             <w:tcW w:w="4241" w:type="pct"/>
-            <w:shd w:val="clear" w:color="auto" w:fill="auto"/>
           </w:tcPr>
           <w:p>
             <w:pPr>
@@ -33213,7 +33554,6 @@
         <w:tc>
           <w:tcPr>
             <w:tcW w:w="759" w:type="pct"/>
-            <w:shd w:val="clear" w:color="auto" w:fill="auto"/>
           </w:tcPr>
           <w:p>
             <w:pPr>
@@ -33232,7 +33572,6 @@
         <w:tc>
           <w:tcPr>
             <w:tcW w:w="4241" w:type="pct"/>
-            <w:shd w:val="clear" w:color="auto" w:fill="auto"/>
           </w:tcPr>
           <w:p>
             <w:pPr>
@@ -33253,7 +33592,6 @@
         <w:tc>
           <w:tcPr>
             <w:tcW w:w="759" w:type="pct"/>
-            <w:shd w:val="clear" w:color="auto" w:fill="auto"/>
           </w:tcPr>
           <w:p>
             <w:pPr>
@@ -33272,7 +33610,6 @@
         <w:tc>
           <w:tcPr>
             <w:tcW w:w="4241" w:type="pct"/>
-            <w:shd w:val="clear" w:color="auto" w:fill="auto"/>
           </w:tcPr>
           <w:p>
             <w:pPr>
@@ -33324,7 +33661,6 @@
         <w:tc>
           <w:tcPr>
             <w:tcW w:w="759" w:type="pct"/>
-            <w:shd w:val="clear" w:color="auto" w:fill="auto"/>
           </w:tcPr>
           <w:p>
             <w:pPr>
@@ -33345,7 +33681,6 @@
         <w:tc>
           <w:tcPr>
             <w:tcW w:w="4241" w:type="pct"/>
-            <w:shd w:val="clear" w:color="auto" w:fill="auto"/>
           </w:tcPr>
           <w:p>
             <w:pPr>
@@ -33383,7 +33718,6 @@
         <w:tc>
           <w:tcPr>
             <w:tcW w:w="759" w:type="pct"/>
-            <w:shd w:val="clear" w:color="auto" w:fill="auto"/>
           </w:tcPr>
           <w:p>
             <w:pPr>
@@ -33404,7 +33738,6 @@
         <w:tc>
           <w:tcPr>
             <w:tcW w:w="4241" w:type="pct"/>
-            <w:shd w:val="clear" w:color="auto" w:fill="auto"/>
           </w:tcPr>
           <w:p>
             <w:pPr>
@@ -33427,7 +33760,6 @@
         <w:tc>
           <w:tcPr>
             <w:tcW w:w="759" w:type="pct"/>
-            <w:shd w:val="clear" w:color="auto" w:fill="auto"/>
           </w:tcPr>
           <w:p>
             <w:pPr>
@@ -33448,7 +33780,6 @@
         <w:tc>
           <w:tcPr>
             <w:tcW w:w="4241" w:type="pct"/>
-            <w:shd w:val="clear" w:color="auto" w:fill="auto"/>
           </w:tcPr>
           <w:p>
             <w:pPr>
@@ -33471,7 +33802,6 @@
         <w:tc>
           <w:tcPr>
             <w:tcW w:w="759" w:type="pct"/>
-            <w:shd w:val="clear" w:color="auto" w:fill="auto"/>
           </w:tcPr>
           <w:p>
             <w:pPr>
@@ -33492,7 +33822,6 @@
         <w:tc>
           <w:tcPr>
             <w:tcW w:w="4241" w:type="pct"/>
-            <w:shd w:val="clear" w:color="auto" w:fill="auto"/>
           </w:tcPr>
           <w:p>
             <w:pPr>
@@ -33515,7 +33844,6 @@
         <w:tc>
           <w:tcPr>
             <w:tcW w:w="759" w:type="pct"/>
-            <w:shd w:val="clear" w:color="auto" w:fill="auto"/>
           </w:tcPr>
           <w:p>
             <w:pPr>
@@ -33536,7 +33864,6 @@
         <w:tc>
           <w:tcPr>
             <w:tcW w:w="4241" w:type="pct"/>
-            <w:shd w:val="clear" w:color="auto" w:fill="auto"/>
           </w:tcPr>
           <w:p>
             <w:pPr>
@@ -33559,7 +33886,6 @@
         <w:tc>
           <w:tcPr>
             <w:tcW w:w="759" w:type="pct"/>
-            <w:shd w:val="clear" w:color="auto" w:fill="auto"/>
           </w:tcPr>
           <w:p>
             <w:pPr>
@@ -33580,7 +33906,6 @@
         <w:tc>
           <w:tcPr>
             <w:tcW w:w="4241" w:type="pct"/>
-            <w:shd w:val="clear" w:color="auto" w:fill="auto"/>
           </w:tcPr>
           <w:p>
             <w:pPr>
@@ -33603,7 +33928,6 @@
         <w:tc>
           <w:tcPr>
             <w:tcW w:w="759" w:type="pct"/>
-            <w:shd w:val="clear" w:color="auto" w:fill="auto"/>
           </w:tcPr>
           <w:p>
             <w:pPr>
@@ -33624,7 +33948,6 @@
         <w:tc>
           <w:tcPr>
             <w:tcW w:w="4241" w:type="pct"/>
-            <w:shd w:val="clear" w:color="auto" w:fill="auto"/>
           </w:tcPr>
           <w:p>
             <w:pPr>
@@ -34261,6 +34584,311 @@
         <w:t>Text substitution</w:t>
       </w:r>
       <w:bookmarkEnd w:id="64"/>
+      <w:r>
+        <w:rPr>
+          <w:rFonts w:eastAsia="Times New Roman"/>
+        </w:rPr>
+        <w:t>/document generation/reporting</w:t>
+      </w:r>
+    </w:p>
+    <w:p>
+      <w:r>
+        <w:t>There are 2 major approaches to text substitution:</w:t>
+      </w:r>
+    </w:p>
+    <w:p>
+      <w:pPr>
+        <w:pStyle w:val="ListParagraph"/>
+        <w:numPr>
+          <w:ilvl w:val="0"/>
+          <w:numId w:val="36"/>
+        </w:numPr>
+      </w:pPr>
+      <w:r>
+        <w:t>Variable replacement on the document surface</w:t>
+      </w:r>
+    </w:p>
+    <w:p>
+      <w:pPr>
+        <w:pStyle w:val="ListParagraph"/>
+        <w:numPr>
+          <w:ilvl w:val="0"/>
+          <w:numId w:val="36"/>
+        </w:numPr>
+      </w:pPr>
+      <w:r>
+        <w:t>Content control data binding</w:t>
+      </w:r>
+    </w:p>
+    <w:p>
+      <w:r>
+        <w:t>This table seeks to convey the major difference between these 2 approaches:</w:t>
+      </w:r>
+    </w:p>
+    <w:tbl>
+      <w:tblPr>
+        <w:tblStyle w:val="TableGrid"/>
+        <w:tblW w:w="0" w:type="auto"/>
+        <w:jc w:val="center"/>
+        <w:tblLook w:val="04A0" w:firstRow="1" w:lastRow="0" w:firstColumn="1" w:lastColumn="0" w:noHBand="0" w:noVBand="1"/>
+      </w:tblPr>
+      <w:tblGrid>
+        <w:gridCol w:w="3081"/>
+        <w:gridCol w:w="3081"/>
+        <w:gridCol w:w="3081"/>
+      </w:tblGrid>
+      <w:tr>
+        <w:trPr>
+          <w:jc w:val="center"/>
+        </w:trPr>
+        <w:tc>
+          <w:tcPr>
+            <w:tcW w:w="3081" w:type="dxa"/>
+            <w:shd w:val="clear" w:color="auto" w:fill="EEECE1" w:themeFill="background2"/>
+          </w:tcPr>
+          <w:p>
+            <w:pPr>
+              <w:jc w:val="right"/>
+              <w:rPr>
+                <w:b/>
+                <w:bCs/>
+                <w:sz w:val="21"/>
+                <w:szCs w:val="21"/>
+              </w:rPr>
+            </w:pPr>
+          </w:p>
+        </w:tc>
+        <w:tc>
+          <w:tcPr>
+            <w:tcW w:w="3081" w:type="dxa"/>
+            <w:shd w:val="clear" w:color="auto" w:fill="EEECE1" w:themeFill="background2"/>
+          </w:tcPr>
+          <w:p>
+            <w:pPr>
+              <w:jc w:val="center"/>
+              <w:rPr>
+                <w:b/>
+                <w:bCs/>
+                <w:sz w:val="21"/>
+                <w:szCs w:val="21"/>
+              </w:rPr>
+            </w:pPr>
+            <w:r>
+              <w:rPr>
+                <w:b/>
+                <w:bCs/>
+                <w:sz w:val="21"/>
+                <w:szCs w:val="21"/>
+              </w:rPr>
+              <w:t>Variable replacement on the document surface</w:t>
+            </w:r>
+          </w:p>
+        </w:tc>
+        <w:tc>
+          <w:tcPr>
+            <w:tcW w:w="3081" w:type="dxa"/>
+            <w:shd w:val="clear" w:color="auto" w:fill="EEECE1" w:themeFill="background2"/>
+          </w:tcPr>
+          <w:p>
+            <w:pPr>
+              <w:jc w:val="center"/>
+              <w:rPr>
+                <w:b/>
+                <w:bCs/>
+                <w:sz w:val="21"/>
+                <w:szCs w:val="21"/>
+              </w:rPr>
+            </w:pPr>
+            <w:r>
+              <w:rPr>
+                <w:b/>
+                <w:bCs/>
+                <w:sz w:val="21"/>
+                <w:szCs w:val="21"/>
+              </w:rPr>
+              <w:t>Content control data binding</w:t>
+            </w:r>
+          </w:p>
+        </w:tc>
+      </w:tr>
+      <w:tr>
+        <w:trPr>
+          <w:jc w:val="center"/>
+        </w:trPr>
+        <w:tc>
+          <w:tcPr>
+            <w:tcW w:w="3081" w:type="dxa"/>
+            <w:shd w:val="clear" w:color="auto" w:fill="EEECE1" w:themeFill="background2"/>
+          </w:tcPr>
+          <w:p>
+            <w:pPr>
+              <w:jc w:val="right"/>
+              <w:rPr>
+                <w:b/>
+                <w:bCs/>
+                <w:sz w:val="21"/>
+                <w:szCs w:val="21"/>
+              </w:rPr>
+            </w:pPr>
+            <w:r>
+              <w:rPr>
+                <w:b/>
+                <w:bCs/>
+                <w:sz w:val="21"/>
+                <w:szCs w:val="21"/>
+              </w:rPr>
+              <w:t xml:space="preserve">Suitability to </w:t>
+            </w:r>
+          </w:p>
+          <w:p>
+            <w:pPr>
+              <w:jc w:val="right"/>
+              <w:rPr>
+                <w:b/>
+                <w:bCs/>
+                <w:sz w:val="21"/>
+                <w:szCs w:val="21"/>
+              </w:rPr>
+            </w:pPr>
+            <w:r>
+              <w:rPr>
+                <w:b/>
+                <w:bCs/>
+                <w:sz w:val="21"/>
+                <w:szCs w:val="21"/>
+              </w:rPr>
+              <w:t>complex documents</w:t>
+            </w:r>
+          </w:p>
+        </w:tc>
+        <w:tc>
+          <w:tcPr>
+            <w:tcW w:w="3081" w:type="dxa"/>
+          </w:tcPr>
+          <w:p>
+            <w:pPr>
+              <w:jc w:val="center"/>
+              <w:rPr>
+                <w:sz w:val="21"/>
+                <w:szCs w:val="21"/>
+              </w:rPr>
+            </w:pPr>
+            <w:r>
+              <w:rPr>
+                <w:sz w:val="21"/>
+                <w:szCs w:val="21"/>
+              </w:rPr>
+              <w:t>Less suited, since the document surface is brittle (especially for nested repeats/conditions)</w:t>
+            </w:r>
+          </w:p>
+        </w:tc>
+        <w:tc>
+          <w:tcPr>
+            <w:tcW w:w="3081" w:type="dxa"/>
+          </w:tcPr>
+          <w:p>
+            <w:pPr>
+              <w:jc w:val="center"/>
+              <w:rPr>
+                <w:sz w:val="21"/>
+                <w:szCs w:val="21"/>
+              </w:rPr>
+            </w:pPr>
+            <w:r>
+              <w:rPr>
+                <w:sz w:val="21"/>
+                <w:szCs w:val="21"/>
+              </w:rPr>
+              <w:t>Well suited</w:t>
+            </w:r>
+          </w:p>
+        </w:tc>
+      </w:tr>
+      <w:tr>
+        <w:trPr>
+          <w:jc w:val="center"/>
+        </w:trPr>
+        <w:tc>
+          <w:tcPr>
+            <w:tcW w:w="3081" w:type="dxa"/>
+            <w:shd w:val="clear" w:color="auto" w:fill="EEECE1" w:themeFill="background2"/>
+          </w:tcPr>
+          <w:p>
+            <w:pPr>
+              <w:jc w:val="right"/>
+              <w:rPr>
+                <w:b/>
+                <w:bCs/>
+                <w:sz w:val="21"/>
+                <w:szCs w:val="21"/>
+              </w:rPr>
+            </w:pPr>
+            <w:r>
+              <w:rPr>
+                <w:b/>
+                <w:bCs/>
+                <w:sz w:val="21"/>
+                <w:szCs w:val="21"/>
+              </w:rPr>
+              <w:t>Template setup requirement</w:t>
+            </w:r>
+          </w:p>
+        </w:tc>
+        <w:tc>
+          <w:tcPr>
+            <w:tcW w:w="3081" w:type="dxa"/>
+          </w:tcPr>
+          <w:p>
+            <w:pPr>
+              <w:jc w:val="center"/>
+              <w:rPr>
+                <w:sz w:val="21"/>
+                <w:szCs w:val="21"/>
+              </w:rPr>
+            </w:pPr>
+            <w:r>
+              <w:rPr>
+                <w:sz w:val="21"/>
+                <w:szCs w:val="21"/>
+              </w:rPr>
+              <w:t>Edit in Microsoft Word or other docx editor</w:t>
+            </w:r>
+          </w:p>
+        </w:tc>
+        <w:tc>
+          <w:tcPr>
+            <w:tcW w:w="3081" w:type="dxa"/>
+          </w:tcPr>
+          <w:p>
+            <w:pPr>
+              <w:jc w:val="center"/>
+              <w:rPr>
+                <w:sz w:val="21"/>
+                <w:szCs w:val="21"/>
+              </w:rPr>
+            </w:pPr>
+            <w:r>
+              <w:rPr>
+                <w:sz w:val="21"/>
+                <w:szCs w:val="21"/>
+              </w:rPr>
+              <w:t>Needs an authoring tool (typically a Word AddIn)</w:t>
+            </w:r>
+          </w:p>
+        </w:tc>
+      </w:tr>
+    </w:tbl>
+    <w:p/>
+    <w:p>
+      <w:pPr>
+        <w:pStyle w:val="Heading2"/>
+      </w:pPr>
+      <w:r>
+        <w:t>Text substitution</w:t>
+      </w:r>
+      <w:r>
+        <w:t xml:space="preserve"> – document surface</w:t>
+      </w:r>
     </w:p>
     <w:p>
       <w:r>
@@ -35127,17 +35755,164 @@
       </w:pPr>
     </w:p>
     <w:p>
-      <w:pPr>
-        <w:pStyle w:val="Heading1"/>
-        <w:rPr>
-          <w:rFonts w:eastAsia="Times New Roman"/>
-        </w:rPr>
+      <w:r>
+        <w:t xml:space="preserve">Beyond this, you can use one of the well-know templating languages.  </w:t>
+      </w:r>
+      <w:r>
+        <w:t>For example, freemarker, velocity, or Spring EL.</w:t>
+      </w:r>
+    </w:p>
+    <w:p>
+      <w:r>
+        <w:t>For Spring EL, docx-stamper or office-stamper (a more recent fork of that) is a popular choice:</w:t>
+      </w:r>
+    </w:p>
+    <w:tbl>
+      <w:tblPr>
+        <w:tblStyle w:val="TableGrid"/>
+        <w:tblW w:w="0" w:type="auto"/>
+        <w:tblLook w:val="04A0" w:firstRow="1" w:lastRow="0" w:firstColumn="1" w:lastColumn="0" w:noHBand="0" w:noVBand="1"/>
+      </w:tblPr>
+      <w:tblGrid>
+        <w:gridCol w:w="2232"/>
+        <w:gridCol w:w="3455"/>
+        <w:gridCol w:w="3556"/>
+      </w:tblGrid>
+      <w:tr>
+        <w:tc>
+          <w:tcPr>
+            <w:tcW w:w="2232" w:type="dxa"/>
+            <w:shd w:val="clear" w:color="auto" w:fill="EEECE1" w:themeFill="background2"/>
+          </w:tcPr>
+          <w:p>
+            <w:r>
+              <w:t>Approach</w:t>
+            </w:r>
+          </w:p>
+        </w:tc>
+        <w:tc>
+          <w:tcPr>
+            <w:tcW w:w="3455" w:type="dxa"/>
+            <w:shd w:val="clear" w:color="auto" w:fill="EEECE1" w:themeFill="background2"/>
+          </w:tcPr>
+          <w:p>
+            <w:r>
+              <w:t xml:space="preserve">Docx </w:t>
+            </w:r>
+          </w:p>
+        </w:tc>
+        <w:tc>
+          <w:tcPr>
+            <w:tcW w:w="3556" w:type="dxa"/>
+            <w:shd w:val="clear" w:color="auto" w:fill="EEECE1" w:themeFill="background2"/>
+          </w:tcPr>
+          <w:p>
+            <w:r>
+              <w:t>also Pptx, Xlsx</w:t>
+            </w:r>
+          </w:p>
+        </w:tc>
+      </w:tr>
+      <w:tr>
+        <w:tc>
+          <w:tcPr>
+            <w:tcW w:w="2232" w:type="dxa"/>
+          </w:tcPr>
+          <w:p>
+            <w:r>
+              <w:t>Spring EL</w:t>
+            </w:r>
+          </w:p>
+        </w:tc>
+        <w:tc>
+          <w:tcPr>
+            <w:tcW w:w="3455" w:type="dxa"/>
+          </w:tcPr>
+          <w:p>
+            <w:r>
+              <w:t>Office-stamper</w:t>
+            </w:r>
+          </w:p>
+          <w:p>
+            <w:pPr>
+              <w:rPr>
+                <w:sz w:val="18"/>
+                <w:szCs w:val="18"/>
+              </w:rPr>
+            </w:pPr>
+            <w:r>
+              <w:rPr>
+                <w:sz w:val="18"/>
+                <w:szCs w:val="18"/>
+              </w:rPr>
+              <w:t>(v 2.9.0 requires Java 25, previously 21)</w:t>
+            </w:r>
+          </w:p>
+          <w:p/>
+          <w:p>
+            <w:r>
+              <w:t xml:space="preserve">Docx-stamper </w:t>
+            </w:r>
+            <w:r>
+              <w:rPr>
+                <w:sz w:val="18"/>
+                <w:szCs w:val="18"/>
+              </w:rPr>
+              <w:t xml:space="preserve">(for eg Java </w:t>
+            </w:r>
+            <w:r>
+              <w:rPr>
+                <w:sz w:val="18"/>
+                <w:szCs w:val="18"/>
+              </w:rPr>
+              <w:t>1</w:t>
+            </w:r>
+            <w:r>
+              <w:rPr>
+                <w:sz w:val="18"/>
+                <w:szCs w:val="18"/>
+              </w:rPr>
+              <w:t>7)</w:t>
+            </w:r>
+          </w:p>
+        </w:tc>
+        <w:tc>
+          <w:tcPr>
+            <w:tcW w:w="3556" w:type="dxa"/>
+          </w:tcPr>
+          <w:p>
+            <w:r>
+              <w:t>Office-stamper</w:t>
+            </w:r>
+          </w:p>
+          <w:p>
+            <w:r>
+              <w:t>(Java 25)</w:t>
+            </w:r>
+          </w:p>
+        </w:tc>
+      </w:tr>
+    </w:tbl>
+    <w:p>
+      <w:pPr>
+        <w:autoSpaceDE w:val="0"/>
+        <w:autoSpaceDN w:val="0"/>
+        <w:adjustRightInd w:val="0"/>
+        <w:spacing w:after="0" w:line="240" w:lineRule="auto"/>
+        <w:rPr>
+          <w:rFonts w:ascii="Consolas" w:hAnsi="Consolas" w:cs="Consolas"/>
+          <w:color w:val="800000"/>
+          <w:sz w:val="20"/>
+          <w:szCs w:val="20"/>
+        </w:rPr>
+      </w:pPr>
+    </w:p>
+    <w:p>
+      <w:pPr>
+        <w:pStyle w:val="Heading2"/>
       </w:pPr>
       <w:bookmarkStart w:id="65" w:name="_Toc96591857"/>
       <w:r>
-        <w:rPr>
-          <w:rFonts w:eastAsia="Times New Roman"/>
-        </w:rPr>
         <w:t>Text substitution via data bound content controls</w:t>
       </w:r>
       <w:bookmarkEnd w:id="65"/>
@@ -36178,7 +36953,7 @@
     </w:p>
     <w:p>
       <w:pPr>
-        <w:pStyle w:val="Heading2"/>
+        <w:pStyle w:val="Heading3"/>
       </w:pPr>
       <w:bookmarkStart w:id="66" w:name="_Toc96591858"/>
       <w:r>
@@ -36237,7 +37012,7 @@
     </w:p>
     <w:p>
       <w:pPr>
-        <w:pStyle w:val="Heading2"/>
+        <w:pStyle w:val="Heading3"/>
       </w:pPr>
       <w:bookmarkStart w:id="67" w:name="_Toc96591859"/>
       <w:r>
@@ -36255,7 +37030,7 @@
     </w:p>
     <w:p>
       <w:pPr>
-        <w:pStyle w:val="Heading2"/>
+        <w:pStyle w:val="Heading3"/>
       </w:pPr>
       <w:bookmarkStart w:id="68" w:name="_Toc96591860"/>
       <w:r>
@@ -36270,7 +37045,7 @@
     </w:p>
     <w:p>
       <w:pPr>
-        <w:pStyle w:val="Heading2"/>
+        <w:pStyle w:val="Heading3"/>
       </w:pPr>
       <w:bookmarkStart w:id="69" w:name="_Toc96591861"/>
       <w:r>
@@ -40034,7 +40809,7 @@
 </file>
 
 <file path=word/endnotes.xml><?xml version="1.0" encoding="utf-8"?>
-<w:endnotes xmlns:wpc="http://schemas.microsoft.com/office/word/2010/wordprocessingCanvas" xmlns:cx="http://schemas.microsoft.com/office/drawing/2014/chartex" xmlns:cx1="http://schemas.microsoft.com/office/drawing/2015/9/8/chartex" xmlns:cx2="http://schemas.microsoft.com/office/drawing/2015/10/21/chartex" xmlns:cx3="http://schemas.microsoft.com/office/drawing/2016/5/9/chartex" xmlns:cx4="http://schemas.microsoft.com/office/drawing/2016/5/10/chartex" xmlns:cx5="http://schemas.microsoft.com/office/drawing/2016/5/11/chartex" xmlns:cx6="http://schemas.microsoft.com/office/drawing/2016/5/12/chartex" xmlns:cx7="http://schemas.microsoft.com/office/drawing/2016/5/13/chartex" xmlns:cx8="http://schemas.microsoft.com/office/drawing/2016/5/14/chartex" xmlns:mc="http://schemas.openxmlformats.org/markup-compatibility/2006" xmlns:aink="http://schemas.microsoft.com/office/drawing/2016/ink" xmlns:am3d="http://schemas.microsoft.com/office/drawing/2017/model3d" xmlns:o="urn:schemas-microsoft-com:office:office" xmlns:oel="http://schemas.microsoft.com/office/2019/extlst" xmlns:r="http://schemas.openxmlformats.org/officeDocument/2006/relationships" xmlns:m="http://schemas.openxmlformats.org/officeDocument/2006/math" xmlns:v="urn:schemas-microsoft-com:vml" xmlns:wp14="http://schemas.microsoft.com/office/word/2010/wordprocessingDrawing" xmlns:wp="http://schemas.openxmlformats.org/drawingml/2006/wordprocessingDrawing" xmlns:w10="urn:schemas-microsoft-com:office:word" xmlns:w="http://schemas.openxmlformats.org/wordprocessingml/2006/main" xmlns:w14="http://schemas.microsoft.com/office/word/2010/wordml" xmlns:w15="http://schemas.microsoft.com/office/word/2012/wordml" xmlns:w16cex="http://schemas.microsoft.com/office/word/2018/wordml/cex" xmlns:w16cid="http://schemas.microsoft.com/office/word/2016/wordml/cid" xmlns:w16="http://schemas.microsoft.com/office/word/2018/wordml" xmlns:w16sdtdh="http://schemas.microsoft.com/office/word/2020/wordml/sdtdatahash" xmlns:w16se="http://schemas.microsoft.com/office/word/2015/wordml/symex" xmlns:wpg="http://schemas.microsoft.com/office/word/2010/wordprocessingGroup" xmlns:wpi="http://schemas.microsoft.com/office/word/2010/wordprocessingInk" xmlns:wne="http://schemas.microsoft.com/office/word/2006/wordml" xmlns:wps="http://schemas.microsoft.com/office/word/2010/wordprocessingShape" mc:Ignorable="w14 w15 w16se w16cid w16 w16cex w16sdtdh wp14">
+<w:endnotes xmlns:wpc="http://schemas.microsoft.com/office/word/2010/wordprocessingCanvas" xmlns:cx="http://schemas.microsoft.com/office/drawing/2014/chartex" xmlns:cx1="http://schemas.microsoft.com/office/drawing/2015/9/8/chartex" xmlns:cx2="http://schemas.microsoft.com/office/drawing/2015/10/21/chartex" xmlns:cx3="http://schemas.microsoft.com/office/drawing/2016/5/9/chartex" xmlns:cx4="http://schemas.microsoft.com/office/drawing/2016/5/10/chartex" xmlns:cx5="http://schemas.microsoft.com/office/drawing/2016/5/11/chartex" xmlns:cx6="http://schemas.microsoft.com/office/drawing/2016/5/12/chartex" xmlns:cx7="http://schemas.microsoft.com/office/drawing/2016/5/13/chartex" xmlns:cx8="http://schemas.microsoft.com/office/drawing/2016/5/14/chartex" xmlns:mc="http://schemas.openxmlformats.org/markup-compatibility/2006" xmlns:aink="http://schemas.microsoft.com/office/drawing/2016/ink" xmlns:am3d="http://schemas.microsoft.com/office/drawing/2017/model3d" xmlns:o="urn:schemas-microsoft-com:office:office" xmlns:oel="http://schemas.microsoft.com/office/2019/extlst" xmlns:r="http://schemas.openxmlformats.org/officeDocument/2006/relationships" xmlns:m="http://schemas.openxmlformats.org/officeDocument/2006/math" xmlns:v="urn:schemas-microsoft-com:vml" xmlns:wp14="http://schemas.microsoft.com/office/word/2010/wordprocessingDrawing" xmlns:wp="http://schemas.openxmlformats.org/drawingml/2006/wordprocessingDrawing" xmlns:w10="urn:schemas-microsoft-com:office:word" xmlns:w="http://schemas.openxmlformats.org/wordprocessingml/2006/main" xmlns:w14="http://schemas.microsoft.com/office/word/2010/wordml" xmlns:w15="http://schemas.microsoft.com/office/word/2012/wordml" xmlns:w16cex="http://schemas.microsoft.com/office/word/2018/wordml/cex" xmlns:w16cid="http://schemas.microsoft.com/office/word/2016/wordml/cid" xmlns:w16="http://schemas.microsoft.com/office/word/2018/wordml" xmlns:w16du="http://schemas.microsoft.com/office/word/2023/wordml/word16du" xmlns:w16sdtdh="http://schemas.microsoft.com/office/word/2020/wordml/sdtdatahash" xmlns:w16sdtfl="http://schemas.microsoft.com/office/word/2024/wordml/sdtformatlock" xmlns:w16se="http://schemas.microsoft.com/office/word/2015/wordml/symex" xmlns:wpg="http://schemas.microsoft.com/office/word/2010/wordprocessingGroup" xmlns:wpi="http://schemas.microsoft.com/office/word/2010/wordprocessingInk" xmlns:wne="http://schemas.microsoft.com/office/word/2006/wordml" xmlns:wps="http://schemas.microsoft.com/office/word/2010/wordprocessingShape" mc:Ignorable="w14 w15 w16se w16cid w16 w16cex w16sdtdh w16sdtfl w16du wp14">
   <w:endnote w:type="separator" w:id="-1">
     <w:p>
       <w:pPr>
@@ -40059,7 +40834,7 @@
 </file>
 
 <file path=word/footer1.xml><?xml version="1.0" encoding="utf-8"?>
-<w:ftr xmlns:wpc="http://schemas.microsoft.com/office/word/2010/wordprocessingCanvas" xmlns:cx="http://schemas.microsoft.com/office/drawing/2014/chartex" xmlns:cx1="http://schemas.microsoft.com/office/drawing/2015/9/8/chartex" xmlns:cx2="http://schemas.microsoft.com/office/drawing/2015/10/21/chartex" xmlns:cx3="http://schemas.microsoft.com/office/drawing/2016/5/9/chartex" xmlns:cx4="http://schemas.microsoft.com/office/drawing/2016/5/10/chartex" xmlns:cx5="http://schemas.microsoft.com/office/drawing/2016/5/11/chartex" xmlns:cx6="http://schemas.microsoft.com/office/drawing/2016/5/12/chartex" xmlns:cx7="http://schemas.microsoft.com/office/drawing/2016/5/13/chartex" xmlns:cx8="http://schemas.microsoft.com/office/drawing/2016/5/14/chartex" xmlns:mc="http://schemas.openxmlformats.org/markup-compatibility/2006" xmlns:aink="http://schemas.microsoft.com/office/drawing/2016/ink" xmlns:am3d="http://schemas.microsoft.com/office/drawing/2017/model3d" xmlns:o="urn:schemas-microsoft-com:office:office" xmlns:oel="http://schemas.microsoft.com/office/2019/extlst" xmlns:r="http://schemas.openxmlformats.org/officeDocument/2006/relationships" xmlns:m="http://schemas.openxmlformats.org/officeDocument/2006/math" xmlns:v="urn:schemas-microsoft-com:vml" xmlns:wp14="http://schemas.microsoft.com/office/word/2010/wordprocessingDrawing" xmlns:wp="http://schemas.openxmlformats.org/drawingml/2006/wordprocessingDrawing" xmlns:w10="urn:schemas-microsoft-com:office:word" xmlns:w="http://schemas.openxmlformats.org/wordprocessingml/2006/main" xmlns:w14="http://schemas.microsoft.com/office/word/2010/wordml" xmlns:w15="http://schemas.microsoft.com/office/word/2012/wordml" xmlns:w16cex="http://schemas.microsoft.com/office/word/2018/wordml/cex" xmlns:w16cid="http://schemas.microsoft.com/office/word/2016/wordml/cid" xmlns:w16="http://schemas.microsoft.com/office/word/2018/wordml" xmlns:w16sdtdh="http://schemas.microsoft.com/office/word/2020/wordml/sdtdatahash" xmlns:w16se="http://schemas.microsoft.com/office/word/2015/wordml/symex" xmlns:wpg="http://schemas.microsoft.com/office/word/2010/wordprocessingGroup" xmlns:wpi="http://schemas.microsoft.com/office/word/2010/wordprocessingInk" xmlns:wne="http://schemas.microsoft.com/office/word/2006/wordml" xmlns:wps="http://schemas.microsoft.com/office/word/2010/wordprocessingShape" mc:Ignorable="w14 w15 w16se w16cid w16 w16cex w16sdtdh wp14">
+<w:ftr xmlns:wpc="http://schemas.microsoft.com/office/word/2010/wordprocessingCanvas" xmlns:cx="http://schemas.microsoft.com/office/drawing/2014/chartex" xmlns:cx1="http://schemas.microsoft.com/office/drawing/2015/9/8/chartex" xmlns:cx2="http://schemas.microsoft.com/office/drawing/2015/10/21/chartex" xmlns:cx3="http://schemas.microsoft.com/office/drawing/2016/5/9/chartex" xmlns:cx4="http://schemas.microsoft.com/office/drawing/2016/5/10/chartex" xmlns:cx5="http://schemas.microsoft.com/office/drawing/2016/5/11/chartex" xmlns:cx6="http://schemas.microsoft.com/office/drawing/2016/5/12/chartex" xmlns:cx7="http://schemas.microsoft.com/office/drawing/2016/5/13/chartex" xmlns:cx8="http://schemas.microsoft.com/office/drawing/2016/5/14/chartex" xmlns:mc="http://schemas.openxmlformats.org/markup-compatibility/2006" xmlns:aink="http://schemas.microsoft.com/office/drawing/2016/ink" xmlns:am3d="http://schemas.microsoft.com/office/drawing/2017/model3d" xmlns:o="urn:schemas-microsoft-com:office:office" xmlns:oel="http://schemas.microsoft.com/office/2019/extlst" xmlns:r="http://schemas.openxmlformats.org/officeDocument/2006/relationships" xmlns:m="http://schemas.openxmlformats.org/officeDocument/2006/math" xmlns:v="urn:schemas-microsoft-com:vml" xmlns:wp14="http://schemas.microsoft.com/office/word/2010/wordprocessingDrawing" xmlns:wp="http://schemas.openxmlformats.org/drawingml/2006/wordprocessingDrawing" xmlns:w10="urn:schemas-microsoft-com:office:word" xmlns:w="http://schemas.openxmlformats.org/wordprocessingml/2006/main" xmlns:w14="http://schemas.microsoft.com/office/word/2010/wordml" xmlns:w15="http://schemas.microsoft.com/office/word/2012/wordml" xmlns:w16cex="http://schemas.microsoft.com/office/word/2018/wordml/cex" xmlns:w16cid="http://schemas.microsoft.com/office/word/2016/wordml/cid" xmlns:w16="http://schemas.microsoft.com/office/word/2018/wordml" xmlns:w16du="http://schemas.microsoft.com/office/word/2023/wordml/word16du" xmlns:w16sdtdh="http://schemas.microsoft.com/office/word/2020/wordml/sdtdatahash" xmlns:w16sdtfl="http://schemas.microsoft.com/office/word/2024/wordml/sdtformatlock" xmlns:w16se="http://schemas.microsoft.com/office/word/2015/wordml/symex" xmlns:wpg="http://schemas.microsoft.com/office/word/2010/wordprocessingGroup" xmlns:wpi="http://schemas.microsoft.com/office/word/2010/wordprocessingInk" xmlns:wne="http://schemas.microsoft.com/office/word/2006/wordml" xmlns:wps="http://schemas.microsoft.com/office/word/2010/wordprocessingShape" mc:Ignorable="w14 w15 w16se w16cid w16 w16cex w16sdtdh w16sdtfl w16du wp14">
   <w:sdt>
     <w:sdtPr>
       <w:id w:val="349237360"/>
@@ -40108,7 +40883,7 @@
 </file>
 
 <file path=word/footnotes.xml><?xml version="1.0" encoding="utf-8"?>
-<w:footnotes xmlns:wpc="http://schemas.microsoft.com/office/word/2010/wordprocessingCanvas" xmlns:cx="http://schemas.microsoft.com/office/drawing/2014/chartex" xmlns:cx1="http://schemas.microsoft.com/office/drawing/2015/9/8/chartex" xmlns:cx2="http://schemas.microsoft.com/office/drawing/2015/10/21/chartex" xmlns:cx3="http://schemas.microsoft.com/office/drawing/2016/5/9/chartex" xmlns:cx4="http://schemas.microsoft.com/office/drawing/2016/5/10/chartex" xmlns:cx5="http://schemas.microsoft.com/office/drawing/2016/5/11/chartex" xmlns:cx6="http://schemas.microsoft.com/office/drawing/2016/5/12/chartex" xmlns:cx7="http://schemas.microsoft.com/office/drawing/2016/5/13/chartex" xmlns:cx8="http://schemas.microsoft.com/office/drawing/2016/5/14/chartex" xmlns:mc="http://schemas.openxmlformats.org/markup-compatibility/2006" xmlns:aink="http://schemas.microsoft.com/office/drawing/2016/ink" xmlns:am3d="http://schemas.microsoft.com/office/drawing/2017/model3d" xmlns:o="urn:schemas-microsoft-com:office:office" xmlns:oel="http://schemas.microsoft.com/office/2019/extlst" xmlns:r="http://schemas.openxmlformats.org/officeDocument/2006/relationships" xmlns:m="http://schemas.openxmlformats.org/officeDocument/2006/math" xmlns:v="urn:schemas-microsoft-com:vml" xmlns:wp14="http://schemas.microsoft.com/office/word/2010/wordprocessingDrawing" xmlns:wp="http://schemas.openxmlformats.org/drawingml/2006/wordprocessingDrawing" xmlns:w10="urn:schemas-microsoft-com:office:word" xmlns:w="http://schemas.openxmlformats.org/wordprocessingml/2006/main" xmlns:w14="http://schemas.microsoft.com/office/word/2010/wordml" xmlns:w15="http://schemas.microsoft.com/office/word/2012/wordml" xmlns:w16cex="http://schemas.microsoft.com/office/word/2018/wordml/cex" xmlns:w16cid="http://schemas.microsoft.com/office/word/2016/wordml/cid" xmlns:w16="http://schemas.microsoft.com/office/word/2018/wordml" xmlns:w16sdtdh="http://schemas.microsoft.com/office/word/2020/wordml/sdtdatahash" xmlns:w16se="http://schemas.microsoft.com/office/word/2015/wordml/symex" xmlns:wpg="http://schemas.microsoft.com/office/word/2010/wordprocessingGroup" xmlns:wpi="http://schemas.microsoft.com/office/word/2010/wordprocessingInk" xmlns:wne="http://schemas.microsoft.com/office/word/2006/wordml" xmlns:wps="http://schemas.microsoft.com/office/word/2010/wordprocessingShape" mc:Ignorable="w14 w15 w16se w16cid w16 w16cex w16sdtdh wp14">
+<w:footnotes xmlns:wpc="http://schemas.microsoft.com/office/word/2010/wordprocessingCanvas" xmlns:cx="http://schemas.microsoft.com/office/drawing/2014/chartex" xmlns:cx1="http://schemas.microsoft.com/office/drawing/2015/9/8/chartex" xmlns:cx2="http://schemas.microsoft.com/office/drawing/2015/10/21/chartex" xmlns:cx3="http://schemas.microsoft.com/office/drawing/2016/5/9/chartex" xmlns:cx4="http://schemas.microsoft.com/office/drawing/2016/5/10/chartex" xmlns:cx5="http://schemas.microsoft.com/office/drawing/2016/5/11/chartex" xmlns:cx6="http://schemas.microsoft.com/office/drawing/2016/5/12/chartex" xmlns:cx7="http://schemas.microsoft.com/office/drawing/2016/5/13/chartex" xmlns:cx8="http://schemas.microsoft.com/office/drawing/2016/5/14/chartex" xmlns:mc="http://schemas.openxmlformats.org/markup-compatibility/2006" xmlns:aink="http://schemas.microsoft.com/office/drawing/2016/ink" xmlns:am3d="http://schemas.microsoft.com/office/drawing/2017/model3d" xmlns:o="urn:schemas-microsoft-com:office:office" xmlns:oel="http://schemas.microsoft.com/office/2019/extlst" xmlns:r="http://schemas.openxmlformats.org/officeDocument/2006/relationships" xmlns:m="http://schemas.openxmlformats.org/officeDocument/2006/math" xmlns:v="urn:schemas-microsoft-com:vml" xmlns:wp14="http://schemas.microsoft.com/office/word/2010/wordprocessingDrawing" xmlns:wp="http://schemas.openxmlformats.org/drawingml/2006/wordprocessingDrawing" xmlns:w10="urn:schemas-microsoft-com:office:word" xmlns:w="http://schemas.openxmlformats.org/wordprocessingml/2006/main" xmlns:w14="http://schemas.microsoft.com/office/word/2010/wordml" xmlns:w15="http://schemas.microsoft.com/office/word/2012/wordml" xmlns:w16cex="http://schemas.microsoft.com/office/word/2018/wordml/cex" xmlns:w16cid="http://schemas.microsoft.com/office/word/2016/wordml/cid" xmlns:w16="http://schemas.microsoft.com/office/word/2018/wordml" xmlns:w16du="http://schemas.microsoft.com/office/word/2023/wordml/word16du" xmlns:w16sdtdh="http://schemas.microsoft.com/office/word/2020/wordml/sdtdatahash" xmlns:w16sdtfl="http://schemas.microsoft.com/office/word/2024/wordml/sdtformatlock" xmlns:w16se="http://schemas.microsoft.com/office/word/2015/wordml/symex" xmlns:wpg="http://schemas.microsoft.com/office/word/2010/wordprocessingGroup" xmlns:wpi="http://schemas.microsoft.com/office/word/2010/wordprocessingInk" xmlns:wne="http://schemas.microsoft.com/office/word/2006/wordml" xmlns:wps="http://schemas.microsoft.com/office/word/2010/wordprocessingShape" mc:Ignorable="w14 w15 w16se w16cid w16 w16cex w16sdtdh w16sdtfl w16du wp14">
   <w:footnote w:type="separator" w:id="-1">
     <w:p>
       <w:pPr>
@@ -40230,7 +41005,7 @@
 </file>
 
 <file path=word/numbering.xml><?xml version="1.0" encoding="utf-8"?>
-<w:numbering xmlns:wpc="http://schemas.microsoft.com/office/word/2010/wordprocessingCanvas" xmlns:cx="http://schemas.microsoft.com/office/drawing/2014/chartex" xmlns:cx1="http://schemas.microsoft.com/office/drawing/2015/9/8/chartex" xmlns:cx2="http://schemas.microsoft.com/office/drawing/2015/10/21/chartex" xmlns:cx3="http://schemas.microsoft.com/office/drawing/2016/5/9/chartex" xmlns:cx4="http://schemas.microsoft.com/office/drawing/2016/5/10/chartex" xmlns:cx5="http://schemas.microsoft.com/office/drawing/2016/5/11/chartex" xmlns:cx6="http://schemas.microsoft.com/office/drawing/2016/5/12/chartex" xmlns:cx7="http://schemas.microsoft.com/office/drawing/2016/5/13/chartex" xmlns:cx8="http://schemas.microsoft.com/office/drawing/2016/5/14/chartex" xmlns:mc="http://schemas.openxmlformats.org/markup-compatibility/2006" xmlns:aink="http://schemas.microsoft.com/office/drawing/2016/ink" xmlns:am3d="http://schemas.microsoft.com/office/drawing/2017/model3d" xmlns:o="urn:schemas-microsoft-com:office:office" xmlns:oel="http://schemas.microsoft.com/office/2019/extlst" xmlns:r="http://schemas.openxmlformats.org/officeDocument/2006/relationships" xmlns:m="http://schemas.openxmlformats.org/officeDocument/2006/math" xmlns:v="urn:schemas-microsoft-com:vml" xmlns:wp14="http://schemas.microsoft.com/office/word/2010/wordprocessingDrawing" xmlns:wp="http://schemas.openxmlformats.org/drawingml/2006/wordprocessingDrawing" xmlns:w10="urn:schemas-microsoft-com:office:word" xmlns:w="http://schemas.openxmlformats.org/wordprocessingml/2006/main" xmlns:w14="http://schemas.microsoft.com/office/word/2010/wordml" xmlns:w15="http://schemas.microsoft.com/office/word/2012/wordml" xmlns:w16cex="http://schemas.microsoft.com/office/word/2018/wordml/cex" xmlns:w16cid="http://schemas.microsoft.com/office/word/2016/wordml/cid" xmlns:w16="http://schemas.microsoft.com/office/word/2018/wordml" xmlns:w16sdtdh="http://schemas.microsoft.com/office/word/2020/wordml/sdtdatahash" xmlns:w16se="http://schemas.microsoft.com/office/word/2015/wordml/symex" xmlns:wpg="http://schemas.microsoft.com/office/word/2010/wordprocessingGroup" xmlns:wpi="http://schemas.microsoft.com/office/word/2010/wordprocessingInk" xmlns:wne="http://schemas.microsoft.com/office/word/2006/wordml" xmlns:wps="http://schemas.microsoft.com/office/word/2010/wordprocessingShape" mc:Ignorable="w14 w15 w16se w16cid w16 w16cex w16sdtdh wp14">
+<w:numbering xmlns:wpc="http://schemas.microsoft.com/office/word/2010/wordprocessingCanvas" xmlns:cx="http://schemas.microsoft.com/office/drawing/2014/chartex" xmlns:cx1="http://schemas.microsoft.com/office/drawing/2015/9/8/chartex" xmlns:cx2="http://schemas.microsoft.com/office/drawing/2015/10/21/chartex" xmlns:cx3="http://schemas.microsoft.com/office/drawing/2016/5/9/chartex" xmlns:cx4="http://schemas.microsoft.com/office/drawing/2016/5/10/chartex" xmlns:cx5="http://schemas.microsoft.com/office/drawing/2016/5/11/chartex" xmlns:cx6="http://schemas.microsoft.com/office/drawing/2016/5/12/chartex" xmlns:cx7="http://schemas.microsoft.com/office/drawing/2016/5/13/chartex" xmlns:cx8="http://schemas.microsoft.com/office/drawing/2016/5/14/chartex" xmlns:mc="http://schemas.openxmlformats.org/markup-compatibility/2006" xmlns:aink="http://schemas.microsoft.com/office/drawing/2016/ink" xmlns:am3d="http://schemas.microsoft.com/office/drawing/2017/model3d" xmlns:o="urn:schemas-microsoft-com:office:office" xmlns:oel="http://schemas.microsoft.com/office/2019/extlst" xmlns:r="http://schemas.openxmlformats.org/officeDocument/2006/relationships" xmlns:m="http://schemas.openxmlformats.org/officeDocument/2006/math" xmlns:v="urn:schemas-microsoft-com:vml" xmlns:wp14="http://schemas.microsoft.com/office/word/2010/wordprocessingDrawing" xmlns:wp="http://schemas.openxmlformats.org/drawingml/2006/wordprocessingDrawing" xmlns:w10="urn:schemas-microsoft-com:office:word" xmlns:w="http://schemas.openxmlformats.org/wordprocessingml/2006/main" xmlns:w14="http://schemas.microsoft.com/office/word/2010/wordml" xmlns:w15="http://schemas.microsoft.com/office/word/2012/wordml" xmlns:w16cex="http://schemas.microsoft.com/office/word/2018/wordml/cex" xmlns:w16cid="http://schemas.microsoft.com/office/word/2016/wordml/cid" xmlns:w16="http://schemas.microsoft.com/office/word/2018/wordml" xmlns:w16du="http://schemas.microsoft.com/office/word/2023/wordml/word16du" xmlns:w16sdtdh="http://schemas.microsoft.com/office/word/2020/wordml/sdtdatahash" xmlns:w16sdtfl="http://schemas.microsoft.com/office/word/2024/wordml/sdtformatlock" xmlns:w16se="http://schemas.microsoft.com/office/word/2015/wordml/symex" xmlns:wpg="http://schemas.microsoft.com/office/word/2010/wordprocessingGroup" xmlns:wpi="http://schemas.microsoft.com/office/word/2010/wordprocessingInk" xmlns:wne="http://schemas.microsoft.com/office/word/2006/wordml" xmlns:wps="http://schemas.microsoft.com/office/word/2010/wordprocessingShape" mc:Ignorable="w14 w15 w16se w16cid w16 w16cex w16sdtdh w16sdtfl w16du wp14">
   <w:abstractNum w:abstractNumId="0" w15:restartNumberingAfterBreak="0">
     <w:nsid w:val="067860D4"/>
     <w:multiLevelType w:val="hybridMultilevel"/>
@@ -42554,6 +43329,92 @@
     </w:lvl>
   </w:abstractNum>
   <w:abstractNum w:abstractNumId="21" w15:restartNumberingAfterBreak="0">
+    <w:nsid w:val="43CE6A28"/>
+    <w:multiLevelType w:val="hybridMultilevel"/>
+    <w:tmpl w:val="C2302FEC"/>
+    <w:lvl w:ilvl="0" w:tplc="0C09000F">
+      <w:start w:val="1"/>
+      <w:numFmt w:val="decimal"/>
+      <w:lvlText w:val="%1."/>
+      <w:lvlJc w:val="left"/>
+      <w:pPr>
+        <w:ind w:left="720" w:hanging="360"/>
+      </w:pPr>
+    </w:lvl>
+    <w:lvl w:ilvl="1" w:tplc="0C090019" w:tentative="1">
+      <w:start w:val="1"/>
+      <w:numFmt w:val="lowerLetter"/>
+      <w:lvlText w:val="%2."/>
+      <w:lvlJc w:val="left"/>
+      <w:pPr>
+        <w:ind w:left="1440" w:hanging="360"/>
+      </w:pPr>
+    </w:lvl>
+    <w:lvl w:ilvl="2" w:tplc="0C09001B" w:tentative="1">
+      <w:start w:val="1"/>
+      <w:numFmt w:val="lowerRoman"/>
+      <w:lvlText w:val="%3."/>
+      <w:lvlJc w:val="right"/>
+      <w:pPr>
+        <w:ind w:left="2160" w:hanging="180"/>
+      </w:pPr>
+    </w:lvl>
+    <w:lvl w:ilvl="3" w:tplc="0C09000F" w:tentative="1">
+      <w:start w:val="1"/>
+      <w:numFmt w:val="decimal"/>
+      <w:lvlText w:val="%4."/>
+      <w:lvlJc w:val="left"/>
+      <w:pPr>
+        <w:ind w:left="2880" w:hanging="360"/>
+      </w:pPr>
+    </w:lvl>
+    <w:lvl w:ilvl="4" w:tplc="0C090019" w:tentative="1">
+      <w:start w:val="1"/>
+      <w:numFmt w:val="lowerLetter"/>
+      <w:lvlText w:val="%5."/>
+      <w:lvlJc w:val="left"/>
+      <w:pPr>
+        <w:ind w:left="3600" w:hanging="360"/>
+      </w:pPr>
+    </w:lvl>
+    <w:lvl w:ilvl="5" w:tplc="0C09001B" w:tentative="1">
+      <w:start w:val="1"/>
+      <w:numFmt w:val="lowerRoman"/>
+      <w:lvlText w:val="%6."/>
+      <w:lvlJc w:val="right"/>
+      <w:pPr>
+        <w:ind w:left="4320" w:hanging="180"/>
+      </w:pPr>
+    </w:lvl>
+    <w:lvl w:ilvl="6" w:tplc="0C09000F" w:tentative="1">
+      <w:start w:val="1"/>
+      <w:numFmt w:val="decimal"/>
+      <w:lvlText w:val="%7."/>
+      <w:lvlJc w:val="left"/>
+      <w:pPr>
+        <w:ind w:left="5040" w:hanging="360"/>
+      </w:pPr>
+    </w:lvl>
+    <w:lvl w:ilvl="7" w:tplc="0C090019" w:tentative="1">
+      <w:start w:val="1"/>
+      <w:numFmt w:val="lowerLetter"/>
+      <w:lvlText w:val="%8."/>
+      <w:lvlJc w:val="left"/>
+      <w:pPr>
+        <w:ind w:left="5760" w:hanging="360"/>
+      </w:pPr>
+    </w:lvl>
+    <w:lvl w:ilvl="8" w:tplc="0C09001B" w:tentative="1">
+      <w:start w:val="1"/>
+      <w:numFmt w:val="lowerRoman"/>
+      <w:lvlText w:val="%9."/>
+      <w:lvlJc w:val="right"/>
+      <w:pPr>
+        <w:ind w:left="6480" w:hanging="180"/>
+      </w:pPr>
+    </w:lvl>
+  </w:abstractNum>
+  <w:abstractNum w:abstractNumId="22" w15:restartNumberingAfterBreak="0">
     <w:nsid w:val="451273A5"/>
     <w:multiLevelType w:val="hybridMultilevel"/>
     <w:tmpl w:val="FF66930E"/>
@@ -42642,7 +43503,7 @@
       </w:pPr>
     </w:lvl>
   </w:abstractNum>
-  <w:abstractNum w:abstractNumId="22" w15:restartNumberingAfterBreak="0">
+  <w:abstractNum w:abstractNumId="23" w15:restartNumberingAfterBreak="0">
     <w:nsid w:val="491577CA"/>
     <w:multiLevelType w:val="hybridMultilevel"/>
     <w:tmpl w:val="BA44392C"/>
@@ -42755,7 +43616,7 @@
       </w:rPr>
     </w:lvl>
   </w:abstractNum>
-  <w:abstractNum w:abstractNumId="23" w15:restartNumberingAfterBreak="0">
+  <w:abstractNum w:abstractNumId="24" w15:restartNumberingAfterBreak="0">
     <w:nsid w:val="4B791CBD"/>
     <w:multiLevelType w:val="hybridMultilevel"/>
     <w:tmpl w:val="74D2FACE"/>
@@ -42868,7 +43729,7 @@
       </w:rPr>
     </w:lvl>
   </w:abstractNum>
-  <w:abstractNum w:abstractNumId="24" w15:restartNumberingAfterBreak="0">
+  <w:abstractNum w:abstractNumId="25" w15:restartNumberingAfterBreak="0">
     <w:nsid w:val="4EE01D30"/>
     <w:multiLevelType w:val="hybridMultilevel"/>
     <w:tmpl w:val="65C00754"/>
@@ -42954,7 +43815,7 @@
       </w:pPr>
     </w:lvl>
   </w:abstractNum>
-  <w:abstractNum w:abstractNumId="25" w15:restartNumberingAfterBreak="0">
+  <w:abstractNum w:abstractNumId="26" w15:restartNumberingAfterBreak="0">
     <w:nsid w:val="5C062860"/>
     <w:multiLevelType w:val="hybridMultilevel"/>
     <w:tmpl w:val="358C8F18"/>
@@ -43067,7 +43928,7 @@
       </w:rPr>
     </w:lvl>
   </w:abstractNum>
-  <w:abstractNum w:abstractNumId="26" w15:restartNumberingAfterBreak="0">
+  <w:abstractNum w:abstractNumId="27" w15:restartNumberingAfterBreak="0">
     <w:nsid w:val="622605DB"/>
     <w:multiLevelType w:val="hybridMultilevel"/>
     <w:tmpl w:val="A6B274BA"/>
@@ -43180,7 +44041,7 @@
       </w:rPr>
     </w:lvl>
   </w:abstractNum>
-  <w:abstractNum w:abstractNumId="27" w15:restartNumberingAfterBreak="0">
+  <w:abstractNum w:abstractNumId="28" w15:restartNumberingAfterBreak="0">
     <w:nsid w:val="623F5805"/>
     <w:multiLevelType w:val="hybridMultilevel"/>
     <w:tmpl w:val="DF9622DE"/>
@@ -43293,7 +44154,120 @@
       </w:rPr>
     </w:lvl>
   </w:abstractNum>
-  <w:abstractNum w:abstractNumId="28" w15:restartNumberingAfterBreak="0">
+  <w:abstractNum w:abstractNumId="29" w15:restartNumberingAfterBreak="0">
+    <w:nsid w:val="696F0BE2"/>
+    <w:multiLevelType w:val="hybridMultilevel"/>
+    <w:tmpl w:val="FF0E6D4C"/>
+    <w:lvl w:ilvl="0" w:tplc="0C090001">
+      <w:start w:val="1"/>
+      <w:numFmt w:val="bullet"/>
+      <w:lvlText w:val=""/>
+      <w:lvlJc w:val="left"/>
+      <w:pPr>
+        <w:ind w:left="720" w:hanging="360"/>
+      </w:pPr>
+      <w:rPr>
+        <w:rFonts w:ascii="Symbol" w:hAnsi="Symbol" w:hint="default"/>
+      </w:rPr>
+    </w:lvl>
+    <w:lvl w:ilvl="1" w:tplc="0C090003" w:tentative="1">
+      <w:start w:val="1"/>
+      <w:numFmt w:val="bullet"/>
+      <w:lvlText w:val="o"/>
+      <w:lvlJc w:val="left"/>
+      <w:pPr>
+        <w:ind w:left="1440" w:hanging="360"/>
+      </w:pPr>
+      <w:rPr>
+        <w:rFonts w:ascii="Courier New" w:hAnsi="Courier New" w:cs="Courier New" w:hint="default"/>
+      </w:rPr>
+    </w:lvl>
+    <w:lvl w:ilvl="2" w:tplc="0C090005" w:tentative="1">
+      <w:start w:val="1"/>
+      <w:numFmt w:val="bullet"/>
+      <w:lvlText w:val=""/>
+      <w:lvlJc w:val="left"/>
+      <w:pPr>
+        <w:ind w:left="2160" w:hanging="360"/>
+      </w:pPr>
+      <w:rPr>
+        <w:rFonts w:ascii="Wingdings" w:hAnsi="Wingdings" w:hint="default"/>
+      </w:rPr>
+    </w:lvl>
+    <w:lvl w:ilvl="3" w:tplc="0C090001" w:tentative="1">
+      <w:start w:val="1"/>
+      <w:numFmt w:val="bullet"/>
+      <w:lvlText w:val=""/>
+      <w:lvlJc w:val="left"/>
+      <w:pPr>
+        <w:ind w:left="2880" w:hanging="360"/>
+      </w:pPr>
+      <w:rPr>
+        <w:rFonts w:ascii="Symbol" w:hAnsi="Symbol" w:hint="default"/>
+      </w:rPr>
+    </w:lvl>
+    <w:lvl w:ilvl="4" w:tplc="0C090003" w:tentative="1">
+      <w:start w:val="1"/>
+      <w:numFmt w:val="bullet"/>
+      <w:lvlText w:val="o"/>
+      <w:lvlJc w:val="left"/>
+      <w:pPr>
+        <w:ind w:left="3600" w:hanging="360"/>
+      </w:pPr>
+      <w:rPr>
+        <w:rFonts w:ascii="Courier New" w:hAnsi="Courier New" w:cs="Courier New" w:hint="default"/>
+      </w:rPr>
+    </w:lvl>
+    <w:lvl w:ilvl="5" w:tplc="0C090005" w:tentative="1">
+      <w:start w:val="1"/>
+      <w:numFmt w:val="bullet"/>
+      <w:lvlText w:val=""/>
+      <w:lvlJc w:val="left"/>
+      <w:pPr>
+        <w:ind w:left="4320" w:hanging="360"/>
+      </w:pPr>
+      <w:rPr>
+        <w:rFonts w:ascii="Wingdings" w:hAnsi="Wingdings" w:hint="default"/>
+      </w:rPr>
+    </w:lvl>
+    <w:lvl w:ilvl="6" w:tplc="0C090001" w:tentative="1">
+      <w:start w:val="1"/>
+      <w:numFmt w:val="bullet"/>
+      <w:lvlText w:val=""/>
+      <w:lvlJc w:val="left"/>
+      <w:pPr>
+        <w:ind w:left="5040" w:hanging="360"/>
+      </w:pPr>
+      <w:rPr>
+        <w:rFonts w:ascii="Symbol" w:hAnsi="Symbol" w:hint="default"/>
+      </w:rPr>
+    </w:lvl>
+    <w:lvl w:ilvl="7" w:tplc="0C090003" w:tentative="1">
+      <w:start w:val="1"/>
+      <w:numFmt w:val="bullet"/>
+      <w:lvlText w:val="o"/>
+      <w:lvlJc w:val="left"/>
+      <w:pPr>
+        <w:ind w:left="5760" w:hanging="360"/>
+      </w:pPr>
+      <w:rPr>
+        <w:rFonts w:ascii="Courier New" w:hAnsi="Courier New" w:cs="Courier New" w:hint="default"/>
+      </w:rPr>
+    </w:lvl>
+    <w:lvl w:ilvl="8" w:tplc="0C090005" w:tentative="1">
+      <w:start w:val="1"/>
+      <w:numFmt w:val="bullet"/>
+      <w:lvlText w:val=""/>
+      <w:lvlJc w:val="left"/>
+      <w:pPr>
+        <w:ind w:left="6480" w:hanging="360"/>
+      </w:pPr>
+      <w:rPr>
+        <w:rFonts w:ascii="Wingdings" w:hAnsi="Wingdings" w:hint="default"/>
+      </w:rPr>
+    </w:lvl>
+  </w:abstractNum>
+  <w:abstractNum w:abstractNumId="30" w15:restartNumberingAfterBreak="0">
     <w:nsid w:val="6C135449"/>
     <w:multiLevelType w:val="hybridMultilevel"/>
     <w:tmpl w:val="922C4E74"/>
@@ -43406,7 +44380,7 @@
       </w:rPr>
     </w:lvl>
   </w:abstractNum>
-  <w:abstractNum w:abstractNumId="29" w15:restartNumberingAfterBreak="0">
+  <w:abstractNum w:abstractNumId="31" w15:restartNumberingAfterBreak="0">
     <w:nsid w:val="73FD11CD"/>
     <w:multiLevelType w:val="hybridMultilevel"/>
     <w:tmpl w:val="8050E552"/>
@@ -43519,7 +44493,7 @@
       </w:rPr>
     </w:lvl>
   </w:abstractNum>
-  <w:abstractNum w:abstractNumId="30" w15:restartNumberingAfterBreak="0">
+  <w:abstractNum w:abstractNumId="32" w15:restartNumberingAfterBreak="0">
     <w:nsid w:val="746C19D6"/>
     <w:multiLevelType w:val="hybridMultilevel"/>
     <w:tmpl w:val="D8967B62"/>
@@ -43632,7 +44606,7 @@
       </w:rPr>
     </w:lvl>
   </w:abstractNum>
-  <w:abstractNum w:abstractNumId="31" w15:restartNumberingAfterBreak="0">
+  <w:abstractNum w:abstractNumId="33" w15:restartNumberingAfterBreak="0">
     <w:nsid w:val="75B43E43"/>
     <w:multiLevelType w:val="hybridMultilevel"/>
     <w:tmpl w:val="C5480284"/>
@@ -43745,7 +44719,7 @@
       </w:rPr>
     </w:lvl>
   </w:abstractNum>
-  <w:abstractNum w:abstractNumId="32" w15:restartNumberingAfterBreak="0">
+  <w:abstractNum w:abstractNumId="34" w15:restartNumberingAfterBreak="0">
     <w:nsid w:val="7658626E"/>
     <w:multiLevelType w:val="hybridMultilevel"/>
     <w:tmpl w:val="DB4463B4"/>
@@ -43858,7 +44832,7 @@
       </w:rPr>
     </w:lvl>
   </w:abstractNum>
-  <w:abstractNum w:abstractNumId="33" w15:restartNumberingAfterBreak="0">
+  <w:abstractNum w:abstractNumId="35" w15:restartNumberingAfterBreak="0">
     <w:nsid w:val="7A5D071C"/>
     <w:multiLevelType w:val="hybridMultilevel"/>
     <w:tmpl w:val="054C9616"/>
@@ -43978,19 +44952,19 @@
     <w:abstractNumId w:val="9"/>
   </w:num>
   <w:num w:numId="3" w16cid:durableId="2058778681">
-    <w:abstractNumId w:val="22"/>
+    <w:abstractNumId w:val="23"/>
   </w:num>
   <w:num w:numId="4" w16cid:durableId="400178916">
     <w:abstractNumId w:val="14"/>
   </w:num>
   <w:num w:numId="5" w16cid:durableId="1038159688">
-    <w:abstractNumId w:val="31"/>
+    <w:abstractNumId w:val="33"/>
   </w:num>
   <w:num w:numId="6" w16cid:durableId="1880898356">
-    <w:abstractNumId w:val="23"/>
+    <w:abstractNumId w:val="24"/>
   </w:num>
   <w:num w:numId="7" w16cid:durableId="1858693286">
-    <w:abstractNumId w:val="29"/>
+    <w:abstractNumId w:val="31"/>
   </w:num>
   <w:num w:numId="8" w16cid:durableId="1782218332">
     <w:abstractNumId w:val="6"/>
@@ -44014,7 +44988,7 @@
     <w:abstractNumId w:val="3"/>
   </w:num>
   <w:num w:numId="15" w16cid:durableId="1068724069">
-    <w:abstractNumId w:val="32"/>
+    <w:abstractNumId w:val="34"/>
   </w:num>
   <w:num w:numId="16" w16cid:durableId="1257127728">
     <w:abstractNumId w:val="0"/>
@@ -44023,13 +44997,13 @@
     <w:abstractNumId w:val="19"/>
   </w:num>
   <w:num w:numId="18" w16cid:durableId="2105106907">
-    <w:abstractNumId w:val="30"/>
+    <w:abstractNumId w:val="32"/>
   </w:num>
   <w:num w:numId="19" w16cid:durableId="1320620346">
     <w:abstractNumId w:val="8"/>
   </w:num>
   <w:num w:numId="20" w16cid:durableId="1264804948">
-    <w:abstractNumId w:val="27"/>
+    <w:abstractNumId w:val="28"/>
   </w:num>
   <w:num w:numId="21" w16cid:durableId="340935752">
     <w:abstractNumId w:val="12"/>
@@ -44041,28 +45015,28 @@
     <w:abstractNumId w:val="17"/>
   </w:num>
   <w:num w:numId="24" w16cid:durableId="2049140585">
-    <w:abstractNumId w:val="25"/>
+    <w:abstractNumId w:val="26"/>
   </w:num>
   <w:num w:numId="25" w16cid:durableId="1652056700">
     <w:abstractNumId w:val="1"/>
   </w:num>
   <w:num w:numId="26" w16cid:durableId="100760455">
-    <w:abstractNumId w:val="33"/>
+    <w:abstractNumId w:val="35"/>
   </w:num>
   <w:num w:numId="27" w16cid:durableId="98062207">
     <w:abstractNumId w:val="16"/>
   </w:num>
   <w:num w:numId="28" w16cid:durableId="709769706">
-    <w:abstractNumId w:val="24"/>
+    <w:abstractNumId w:val="25"/>
   </w:num>
   <w:num w:numId="29" w16cid:durableId="1182400594">
-    <w:abstractNumId w:val="28"/>
+    <w:abstractNumId w:val="30"/>
   </w:num>
   <w:num w:numId="30" w16cid:durableId="922302557">
-    <w:abstractNumId w:val="26"/>
+    <w:abstractNumId w:val="27"/>
   </w:num>
   <w:num w:numId="31" w16cid:durableId="957183568">
-    <w:abstractNumId w:val="21"/>
+    <w:abstractNumId w:val="22"/>
   </w:num>
   <w:num w:numId="32" w16cid:durableId="1794402763">
     <w:abstractNumId w:val="18"/>
@@ -44073,12 +45047,18 @@
   <w:num w:numId="34" w16cid:durableId="1855613473">
     <w:abstractNumId w:val="20"/>
   </w:num>
+  <w:num w:numId="35" w16cid:durableId="262541068">
+    <w:abstractNumId w:val="29"/>
+  </w:num>
+  <w:num w:numId="36" w16cid:durableId="1507600538">
+    <w:abstractNumId w:val="21"/>
+  </w:num>
   <w:numIdMacAtCleanup w:val="26"/>
 </w:numbering>
 </file>
 
 <file path=word/styles.xml><?xml version="1.0" encoding="utf-8"?>
-<w:styles xmlns:mc="http://schemas.openxmlformats.org/markup-compatibility/2006" xmlns:r="http://schemas.openxmlformats.org/officeDocument/2006/relationships" xmlns:w="http://schemas.openxmlformats.org/wordprocessingml/2006/main" xmlns:w14="http://schemas.microsoft.com/office/word/2010/wordml" xmlns:w15="http://schemas.microsoft.com/office/word/2012/wordml" xmlns:w16cex="http://schemas.microsoft.com/office/word/2018/wordml/cex" xmlns:w16cid="http://schemas.microsoft.com/office/word/2016/wordml/cid" xmlns:w16="http://schemas.microsoft.com/office/word/2018/wordml" xmlns:w16sdtdh="http://schemas.microsoft.com/office/word/2020/wordml/sdtdatahash" xmlns:w16se="http://schemas.microsoft.com/office/word/2015/wordml/symex" mc:Ignorable="w14 w15 w16se w16cid w16 w16cex w16sdtdh">
+<w:styles xmlns:mc="http://schemas.openxmlformats.org/markup-compatibility/2006" xmlns:r="http://schemas.openxmlformats.org/officeDocument/2006/relationships" xmlns:w="http://schemas.openxmlformats.org/wordprocessingml/2006/main" xmlns:w14="http://schemas.microsoft.com/office/word/2010/wordml" xmlns:w15="http://schemas.microsoft.com/office/word/2012/wordml" xmlns:w16cex="http://schemas.microsoft.com/office/word/2018/wordml/cex" xmlns:w16cid="http://schemas.microsoft.com/office/word/2016/wordml/cid" xmlns:w16="http://schemas.microsoft.com/office/word/2018/wordml" xmlns:w16du="http://schemas.microsoft.com/office/word/2023/wordml/word16du" xmlns:w16sdtdh="http://schemas.microsoft.com/office/word/2020/wordml/sdtdatahash" xmlns:w16sdtfl="http://schemas.microsoft.com/office/word/2024/wordml/sdtformatlock" xmlns:w16se="http://schemas.microsoft.com/office/word/2015/wordml/symex" mc:Ignorable="w14 w15 w16se w16cid w16 w16cex w16sdtdh w16sdtfl w16du">
   <w:docDefaults>
     <w:rPrDefault>
       <w:rPr>
@@ -44249,7 +45229,7 @@
     <w:lsdException w:name="Table Web 2" w:semiHidden="1" w:unhideWhenUsed="1"/>
     <w:lsdException w:name="Table Web 3" w:semiHidden="1" w:unhideWhenUsed="1"/>
     <w:lsdException w:name="Balloon Text" w:semiHidden="1" w:unhideWhenUsed="1"/>
-    <w:lsdException w:name="Table Grid" w:uiPriority="59"/>
+    <w:lsdException w:name="Table Grid" w:uiPriority="39"/>
     <w:lsdException w:name="Table Theme" w:semiHidden="1" w:unhideWhenUsed="1"/>
     <w:lsdException w:name="Placeholder Text" w:semiHidden="1"/>
     <w:lsdException w:name="No Spacing" w:uiPriority="1" w:qFormat="1"/>
@@ -44475,6 +45455,7 @@
   <w:style w:type="paragraph" w:default="1" w:styleId="Normal">
     <w:name w:val="Normal"/>
     <w:qFormat/>
+    <w:rsid w:val="00C85F32"/>
   </w:style>
   <w:style w:type="paragraph" w:styleId="Heading1">
     <w:name w:val="heading 1"/>
@@ -44517,10 +45498,31 @@
       <w:szCs w:val="28"/>
     </w:rPr>
   </w:style>
+  <w:style w:type="paragraph" w:styleId="Heading3">
+    <w:name w:val="heading 3"/>
+    <w:basedOn w:val="Normal"/>
+    <w:next w:val="Normal"/>
+    <w:link w:val="Heading3Char"/>
+    <w:uiPriority w:val="9"/>
+    <w:unhideWhenUsed/>
+    <w:qFormat/>
+    <w:rsid w:val="00C10F46"/>
+    <w:pPr>
+      <w:keepNext/>
+      <w:keepLines/>
+      <w:spacing w:before="40" w:after="0"/>
+      <w:outlineLvl w:val="2"/>
+    </w:pPr>
+    <w:rPr>
+      <w:rFonts w:asciiTheme="majorHAnsi" w:eastAsiaTheme="majorEastAsia" w:hAnsiTheme="majorHAnsi" w:cstheme="majorBidi"/>
+      <w:color w:val="243F60" w:themeColor="accent1" w:themeShade="7F"/>
+      <w:sz w:val="24"/>
+      <w:szCs w:val="24"/>
+    </w:rPr>
+  </w:style>
   <w:style w:type="character" w:default="1" w:styleId="DefaultParagraphFont">
     <w:name w:val="Default Paragraph Font"/>
     <w:uiPriority w:val="1"/>
-    <w:semiHidden/>
     <w:unhideWhenUsed/>
   </w:style>
   <w:style w:type="table" w:default="1" w:styleId="TableNormal">
@@ -44802,7 +45804,7 @@
   <w:style w:type="table" w:styleId="TableGrid">
     <w:name w:val="Table Grid"/>
     <w:basedOn w:val="TableNormal"/>
-    <w:uiPriority w:val="59"/>
+    <w:uiPriority w:val="39"/>
     <w:pPr>
       <w:spacing w:after="0" w:line="240" w:lineRule="auto"/>
     </w:pPr>
@@ -45057,6 +46059,19 @@
     <w:rPr>
       <w:color w:val="605E5C"/>
       <w:shd w:val="clear" w:color="auto" w:fill="E1DFDD"/>
+    </w:rPr>
+  </w:style>
+  <w:style w:type="character" w:customStyle="1" w:styleId="Heading3Char">
+    <w:name w:val="Heading 3 Char"/>
+    <w:basedOn w:val="DefaultParagraphFont"/>
+    <w:link w:val="Heading3"/>
+    <w:uiPriority w:val="9"/>
+    <w:rsid w:val="00C10F46"/>
+    <w:rPr>
+      <w:rFonts w:asciiTheme="majorHAnsi" w:eastAsiaTheme="majorEastAsia" w:hAnsiTheme="majorHAnsi" w:cstheme="majorBidi"/>
+      <w:color w:val="243F60" w:themeColor="accent1" w:themeShade="7F"/>
+      <w:sz w:val="24"/>
+      <w:szCs w:val="24"/>
     </w:rPr>
   </w:style>
 </w:styles>
@@ -45350,7 +46365,7 @@
 </file>
 
 <file path=customXml/item2.xml><?xml version="1.0" encoding="utf-8"?>
-<b:Sources xmlns:b="http://schemas.openxmlformats.org/officeDocument/2006/bibliography" xmlns="http://schemas.openxmlformats.org/officeDocument/2006/bibliography" SelectedStyle="\APA.XSL" StyleName="APA"/>
+<mypart/>
 </file>
 
 <file path=customXml/item3.xml><?xml version="1.0" encoding="utf-8"?>
@@ -45362,25 +46377,23 @@
 </file>
 
 <file path=customXml/item5.xml><?xml version="1.0" encoding="utf-8"?>
-<mypart/>
+<b:Sources xmlns:b="http://schemas.openxmlformats.org/officeDocument/2006/bibliography" xmlns="http://schemas.openxmlformats.org/officeDocument/2006/bibliography" SelectedStyle="\APA.XSL" StyleName="APA"/>
 </file>
 
 <file path=customXml/itemProps1.xml><?xml version="1.0" encoding="utf-8"?>
-<ds:datastoreItem xmlns:ds="http://schemas.openxmlformats.org/officeDocument/2006/customXml" ds:itemID="{129E683B-8798-4998-BC5B-3A6285F3BA66}">
+<ds:datastoreItem xmlns:ds="http://schemas.openxmlformats.org/officeDocument/2006/customXml" ds:itemID="{94DA83E4-30CE-4756-BA31-36A424DCCFFE}">
   <ds:schemaRefs/>
 </ds:datastoreItem>
 </file>
 
 <file path=customXml/itemProps2.xml><?xml version="1.0" encoding="utf-8"?>
-<ds:datastoreItem xmlns:ds="http://schemas.openxmlformats.org/officeDocument/2006/customXml" ds:itemID="{F28D3F12-7B11-41F1-95E4-756843F013A3}">
-  <ds:schemaRefs>
-    <ds:schemaRef ds:uri="http://schemas.openxmlformats.org/officeDocument/2006/bibliography"/>
-  </ds:schemaRefs>
+<ds:datastoreItem xmlns:ds="http://schemas.openxmlformats.org/officeDocument/2006/customXml" ds:itemID="{6993F598-74FB-4621-A242-6BA71A88A180}">
+  <ds:schemaRefs/>
 </ds:datastoreItem>
 </file>
 
 <file path=customXml/itemProps3.xml><?xml version="1.0" encoding="utf-8"?>
-<ds:datastoreItem xmlns:ds="http://schemas.openxmlformats.org/officeDocument/2006/customXml" ds:itemID="{6993F598-74FB-4621-A242-6BA71A88A180}">
+<ds:datastoreItem xmlns:ds="http://schemas.openxmlformats.org/officeDocument/2006/customXml" ds:itemID="{129E683B-8798-4998-BC5B-3A6285F3BA66}">
   <ds:schemaRefs/>
 </ds:datastoreItem>
 </file>
@@ -45394,7 +46407,9 @@
 </file>
 
 <file path=customXml/itemProps5.xml><?xml version="1.0" encoding="utf-8"?>
-<ds:datastoreItem xmlns:ds="http://schemas.openxmlformats.org/officeDocument/2006/customXml" ds:itemID="{94DA83E4-30CE-4756-BA31-36A424DCCFFE}">
-  <ds:schemaRefs/>
+<ds:datastoreItem xmlns:ds="http://schemas.openxmlformats.org/officeDocument/2006/customXml" ds:itemID="{F28D3F12-7B11-41F1-95E4-756843F013A3}">
+  <ds:schemaRefs>
+    <ds:schemaRef ds:uri="http://schemas.openxmlformats.org/officeDocument/2006/bibliography"/>
+  </ds:schemaRefs>
 </ds:datastoreItem>
 </file>
</xml_diff>

<commit_message>
Update Getting Started for release.
</commit_message>
<xml_diff>
--- a/docs/Docx4j_GettingStarted.docx
+++ b/docs/Docx4j_GettingStarted.docx
@@ -18624,12 +18624,12 @@
       <w:pPr>
         <w:pStyle w:val="Heading1"/>
       </w:pPr>
-      <w:bookmarkStart w:id="30" w:name="_Ref273525601"/>
-      <w:bookmarkStart w:id="31" w:name="_Toc217200716"/>
+      <w:bookmarkStart w:id="30" w:name="_Toc217200716"/>
+      <w:bookmarkStart w:id="31" w:name="_Ref273525601"/>
       <w:r>
         <w:t>docx4j.properties</w:t>
       </w:r>
-      <w:bookmarkEnd w:id="31"/>
+      <w:bookmarkEnd w:id="30"/>
     </w:p>
     <w:p>
       <w:r>
@@ -19430,7 +19430,7 @@
       <w:r>
         <w:t>Adding a paragraph of text</w:t>
       </w:r>
-      <w:bookmarkEnd w:id="30"/>
+      <w:bookmarkEnd w:id="31"/>
       <w:bookmarkEnd w:id="32"/>
     </w:p>
     <w:p>
@@ -26385,9 +26385,12 @@
           <w:rPr>
             <w:rStyle w:val="Hyperlink"/>
           </w:rPr>
-          <w:t>https://github.com/plutext/docx4j/blob/master/docx4j-samples-docx-export-fo/src/main/java/org/docx4j/samples/ConvertOutPDFviaXSLFO.java</w:t>
+          <w:t>https://github.com/plutext/docx4j/tree/VERSION_11_5_14/docx4j-samples-docx-export-fo/src/main/java/org/docx4j/samples</w:t>
         </w:r>
       </w:hyperlink>
+      <w:r>
+        <w:t xml:space="preserve"> </w:t>
+      </w:r>
     </w:p>
     <w:p>
       <w:r>
@@ -26654,6 +26657,256 @@
     </w:tbl>
     <w:p/>
     <w:p>
+      <w:r>
+        <w:rPr>
+          <w:b/>
+          <w:bCs/>
+        </w:rPr>
+        <w:t>High volume usage.</w:t>
+      </w:r>
+      <w:r>
+        <w:rPr>
+          <w:b/>
+          <w:bCs/>
+        </w:rPr>
+        <w:t xml:space="preserve"> </w:t>
+      </w:r>
+    </w:p>
+    <w:p>
+      <w:r>
+        <w:t>The Apache FOP project recommends reusing a FopFactory instance when rendering multiple documents during the lifetime of a JVM.</w:t>
+      </w:r>
+    </w:p>
+    <w:p>
+      <w:r>
+        <w:t>Docx4j needs to create a font configuration for FOP on a per-document basis, not just because each docx could use differing fonts, but also because font</w:t>
+      </w:r>
+      <w:r>
+        <w:t>s</w:t>
+      </w:r>
+      <w:r>
+        <w:t xml:space="preserve"> can be embedded in </w:t>
+      </w:r>
+      <w:r>
+        <w:t xml:space="preserve">a </w:t>
+      </w:r>
+      <w:r>
+        <w:t>docx</w:t>
+      </w:r>
+      <w:r>
+        <w:t xml:space="preserve"> (often licensed for use with that document and its PDF output only)</w:t>
+      </w:r>
+      <w:r>
+        <w:t>.</w:t>
+      </w:r>
+    </w:p>
+    <w:p>
+      <w:r>
+        <w:t>Here is how to create a FopFactory for use with docx4j:</w:t>
+      </w:r>
+    </w:p>
+    <w:p>
+      <w:pPr>
+        <w:rPr>
+          <w:rFonts w:ascii="Consolas" w:hAnsi="Consolas"/>
+          <w:sz w:val="16"/>
+          <w:szCs w:val="16"/>
+        </w:rPr>
+      </w:pPr>
+      <w:r>
+        <w:rPr>
+          <w:rFonts w:ascii="Consolas" w:hAnsi="Consolas"/>
+          <w:sz w:val="16"/>
+          <w:szCs w:val="16"/>
+        </w:rPr>
+        <w:tab/>
+        <w:t xml:space="preserve">FOSettings foSettings = </w:t>
+      </w:r>
+      <w:r>
+        <w:rPr>
+          <w:rFonts w:ascii="Consolas" w:hAnsi="Consolas"/>
+          <w:b/>
+          <w:bCs/>
+          <w:sz w:val="16"/>
+          <w:szCs w:val="16"/>
+        </w:rPr>
+        <w:t>new</w:t>
+      </w:r>
+      <w:r>
+        <w:rPr>
+          <w:rFonts w:ascii="Consolas" w:hAnsi="Consolas"/>
+          <w:sz w:val="16"/>
+          <w:szCs w:val="16"/>
+        </w:rPr>
+        <w:t xml:space="preserve"> FOSettings(wordMLPackage);</w:t>
+      </w:r>
+      <w:r>
+        <w:rPr>
+          <w:rFonts w:ascii="Consolas" w:hAnsi="Consolas"/>
+          <w:sz w:val="16"/>
+          <w:szCs w:val="16"/>
+        </w:rPr>
+        <w:br/>
+      </w:r>
+      <w:r>
+        <w:rPr>
+          <w:rFonts w:ascii="Consolas" w:hAnsi="Consolas"/>
+          <w:sz w:val="16"/>
+          <w:szCs w:val="16"/>
+        </w:rPr>
+        <w:tab/>
+        <w:t>FopFactoryBuilder fopFactoryBuilder = FORendererApacheFOP.</w:t>
+      </w:r>
+      <w:r>
+        <w:rPr>
+          <w:rFonts w:ascii="Consolas" w:hAnsi="Consolas"/>
+          <w:i/>
+          <w:iCs/>
+          <w:sz w:val="16"/>
+          <w:szCs w:val="16"/>
+        </w:rPr>
+        <w:t>getFopFactoryBuilder</w:t>
+      </w:r>
+      <w:r>
+        <w:rPr>
+          <w:rFonts w:ascii="Consolas" w:hAnsi="Consolas"/>
+          <w:sz w:val="16"/>
+          <w:szCs w:val="16"/>
+        </w:rPr>
+        <w:t>(foSettings);</w:t>
+      </w:r>
+      <w:r>
+        <w:rPr>
+          <w:rFonts w:ascii="Consolas" w:hAnsi="Consolas"/>
+          <w:sz w:val="16"/>
+          <w:szCs w:val="16"/>
+        </w:rPr>
+        <w:br/>
+      </w:r>
+      <w:r>
+        <w:rPr>
+          <w:rFonts w:ascii="Consolas" w:hAnsi="Consolas"/>
+          <w:sz w:val="16"/>
+          <w:szCs w:val="16"/>
+        </w:rPr>
+        <w:tab/>
+      </w:r>
+      <w:r>
+        <w:rPr>
+          <w:rFonts w:ascii="Consolas" w:hAnsi="Consolas"/>
+          <w:i/>
+          <w:iCs/>
+          <w:sz w:val="16"/>
+          <w:szCs w:val="16"/>
+        </w:rPr>
+        <w:t>fopFactory</w:t>
+      </w:r>
+      <w:r>
+        <w:rPr>
+          <w:rFonts w:ascii="Consolas" w:hAnsi="Consolas"/>
+          <w:sz w:val="16"/>
+          <w:szCs w:val="16"/>
+        </w:rPr>
+        <w:t xml:space="preserve"> = fopFactoryBuilder.build();</w:t>
+      </w:r>
+    </w:p>
+    <w:p>
+      <w:r>
+        <w:t xml:space="preserve">FopFactory </w:t>
+      </w:r>
+      <w:r>
+        <w:t xml:space="preserve">creation is cheaper than it otherwise might be, </w:t>
+      </w:r>
+      <w:r>
+        <w:t>because we specify fonts explicitly and do not let FOP auto-detect fonts (instead, that is done once by docx4j’s PhysicalFonts class</w:t>
+      </w:r>
+      <w:r>
+        <w:t>).</w:t>
+      </w:r>
+    </w:p>
+    <w:p>
+      <w:r>
+        <w:t xml:space="preserve">In typical docx4j usage, the performance difference between reusing a FopFactory and creating a new one (using FOSettings) for each export is usually modest. </w:t>
+      </w:r>
+    </w:p>
+    <w:p>
+      <w:r>
+        <w:t>Reusing the FopFactory is slightly more efficient and is also consistent with the Apache FOP project’s recommendation. From docx4j 11.5.14, this is therefore the recommended approach.</w:t>
+      </w:r>
+      <w:r>
+        <w:t xml:space="preserve"> </w:t>
+      </w:r>
+      <w:r>
+        <w:t xml:space="preserve">You should create a FopFactory </w:t>
+      </w:r>
+      <w:r>
+        <w:t xml:space="preserve">as shown above </w:t>
+      </w:r>
+      <w:r>
+        <w:t>when preparing to render the first document</w:t>
+      </w:r>
+      <w:r>
+        <w:t xml:space="preserve"> only, then re-use it.  See </w:t>
+      </w:r>
+      <w:hyperlink r:id="rId72" w:history="1">
+        <w:r>
+          <w:rPr>
+            <w:rStyle w:val="Hyperlink"/>
+          </w:rPr>
+          <w:t>https://github.com/plutext/docx4j/blob/VERSION_11_5_14/docx4j-samples-docx-export-fo/src/main/java/org/docx4j/samples/ManyThreads.java</w:t>
+        </w:r>
+      </w:hyperlink>
+      <w:r>
+        <w:t xml:space="preserve"> </w:t>
+      </w:r>
+    </w:p>
+    <w:p>
+      <w:r>
+        <w:t>When a FopFactory is reused, docx4j uses a custom PDF document handler, introduced in docx4j 11.5.14, to configure FOP fonts on a per-document basis. This avoids relying on FOP’s cached renderer configuration for font setup, while still allowing the FopFactory itself to be reused.</w:t>
+      </w:r>
+    </w:p>
+    <w:p>
+      <w:r>
+        <w:t>This custom document handler is enabled by default. You can disable it, for example if you are not reusing a FopFactory, by setting the following docx4j property:</w:t>
+      </w:r>
+    </w:p>
+    <w:p>
+      <w:pPr>
+        <w:ind w:firstLine="720"/>
+        <w:rPr>
+          <w:rFonts w:ascii="Consolas" w:hAnsi="Consolas"/>
+          <w:sz w:val="18"/>
+          <w:szCs w:val="18"/>
+        </w:rPr>
+      </w:pPr>
+      <w:r>
+        <w:rPr>
+          <w:rFonts w:ascii="Consolas" w:hAnsi="Consolas"/>
+          <w:sz w:val="18"/>
+          <w:szCs w:val="18"/>
+        </w:rPr>
+        <w:t>docx4j.convert.out.fo.renderers.</w:t>
+      </w:r>
+      <w:r>
+        <w:rPr>
+          <w:rFonts w:ascii="Consolas" w:hAnsi="Consolas"/>
+          <w:b/>
+          <w:bCs/>
+          <w:sz w:val="18"/>
+          <w:szCs w:val="18"/>
+        </w:rPr>
+        <w:t>ConfiguredPDFDocumentHandler</w:t>
+      </w:r>
+      <w:r>
+        <w:rPr>
+          <w:rFonts w:ascii="Consolas" w:hAnsi="Consolas"/>
+          <w:sz w:val="18"/>
+          <w:szCs w:val="18"/>
+        </w:rPr>
+        <w:t>=false</w:t>
+      </w:r>
+    </w:p>
+    <w:p>
       <w:pPr>
         <w:pStyle w:val="Heading1"/>
         <w:rPr>
@@ -26665,6 +26918,7 @@
         <w:rPr>
           <w:rFonts w:eastAsia="Times New Roman"/>
         </w:rPr>
+        <w:lastRenderedPageBreak/>
         <w:t>Image Handling</w:t>
       </w:r>
       <w:r>
@@ -27793,7 +28047,6 @@
           <w:sz w:val="18"/>
           <w:szCs w:val="18"/>
         </w:rPr>
-        <w:lastRenderedPageBreak/>
         <w:tab/>
       </w:r>
       <w:r>
@@ -29156,6 +29409,7 @@
           <w:sz w:val="18"/>
           <w:szCs w:val="18"/>
         </w:rPr>
+        <w:lastRenderedPageBreak/>
         <w:tab/>
       </w:r>
       <w:r>
@@ -31209,7 +31463,6 @@
     </w:p>
     <w:p>
       <w:r>
-        <w:lastRenderedPageBreak/>
         <w:t xml:space="preserve">Note the name </w:t>
       </w:r>
       <w:r>
@@ -31264,6 +31517,7 @@
         </w:numPr>
       </w:pPr>
       <w:r>
+        <w:lastRenderedPageBreak/>
         <w:t>a relationship, in the relationships part of the main document part (or header part etc).  This relationship includes:</w:t>
       </w:r>
     </w:p>
@@ -31473,7 +31727,7 @@
       <w:r>
         <w:t xml:space="preserve">See the pptx4j </w:t>
       </w:r>
-      <w:hyperlink r:id="rId72" w:history="1">
+      <w:hyperlink r:id="rId73" w:history="1">
         <w:r>
           <w:rPr>
             <w:rStyle w:val="Hyperlink"/>
@@ -31589,7 +31843,6 @@
           <w:szCs w:val="16"/>
           <w:lang w:val="en-US"/>
         </w:rPr>
-        <w:lastRenderedPageBreak/>
         <w:t>/**</w:t>
       </w:r>
     </w:p>
@@ -32027,6 +32280,7 @@
         </w:numPr>
       </w:pPr>
       <w:r>
+        <w:lastRenderedPageBreak/>
         <w:t>WordprocessingMLPackage</w:t>
       </w:r>
       <w:r>
@@ -32191,7 +32445,7 @@
         </w:rPr>
         <w:t xml:space="preserve">For the documents4j approach, please see </w:t>
       </w:r>
-      <w:hyperlink r:id="rId73" w:history="1">
+      <w:hyperlink r:id="rId74" w:history="1">
         <w:r>
           <w:rPr>
             <w:rStyle w:val="Hyperlink"/>
@@ -32216,7 +32470,7 @@
         </w:rPr>
         <w:t xml:space="preserve">That example is for Word running locally.  If you run Word remotely, please see the comments at </w:t>
       </w:r>
-      <w:hyperlink r:id="rId74" w:anchor="L61" w:history="1">
+      <w:hyperlink r:id="rId75" w:anchor="L61" w:history="1">
         <w:r>
           <w:rPr>
             <w:rStyle w:val="Hyperlink"/>
@@ -32239,7 +32493,7 @@
         </w:rPr>
         <w:t xml:space="preserve">The "pure Java" approach uses export-fo.  For an example using this approach, please see </w:t>
       </w:r>
-      <w:hyperlink r:id="rId75" w:history="1">
+      <w:hyperlink r:id="rId76" w:history="1">
         <w:r>
           <w:rPr>
             <w:rStyle w:val="Hyperlink"/>
@@ -32268,7 +32522,6 @@
     </w:p>
     <w:p>
       <w:r>
-        <w:lastRenderedPageBreak/>
         <w:t>Where docx4j or other code is used to modify the document, the TOC may need updating since page numbers may be wrong, or entries added, deleted or modified.</w:t>
       </w:r>
     </w:p>
@@ -32295,6 +32548,7 @@
       <w:bookmarkStart w:id="55" w:name="_Toc403733684"/>
       <w:bookmarkStart w:id="56" w:name="_Toc217200737"/>
       <w:r>
+        <w:lastRenderedPageBreak/>
         <w:t>Field background</w:t>
       </w:r>
       <w:bookmarkEnd w:id="55"/>
@@ -33584,7 +33838,7 @@
                     </pic:cNvPicPr>
                   </pic:nvPicPr>
                   <pic:blipFill>
-                    <a:blip r:embed="rId76">
+                    <a:blip r:embed="rId77">
                       <a:extLst>
                         <a:ext uri="{28A0092B-C50C-407E-A947-70E740481C1C}">
                           <a14:useLocalDpi xmlns:a14="http://schemas.microsoft.com/office/drawing/2010/main" val="0"/>
@@ -36493,7 +36747,7 @@
       <w:r>
         <w:t xml:space="preserve">.  (This approach supersedes Word's legacy mail merge fields.  Simple VBA for migrating a document is available at </w:t>
       </w:r>
-      <w:hyperlink r:id="rId77" w:history="1">
+      <w:hyperlink r:id="rId78" w:history="1">
         <w:r>
           <w:rPr>
             <w:rStyle w:val="Hyperlink"/>
@@ -37555,7 +37809,7 @@
       <w:r>
         <w:t xml:space="preserve">docx4j contains a mechanism for processing conditional content controls and repeats.  See </w:t>
       </w:r>
-      <w:hyperlink r:id="rId78" w:history="1">
+      <w:hyperlink r:id="rId79" w:history="1">
         <w:r>
           <w:rPr>
             <w:rStyle w:val="Hyperlink"/>
@@ -37625,7 +37879,7 @@
       <w:r>
         <w:t xml:space="preserve">the Word Add-In from </w:t>
       </w:r>
-      <w:hyperlink r:id="rId79" w:history="1">
+      <w:hyperlink r:id="rId80" w:history="1">
         <w:r>
           <w:rPr>
             <w:rStyle w:val="Hyperlink"/>
@@ -37994,15 +38248,15 @@
           <w:szCs w:val="18"/>
         </w:rPr>
       </w:pPr>
-      <w:bookmarkStart w:id="75" w:name="_Ref273527051"/>
-      <w:bookmarkStart w:id="76" w:name="_Toc217200753"/>
+      <w:bookmarkStart w:id="75" w:name="_Toc217200753"/>
+      <w:bookmarkStart w:id="76" w:name="_Ref273527051"/>
       <w:r>
         <w:rPr>
           <w:lang w:val="de-DE"/>
         </w:rPr>
         <w:t>javax.xml.bind.JAXBElement</w:t>
       </w:r>
-      <w:bookmarkEnd w:id="76"/>
+      <w:bookmarkEnd w:id="75"/>
     </w:p>
     <w:p>
       <w:r>
@@ -38172,7 +38426,7 @@
       <w:r>
         <w:t>@XmlRootElement</w:t>
       </w:r>
-      <w:bookmarkEnd w:id="75"/>
+      <w:bookmarkEnd w:id="76"/>
       <w:bookmarkEnd w:id="77"/>
     </w:p>
     <w:p>
@@ -39146,7 +39400,7 @@
       <w:r>
         <w:t xml:space="preserve">The easiest way is to use the </w:t>
       </w:r>
-      <w:hyperlink r:id="rId80" w:history="1">
+      <w:hyperlink r:id="rId81" w:history="1">
         <w:r>
           <w:rPr>
             <w:rStyle w:val="Hyperlink"/>
@@ -39215,7 +39469,7 @@
         </w:rPr>
         <w:t> </w:t>
       </w:r>
-      <w:hyperlink r:id="rId81" w:history="1">
+      <w:hyperlink r:id="rId82" w:history="1">
         <w:r>
           <w:rPr>
             <w:rStyle w:val="Hyperlink"/>
@@ -39369,7 +39623,7 @@
         </w:rPr>
         <w:t xml:space="preserve">To try it, visit </w:t>
       </w:r>
-      <w:hyperlink r:id="rId82" w:history="1">
+      <w:hyperlink r:id="rId83" w:history="1">
         <w:r>
           <w:rPr>
             <w:rStyle w:val="Hyperlink"/>
@@ -39601,7 +39855,7 @@
       <w:r>
         <w:t xml:space="preserve"> priority support from </w:t>
       </w:r>
-      <w:hyperlink r:id="rId83" w:history="1">
+      <w:hyperlink r:id="rId84" w:history="1">
         <w:r>
           <w:rPr>
             <w:rStyle w:val="Hyperlink"/>
@@ -39655,7 +39909,7 @@
       <w:r>
         <w:t xml:space="preserve">XML pretty printed using </w:t>
       </w:r>
-      <w:hyperlink r:id="rId84" w:history="1">
+      <w:hyperlink r:id="rId85" w:history="1">
         <w:r>
           <w:rPr>
             <w:color w:val="0000FF"/>
@@ -39679,7 +39933,7 @@
       <w:r>
         <w:t xml:space="preserve">Java source code formatted using </w:t>
       </w:r>
-      <w:hyperlink r:id="rId85" w:history="1">
+      <w:hyperlink r:id="rId86" w:history="1">
         <w:r>
           <w:rPr>
             <w:rStyle w:val="Hyperlink"/>
@@ -39722,7 +39976,7 @@
       <w:r>
         <w:t xml:space="preserve">Unless you have paid for support, general “How do I” type questions should be posted directly to the </w:t>
       </w:r>
-      <w:hyperlink r:id="rId86" w:history="1">
+      <w:hyperlink r:id="rId87" w:history="1">
         <w:r>
           <w:rPr>
             <w:rStyle w:val="Hyperlink"/>
@@ -39741,7 +39995,7 @@
       <w:r>
         <w:t xml:space="preserve">Plutext can be contacted at either </w:t>
       </w:r>
-      <w:hyperlink r:id="rId87" w:history="1">
+      <w:hyperlink r:id="rId88" w:history="1">
         <w:r>
           <w:rPr>
             <w:rStyle w:val="Hyperlink"/>
@@ -39752,7 +40006,7 @@
       <w:r>
         <w:t xml:space="preserve">, or </w:t>
       </w:r>
-      <w:hyperlink r:id="rId88" w:history="1">
+      <w:hyperlink r:id="rId89" w:history="1">
         <w:r>
           <w:rPr>
             <w:rStyle w:val="Hyperlink"/>
@@ -41698,7 +41952,7 @@
       <w:r>
         <w:t xml:space="preserve">Typically you map the base name, for example “Liberation Sans”, not “Liberation Sans Regular” or “Bold”.  </w:t>
       </w:r>
-      <w:hyperlink r:id="rId89" w:history="1">
+      <w:hyperlink r:id="rId90" w:history="1">
         <w:r>
           <w:rPr>
             <w:rStyle w:val="Hyperlink"/>
@@ -41721,7 +41975,7 @@
       <w:r>
         <w:t xml:space="preserve">You can use </w:t>
       </w:r>
-      <w:hyperlink r:id="rId90" w:history="1">
+      <w:hyperlink r:id="rId91" w:history="1">
         <w:r>
           <w:rPr>
             <w:rStyle w:val="Hyperlink"/>
@@ -43394,6 +43648,7 @@
         <w:docPartUnique/>
       </w:docPartObj>
     </w:sdtPr>
+    <w:sdtEndPr/>
     <w:sdtContent>
       <w:p>
         <w:pPr>
@@ -48442,7 +48697,7 @@
   <w:style w:type="paragraph" w:default="1" w:styleId="Normal">
     <w:name w:val="Normal"/>
     <w:qFormat/>
-    <w:rsid w:val="00537FF5"/>
+    <w:rsid w:val="009A4A0F"/>
   </w:style>
   <w:style w:type="paragraph" w:styleId="Heading1">
     <w:name w:val="heading 1"/>
@@ -49362,11 +49617,11 @@
 </file>
 
 <file path=customXml/item1.xml><?xml version="1.0" encoding="utf-8"?>
-<b:Sources xmlns:b="http://schemas.openxmlformats.org/officeDocument/2006/bibliography" xmlns="http://schemas.openxmlformats.org/officeDocument/2006/bibliography" SelectedStyle="\APA.XSL" StyleName="APA"/>
+<mypart/>
 </file>
 
 <file path=customXml/item2.xml><?xml version="1.0" encoding="utf-8"?>
-<mypart/>
+<b:Sources xmlns:b="http://schemas.openxmlformats.org/officeDocument/2006/bibliography" xmlns="http://schemas.openxmlformats.org/officeDocument/2006/bibliography" SelectedStyle="\APA.XSL" StyleName="APA"/>
 </file>
 
 <file path=customXml/item3.xml><?xml version="1.0" encoding="utf-8"?>
@@ -49382,6 +49637,12 @@
 </file>
 
 <file path=customXml/itemProps1.xml><?xml version="1.0" encoding="utf-8"?>
+<ds:datastoreItem xmlns:ds="http://schemas.openxmlformats.org/officeDocument/2006/customXml" ds:itemID="{129E683B-8798-4998-BC5B-3A6285F3BA66}">
+  <ds:schemaRefs/>
+</ds:datastoreItem>
+</file>
+
+<file path=customXml/itemProps2.xml><?xml version="1.0" encoding="utf-8"?>
 <ds:datastoreItem xmlns:ds="http://schemas.openxmlformats.org/officeDocument/2006/customXml" ds:itemID="{F28D3F12-7B11-41F1-95E4-756843F013A3}">
   <ds:schemaRefs>
     <ds:schemaRef ds:uri="http://schemas.openxmlformats.org/officeDocument/2006/bibliography"/>
@@ -49389,14 +49650,8 @@
 </ds:datastoreItem>
 </file>
 
-<file path=customXml/itemProps2.xml><?xml version="1.0" encoding="utf-8"?>
-<ds:datastoreItem xmlns:ds="http://schemas.openxmlformats.org/officeDocument/2006/customXml" ds:itemID="{129E683B-8798-4998-BC5B-3A6285F3BA66}">
-  <ds:schemaRefs/>
-</ds:datastoreItem>
-</file>
-
 <file path=customXml/itemProps3.xml><?xml version="1.0" encoding="utf-8"?>
-<ds:datastoreItem xmlns:ds="http://schemas.openxmlformats.org/officeDocument/2006/customXml" ds:itemID="{94DA83E4-30CE-4756-BA31-36A424DCCFFE}">
+<ds:datastoreItem xmlns:ds="http://schemas.openxmlformats.org/officeDocument/2006/customXml" ds:itemID="{6993F598-74FB-4621-A242-6BA71A88A180}">
   <ds:schemaRefs/>
 </ds:datastoreItem>
 </file>
@@ -49410,7 +49665,7 @@
 </file>
 
 <file path=customXml/itemProps5.xml><?xml version="1.0" encoding="utf-8"?>
-<ds:datastoreItem xmlns:ds="http://schemas.openxmlformats.org/officeDocument/2006/customXml" ds:itemID="{6993F598-74FB-4621-A242-6BA71A88A180}">
+<ds:datastoreItem xmlns:ds="http://schemas.openxmlformats.org/officeDocument/2006/customXml" ds:itemID="{94DA83E4-30CE-4756-BA31-36A424DCCFFE}">
   <ds:schemaRefs/>
 </ds:datastoreItem>
 </file>
</xml_diff>

<commit_message>
Update docs for 17.0.0
</commit_message>
<xml_diff>
--- a/docs/Docx4j_GettingStarted.docx
+++ b/docs/Docx4j_GettingStarted.docx
@@ -5525,156 +5525,54 @@
         <w:rPr>
           <w:b/>
         </w:rPr>
-        <w:t>8.</w:t>
+        <w:t>11.</w:t>
       </w:r>
       <w:r>
         <w:rPr>
           <w:b/>
         </w:rPr>
-        <w:t>3.</w:t>
+        <w:t>5</w:t>
       </w:r>
       <w:r>
         <w:rPr>
           <w:b/>
         </w:rPr>
-        <w:t xml:space="preserve">x </w:t>
+        <w:t>.x</w:t>
+      </w:r>
+      <w:r>
+        <w:rPr>
+          <w:b/>
+        </w:rPr>
+        <w:t xml:space="preserve"> </w:t>
       </w:r>
       <w:r>
         <w:rPr>
           <w:bCs/>
         </w:rPr>
-        <w:t xml:space="preserve">and </w:t>
+        <w:t>and</w:t>
       </w:r>
       <w:r>
         <w:rPr>
           <w:b/>
         </w:rPr>
-        <w:t>11.</w:t>
-      </w:r>
-      <w:r>
-        <w:rPr>
-          <w:b/>
-        </w:rPr>
-        <w:t>5</w:t>
-      </w:r>
-      <w:r>
-        <w:rPr>
-          <w:b/>
-        </w:rPr>
-        <w:t>.x</w:t>
-      </w:r>
-      <w:r>
-        <w:t>.</w:t>
-      </w:r>
-      <w:r>
-        <w:t xml:space="preserve">  The </w:t>
-      </w:r>
-      <w:r>
-        <w:t>8</w:t>
-      </w:r>
-      <w:r>
-        <w:t>.x series will be the last series to run under Java 1.</w:t>
-      </w:r>
-      <w:r>
-        <w:t>8</w:t>
-      </w:r>
-      <w:r>
-        <w:t xml:space="preserve"> (hence the name)</w:t>
-      </w:r>
-      <w:r>
-        <w:t>; the 11.</w:t>
-      </w:r>
-      <w:r>
-        <w:t>5</w:t>
-      </w:r>
-      <w:r>
-        <w:t xml:space="preserve"> series is for Java 11 and later.</w:t>
-      </w:r>
-      <w:r>
-        <w:t xml:space="preserve"> </w:t>
-      </w:r>
-    </w:p>
-    <w:p>
-      <w:r>
-        <w:t xml:space="preserve">The most significant change in the </w:t>
-      </w:r>
-      <w:r>
-        <w:rPr>
-          <w:b/>
-          <w:bCs/>
-        </w:rPr>
-        <w:t>11.</w:t>
-      </w:r>
-      <w:r>
-        <w:rPr>
-          <w:b/>
-          <w:bCs/>
-        </w:rPr>
-        <w:t>5</w:t>
-      </w:r>
-      <w:r>
-        <w:rPr>
-          <w:b/>
-          <w:bCs/>
-        </w:rPr>
-        <w:t xml:space="preserve"> series</w:t>
-      </w:r>
-      <w:r>
-        <w:t xml:space="preserve"> is that it </w:t>
-      </w:r>
-      <w:r>
-        <w:rPr>
-          <w:b/>
-          <w:bCs/>
-        </w:rPr>
-        <w:t xml:space="preserve">uses Jakarta XML Binding API </w:t>
-      </w:r>
-      <w:r>
-        <w:rPr>
-          <w:b/>
-          <w:bCs/>
-        </w:rPr>
-        <w:t>4</w:t>
-      </w:r>
-      <w:r>
-        <w:rPr>
-          <w:b/>
-          <w:bCs/>
-        </w:rPr>
-        <w:t>.0</w:t>
-      </w:r>
-      <w:r>
-        <w:t xml:space="preserve">, as opposed to JAXB 2.x used in </w:t>
-      </w:r>
-      <w:r>
-        <w:t>docx4j 8.x</w:t>
-      </w:r>
-      <w:r>
-        <w:t xml:space="preserve"> (which import javax.xml.bind.*). Since this release uses </w:t>
-      </w:r>
-      <w:r>
-        <w:rPr>
-          <w:b/>
-          <w:bCs/>
-        </w:rPr>
-        <w:t>jakarta.xml.bind</w:t>
-      </w:r>
-      <w:r>
-        <w:t>, rather than javax.xml.bind, if you have existing code which imports javax.xml.bind, you'll need to search/replace across your code base, replacing javax.xml.bind with jakarta.xml.bind. You'll also need to replace your JAXB jars (which Maven will do for you automatically; otherwise get them from the relevant zip file).</w:t>
-      </w:r>
-      <w:r>
-        <w:t xml:space="preserve">.  </w:t>
-      </w:r>
-    </w:p>
-    <w:p>
-      <w:r>
-        <w:t>We recommend you adopt the 11.</w:t>
-      </w:r>
-      <w:r>
-        <w:t>5</w:t>
-      </w:r>
-      <w:r>
-        <w:t xml:space="preserve"> series:</w:t>
+        <w:t xml:space="preserve"> 17.x</w:t>
+      </w:r>
+      <w:r>
+        <w:t xml:space="preserve">, both of which are for </w:t>
+      </w:r>
+      <w:r>
+        <w:t xml:space="preserve">Java 11 and later. </w:t>
+      </w:r>
+      <w:r>
+        <w:t xml:space="preserve">  </w:t>
+      </w:r>
+    </w:p>
+    <w:p>
+      <w:r>
+        <w:t>Version numbering jumped from 11.5.14 to 17.0.0</w:t>
+      </w:r>
+      <w:r>
+        <w:t xml:space="preserve"> in part because of the following API changes:</w:t>
       </w:r>
     </w:p>
     <w:p>
@@ -5682,14 +5580,11 @@
         <w:pStyle w:val="ListParagraph"/>
         <w:numPr>
           <w:ilvl w:val="0"/>
-          <w:numId w:val="34"/>
+          <w:numId w:val="41"/>
         </w:numPr>
       </w:pPr>
       <w:r>
-        <w:t xml:space="preserve">Changes are made to this release series first, </w:t>
-      </w:r>
-      <w:r>
-        <w:t xml:space="preserve">and may or may not be back-ported </w:t>
+        <w:t xml:space="preserve">old methods getEGBlockLevelElts, getParagraphContent, getRunContent have been replaced with getContent; </w:t>
       </w:r>
     </w:p>
     <w:p>
@@ -5697,63 +5592,46 @@
         <w:pStyle w:val="ListParagraph"/>
         <w:numPr>
           <w:ilvl w:val="0"/>
-          <w:numId w:val="34"/>
+          <w:numId w:val="41"/>
         </w:numPr>
       </w:pPr>
       <w:r>
-        <w:t>It supports the recent Java long term releases:</w:t>
+        <w:t xml:space="preserve">ArrayListWml, ArrayListDml, ArrayListVml, and ArrayListMce have been replaced by a single ArrayListDocx4j class; </w:t>
       </w:r>
     </w:p>
     <w:p>
       <w:pPr>
         <w:pStyle w:val="ListParagraph"/>
         <w:numPr>
-          <w:ilvl w:val="1"/>
-          <w:numId w:val="34"/>
+          <w:ilvl w:val="0"/>
+          <w:numId w:val="41"/>
         </w:numPr>
       </w:pPr>
       <w:r>
-        <w:t>Java 11 (released Sept 2018)</w:t>
-      </w:r>
-    </w:p>
-    <w:p>
-      <w:pPr>
-        <w:pStyle w:val="ListParagraph"/>
-        <w:numPr>
-          <w:ilvl w:val="1"/>
-          <w:numId w:val="34"/>
-        </w:numPr>
-      </w:pPr>
-      <w:r>
-        <w:t>Java 17 (released Sept 2021),</w:t>
-      </w:r>
-    </w:p>
-    <w:p>
-      <w:pPr>
-        <w:pStyle w:val="ListParagraph"/>
-        <w:numPr>
-          <w:ilvl w:val="1"/>
-          <w:numId w:val="34"/>
-        </w:numPr>
-      </w:pPr>
-      <w:r>
-        <w:t>Java 21 (released Sept 2023),</w:t>
-      </w:r>
-    </w:p>
-    <w:p>
-      <w:pPr>
-        <w:pStyle w:val="ListParagraph"/>
-        <w:numPr>
-          <w:ilvl w:val="1"/>
-          <w:numId w:val="34"/>
-        </w:numPr>
-      </w:pPr>
-      <w:r>
-        <w:t>Java 25 (released Sept 2025),</w:t>
-      </w:r>
-      <w:r>
-        <w:br/>
-        <w:t>(as well as the non LTS versions after Java 11)</w:t>
+        <w:t>org.jvnet.jaxb2_commons.ppp.Child is now org.jvnet.jaxb.lang.Child</w:t>
+      </w:r>
+    </w:p>
+    <w:p>
+      <w:r>
+        <w:t>This guide</w:t>
+      </w:r>
+      <w:r>
+        <w:t xml:space="preserve"> is also applicable for the most part to </w:t>
+      </w:r>
+      <w:r>
+        <w:rPr>
+          <w:b/>
+        </w:rPr>
+        <w:t xml:space="preserve">8.3.x </w:t>
+      </w:r>
+      <w:r>
+        <w:rPr>
+          <w:bCs/>
+        </w:rPr>
+        <w:t xml:space="preserve">which now in 2026 is considered obsolete.  </w:t>
+      </w:r>
+      <w:r>
+        <w:t xml:space="preserve">The 8.x series was the last series to run under Java 1.8 (hence the name) </w:t>
       </w:r>
     </w:p>
     <w:p>
@@ -5774,7 +5652,6 @@
     </w:p>
     <w:p>
       <w:r>
-        <w:lastRenderedPageBreak/>
         <w:t xml:space="preserve">There is also a handy 1 page summary at </w:t>
       </w:r>
       <w:hyperlink r:id="rId13" w:history="1">
@@ -5793,40 +5670,12 @@
       </w:r>
     </w:p>
     <w:p>
-      <w:r>
-        <w:t xml:space="preserve">The most up to date copy of this document is in English.  </w:t>
-      </w:r>
-      <w:r>
-        <w:t>There is also a</w:t>
-      </w:r>
-      <w:r>
-        <w:t>n old now outdated</w:t>
-      </w:r>
-      <w:r>
-        <w:t xml:space="preserve"> Russian version.  </w:t>
-      </w:r>
-      <w:r>
-        <w:t xml:space="preserve">From time to time, it </w:t>
-      </w:r>
-      <w:r>
-        <w:t xml:space="preserve">may be </w:t>
-      </w:r>
-      <w:r>
-        <w:t xml:space="preserve">machine translated into other languages. </w:t>
-      </w:r>
-      <w:r>
-        <w:t xml:space="preserve"> Please let us know if you are interested in writing some basic documentation in your own language (either as a contribution, or for a fee).</w:t>
-      </w:r>
-      <w:r>
-        <w:t xml:space="preserve"> </w:t>
-      </w:r>
-    </w:p>
-    <w:p>
       <w:pPr>
         <w:pStyle w:val="Heading1"/>
       </w:pPr>
       <w:bookmarkStart w:id="0" w:name="_Toc217200687"/>
       <w:r>
+        <w:lastRenderedPageBreak/>
         <w:t>What is docx4j?</w:t>
       </w:r>
       <w:bookmarkEnd w:id="0"/>
@@ -6041,7 +5890,6 @@
       </w:pPr>
       <w:bookmarkStart w:id="1" w:name="_Toc217200688"/>
       <w:r>
-        <w:lastRenderedPageBreak/>
         <w:t>What sorts of things can you do with docx4j?</w:t>
       </w:r>
       <w:bookmarkEnd w:id="1"/>
@@ -6127,6 +5975,7 @@
         </w:numPr>
       </w:pPr>
       <w:r>
+        <w:lastRenderedPageBreak/>
         <w:t>Do all this on Android.</w:t>
       </w:r>
     </w:p>
@@ -6270,7 +6119,6 @@
       </w:pPr>
       <w:bookmarkStart w:id="4" w:name="_Toc217200691"/>
       <w:r>
-        <w:lastRenderedPageBreak/>
         <w:t>docx4j.NET</w:t>
       </w:r>
       <w:bookmarkEnd w:id="4"/>
@@ -6370,6 +6218,7 @@
         </w:numPr>
       </w:pPr>
       <w:r>
+        <w:lastRenderedPageBreak/>
         <w:t>Where you need to work in both Java and .NET, and want to use a single API in both environments</w:t>
       </w:r>
     </w:p>
@@ -6592,45 +6441,45 @@
       </w:pPr>
       <w:bookmarkStart w:id="6" w:name="_Toc217200693"/>
       <w:r>
+        <w:t>Handling legacy binary .doc files</w:t>
+      </w:r>
+      <w:bookmarkEnd w:id="6"/>
+    </w:p>
+    <w:p>
+      <w:r>
+        <w:t xml:space="preserve">An effective approach is to use </w:t>
+      </w:r>
+      <w:r>
+        <w:t xml:space="preserve">LibreOffice or </w:t>
+      </w:r>
+      <w:r>
+        <w:t xml:space="preserve">OpenOffice (via jodconverter) to convert the doc to docx, which docx4j can then process.  If you need to return a binary .doc, </w:t>
+      </w:r>
+      <w:r>
+        <w:t xml:space="preserve">LibreOffice or </w:t>
+      </w:r>
+      <w:r>
+        <w:t>OpenOffice/jodconverter can convert the docx back to .doc.</w:t>
+      </w:r>
+    </w:p>
+    <w:p>
+      <w:r>
+        <w:t>With 8.2.0, docx4j can also convert binary .doc or RTF to docx, using Microsoft Word courtesy of documents4j.   The sub-projects docx4j-documents4j-local and docx4j-documents4j-remote provide an interface to documents4j which is convenient for docx4j users.</w:t>
+      </w:r>
+    </w:p>
+    <w:p>
+      <w:pPr>
+        <w:pStyle w:val="Heading1"/>
+        <w:rPr>
+          <w:rFonts w:eastAsia="Times New Roman"/>
+        </w:rPr>
+      </w:pPr>
+      <w:bookmarkStart w:id="7" w:name="_Toc217200694"/>
+      <w:r>
+        <w:rPr>
+          <w:rFonts w:eastAsia="Times New Roman"/>
+        </w:rPr>
         <w:lastRenderedPageBreak/>
-        <w:t>Handling legacy binary .doc files</w:t>
-      </w:r>
-      <w:bookmarkEnd w:id="6"/>
-    </w:p>
-    <w:p>
-      <w:r>
-        <w:t xml:space="preserve">An effective approach is to use </w:t>
-      </w:r>
-      <w:r>
-        <w:t xml:space="preserve">LibreOffice or </w:t>
-      </w:r>
-      <w:r>
-        <w:t xml:space="preserve">OpenOffice (via jodconverter) to convert the doc to docx, which docx4j can then process.  If you need to return a binary .doc, </w:t>
-      </w:r>
-      <w:r>
-        <w:t xml:space="preserve">LibreOffice or </w:t>
-      </w:r>
-      <w:r>
-        <w:t>OpenOffice/jodconverter can convert the docx back to .doc.</w:t>
-      </w:r>
-    </w:p>
-    <w:p>
-      <w:r>
-        <w:t>With 8.2.0, docx4j can also convert binary .doc or RTF to docx, using Microsoft Word courtesy of documents4j.   The sub-projects docx4j-documents4j-local and docx4j-documents4j-remote provide an interface to documents4j which is convenient for docx4j users.</w:t>
-      </w:r>
-    </w:p>
-    <w:p>
-      <w:pPr>
-        <w:pStyle w:val="Heading1"/>
-        <w:rPr>
-          <w:rFonts w:eastAsia="Times New Roman"/>
-        </w:rPr>
-      </w:pPr>
-      <w:bookmarkStart w:id="7" w:name="_Toc217200694"/>
-      <w:r>
-        <w:rPr>
-          <w:rFonts w:eastAsia="Times New Roman"/>
-        </w:rPr>
         <w:t>Getting Help: the docx4j forum</w:t>
       </w:r>
       <w:bookmarkEnd w:id="7"/>
@@ -6813,7 +6662,6 @@
         </w:numPr>
       </w:pPr>
       <w:r>
-        <w:lastRenderedPageBreak/>
         <w:t xml:space="preserve">the JAXB in Java 8 implementation; to use this, you need the </w:t>
       </w:r>
       <w:r>
@@ -6843,154 +6691,253 @@
     </w:p>
     <w:p>
       <w:r>
+        <w:t>This table shows which docx4j versions align with JAXB spec versions:</w:t>
+      </w:r>
+    </w:p>
+    <w:tbl>
+      <w:tblPr>
+        <w:tblStyle w:val="TableGrid"/>
+        <w:tblW w:w="0" w:type="auto"/>
+        <w:tblInd w:w="675" w:type="dxa"/>
+        <w:tblLook w:val="04A0" w:firstRow="1" w:lastRow="0" w:firstColumn="1" w:lastColumn="0" w:noHBand="0" w:noVBand="1"/>
+      </w:tblPr>
+      <w:tblGrid>
+        <w:gridCol w:w="2517"/>
+        <w:gridCol w:w="3192"/>
+        <w:gridCol w:w="2371"/>
+      </w:tblGrid>
+      <w:tr>
+        <w:tc>
+          <w:tcPr>
+            <w:tcW w:w="2517" w:type="dxa"/>
+            <w:shd w:val="clear" w:color="auto" w:fill="D9D9D9" w:themeFill="background1" w:themeFillShade="D9"/>
+          </w:tcPr>
+          <w:p>
+            <w:pPr>
+              <w:rPr>
+                <w:b/>
+                <w:bCs/>
+              </w:rPr>
+            </w:pPr>
+            <w:r>
+              <w:rPr>
+                <w:b/>
+                <w:bCs/>
+              </w:rPr>
+              <w:t>JAXB version</w:t>
+            </w:r>
+          </w:p>
+        </w:tc>
+        <w:tc>
+          <w:tcPr>
+            <w:tcW w:w="3192" w:type="dxa"/>
+            <w:shd w:val="clear" w:color="auto" w:fill="D9D9D9" w:themeFill="background1" w:themeFillShade="D9"/>
+          </w:tcPr>
+          <w:p>
+            <w:pPr>
+              <w:rPr>
+                <w:b/>
+                <w:bCs/>
+              </w:rPr>
+            </w:pPr>
+            <w:r>
+              <w:rPr>
+                <w:b/>
+                <w:bCs/>
+              </w:rPr>
+              <w:t>Namespace</w:t>
+            </w:r>
+          </w:p>
+        </w:tc>
+        <w:tc>
+          <w:tcPr>
+            <w:tcW w:w="2371" w:type="dxa"/>
+            <w:shd w:val="clear" w:color="auto" w:fill="D9D9D9" w:themeFill="background1" w:themeFillShade="D9"/>
+          </w:tcPr>
+          <w:p>
+            <w:pPr>
+              <w:rPr>
+                <w:b/>
+                <w:bCs/>
+              </w:rPr>
+            </w:pPr>
+            <w:r>
+              <w:rPr>
+                <w:b/>
+                <w:bCs/>
+              </w:rPr>
+              <w:t>Docx4j version</w:t>
+            </w:r>
+          </w:p>
+        </w:tc>
+      </w:tr>
+      <w:tr>
+        <w:tc>
+          <w:tcPr>
+            <w:tcW w:w="2517" w:type="dxa"/>
+          </w:tcPr>
+          <w:p>
+            <w:r>
+              <w:t>JAXB 4.0</w:t>
+            </w:r>
+          </w:p>
+        </w:tc>
+        <w:tc>
+          <w:tcPr>
+            <w:tcW w:w="3192" w:type="dxa"/>
+          </w:tcPr>
+          <w:p>
+            <w:r>
+              <w:t>jakarta.xml.bind</w:t>
+            </w:r>
+          </w:p>
+        </w:tc>
+        <w:tc>
+          <w:tcPr>
+            <w:tcW w:w="2371" w:type="dxa"/>
+          </w:tcPr>
+          <w:p>
+            <w:r>
+              <w:t>Docx4j 17.0.x</w:t>
+            </w:r>
+          </w:p>
+          <w:p>
+            <w:r>
+              <w:lastRenderedPageBreak/>
+              <w:t>Docx4j 11.</w:t>
+            </w:r>
+            <w:r>
+              <w:t>5.x</w:t>
+            </w:r>
+          </w:p>
+        </w:tc>
+      </w:tr>
+      <w:tr>
+        <w:tc>
+          <w:tcPr>
+            <w:tcW w:w="2517" w:type="dxa"/>
+          </w:tcPr>
+          <w:p>
+            <w:r>
+              <w:lastRenderedPageBreak/>
+              <w:t>JAXB 3.0</w:t>
+            </w:r>
+          </w:p>
+        </w:tc>
+        <w:tc>
+          <w:tcPr>
+            <w:tcW w:w="3192" w:type="dxa"/>
+          </w:tcPr>
+          <w:p>
+            <w:r>
+              <w:t>jakarta.xml.bind</w:t>
+            </w:r>
+          </w:p>
+        </w:tc>
+        <w:tc>
+          <w:tcPr>
+            <w:tcW w:w="2371" w:type="dxa"/>
+          </w:tcPr>
+          <w:p>
+            <w:r>
+              <w:t>Docx4j 11.4.</w:t>
+            </w:r>
+            <w:r>
+              <w:t>x</w:t>
+            </w:r>
+          </w:p>
+        </w:tc>
+      </w:tr>
+      <w:tr>
+        <w:tc>
+          <w:tcPr>
+            <w:tcW w:w="2517" w:type="dxa"/>
+          </w:tcPr>
+          <w:p>
+            <w:r>
+              <w:t>JAXB 2.x</w:t>
+            </w:r>
+          </w:p>
+        </w:tc>
+        <w:tc>
+          <w:tcPr>
+            <w:tcW w:w="3192" w:type="dxa"/>
+          </w:tcPr>
+          <w:p>
+            <w:r>
+              <w:t>javax.xml.bind</w:t>
+            </w:r>
+          </w:p>
+        </w:tc>
+        <w:tc>
+          <w:tcPr>
+            <w:tcW w:w="2371" w:type="dxa"/>
+          </w:tcPr>
+          <w:p>
+            <w:r>
+              <w:t>Docx4j to 11.3.2</w:t>
+            </w:r>
+          </w:p>
+          <w:p>
+            <w:r>
+              <w:t>Docx4j 8.x</w:t>
+            </w:r>
+          </w:p>
+        </w:tc>
+      </w:tr>
+    </w:tbl>
+    <w:p/>
+    <w:p>
+      <w:pPr>
+        <w:pStyle w:val="Heading1"/>
+      </w:pPr>
+      <w:bookmarkStart w:id="9" w:name="_Toc217200696"/>
+      <w:r>
+        <w:t>Using docx4j via Maven</w:t>
+      </w:r>
+      <w:bookmarkEnd w:id="9"/>
+    </w:p>
+    <w:p>
+      <w:r>
+        <w:t>docx4j is in Maven Central.  For Maven users, t</w:t>
+      </w:r>
+      <w:r>
+        <w:t xml:space="preserve">his makes it really easy to get going with docx4j.  </w:t>
+      </w:r>
+    </w:p>
+    <w:p>
+      <w:r>
+        <w:t xml:space="preserve">As noted in the introduction, current release series are docx4j </w:t>
+      </w:r>
+      <w:r>
         <w:rPr>
           <w:b/>
+        </w:rPr>
+        <w:t>11.</w:t>
+      </w:r>
+      <w:r>
+        <w:rPr>
+          <w:b/>
+        </w:rPr>
+        <w:t>5</w:t>
+      </w:r>
+      <w:r>
+        <w:rPr>
+          <w:b/>
+        </w:rPr>
+        <w:t>.x.</w:t>
+      </w:r>
+      <w:r>
+        <w:rPr>
           <w:bCs/>
         </w:rPr>
-        <w:t>docx4j v11.5 uses Jakarta XML Binding API 4.0</w:t>
-      </w:r>
-      <w:r>
-        <w:t xml:space="preserve"> (and v11.4 uses Jakarta XML Binding API 3.0), as opposed to JAXB 2.x used in earlier versions (which import javax.xml.bind.*). Since v11.4 and v11.5 uses jakarta.xml.bind, rather than javax.xml.bind, if you have existing code which imports javax.xml.bind, you'll need to search/replace across your code base, replacing javax.xml.bind with jakarta.xml.bind. You'll also need to replace your JAXB jars (which Maven will do for you automatically; otherwise get them from the relevant zip file).</w:t>
-      </w:r>
-    </w:p>
-    <w:p>
-      <w:pPr>
-        <w:pStyle w:val="Heading1"/>
-      </w:pPr>
-      <w:bookmarkStart w:id="9" w:name="_Toc217200696"/>
-      <w:r>
-        <w:t>Using docx4j via Maven</w:t>
-      </w:r>
-      <w:bookmarkEnd w:id="9"/>
-    </w:p>
-    <w:p>
-      <w:r>
-        <w:t>docx4j is in Maven Central.  For Maven users, t</w:t>
-      </w:r>
-      <w:r>
-        <w:t xml:space="preserve">his makes it really easy to get going with docx4j.  </w:t>
-      </w:r>
-    </w:p>
-    <w:p>
-      <w:r>
-        <w:t xml:space="preserve">As noted in the introduction, current release series are docx4j </w:t>
+        <w:t xml:space="preserve"> and </w:t>
       </w:r>
       <w:r>
         <w:rPr>
           <w:b/>
         </w:rPr>
-        <w:t xml:space="preserve">8.3.x </w:t>
-      </w:r>
-      <w:r>
-        <w:rPr>
-          <w:bCs/>
-        </w:rPr>
-        <w:t xml:space="preserve">and </w:t>
-      </w:r>
-      <w:r>
-        <w:rPr>
-          <w:b/>
-        </w:rPr>
-        <w:t>11.</w:t>
-      </w:r>
-      <w:r>
-        <w:rPr>
-          <w:b/>
-        </w:rPr>
-        <w:t>5</w:t>
-      </w:r>
-      <w:r>
-        <w:rPr>
-          <w:b/>
-        </w:rPr>
-        <w:t>.x.</w:t>
-      </w:r>
-    </w:p>
-    <w:p>
-      <w:r>
-        <w:t>We recommend you adopt the 11.</w:t>
-      </w:r>
-      <w:r>
-        <w:t>5</w:t>
-      </w:r>
-      <w:r>
-        <w:t xml:space="preserve"> series if possible:</w:t>
-      </w:r>
-    </w:p>
-    <w:p>
-      <w:pPr>
-        <w:pStyle w:val="ListParagraph"/>
-        <w:numPr>
-          <w:ilvl w:val="0"/>
-          <w:numId w:val="34"/>
-        </w:numPr>
-      </w:pPr>
-      <w:r>
-        <w:t xml:space="preserve">Changes are made to this release series first, and may or may not be back-ported </w:t>
-      </w:r>
-    </w:p>
-    <w:p>
-      <w:pPr>
-        <w:pStyle w:val="ListParagraph"/>
-        <w:numPr>
-          <w:ilvl w:val="0"/>
-          <w:numId w:val="34"/>
-        </w:numPr>
-      </w:pPr>
-      <w:r>
-        <w:t>It supports the recent Java long term releases:</w:t>
-      </w:r>
-    </w:p>
-    <w:p>
-      <w:pPr>
-        <w:pStyle w:val="ListParagraph"/>
-        <w:numPr>
-          <w:ilvl w:val="1"/>
-          <w:numId w:val="34"/>
-        </w:numPr>
-      </w:pPr>
-      <w:r>
-        <w:t>Java 11 (released Sept 2018)</w:t>
-      </w:r>
-    </w:p>
-    <w:p>
-      <w:pPr>
-        <w:pStyle w:val="ListParagraph"/>
-        <w:numPr>
-          <w:ilvl w:val="1"/>
-          <w:numId w:val="34"/>
-        </w:numPr>
-      </w:pPr>
-      <w:r>
-        <w:t>Java 17 (released Sept 2021),</w:t>
-      </w:r>
-    </w:p>
-    <w:p>
-      <w:pPr>
-        <w:pStyle w:val="ListParagraph"/>
-        <w:numPr>
-          <w:ilvl w:val="1"/>
-          <w:numId w:val="34"/>
-        </w:numPr>
-      </w:pPr>
-      <w:r>
-        <w:t>Java 21 (released Sept 2023),</w:t>
-      </w:r>
-    </w:p>
-    <w:p>
-      <w:pPr>
-        <w:pStyle w:val="ListParagraph"/>
-        <w:numPr>
-          <w:ilvl w:val="1"/>
-          <w:numId w:val="34"/>
-        </w:numPr>
-      </w:pPr>
-      <w:r>
-        <w:t>Java 25 (released Sept 2025),</w:t>
-      </w:r>
-      <w:r>
-        <w:br/>
-        <w:t>(as well as the non LTS versions after Java 11)</w:t>
+        <w:t>17.x</w:t>
       </w:r>
     </w:p>
     <w:p>
@@ -6998,13 +6945,13 @@
         <w:rPr>
           <w:lang w:val="en-US"/>
         </w:rPr>
-        <w:t>To use docx4j 11.</w:t>
+        <w:t>To use docx4j 1</w:t>
       </w:r>
       <w:r>
         <w:rPr>
           <w:lang w:val="en-US"/>
         </w:rPr>
-        <w:t>5.7</w:t>
+        <w:t>7.0.0</w:t>
       </w:r>
       <w:r>
         <w:rPr>
@@ -7274,7 +7221,7 @@
           <w:szCs w:val="16"/>
           <w:lang w:val="en-US"/>
         </w:rPr>
-        <w:t>11.</w:t>
+        <w:t>1</w:t>
       </w:r>
       <w:r>
         <w:rPr>
@@ -7283,7 +7230,16 @@
           <w:szCs w:val="16"/>
           <w:lang w:val="en-US"/>
         </w:rPr>
-        <w:t>5.7</w:t>
+        <w:t>7</w:t>
+      </w:r>
+      <w:r>
+        <w:rPr>
+          <w:rFonts w:ascii="Consolas" w:hAnsi="Consolas"/>
+          <w:sz w:val="16"/>
+          <w:szCs w:val="16"/>
+          <w:lang w:val="en-US"/>
+        </w:rPr>
+        <w:t>.0.0</w:t>
       </w:r>
       <w:r>
         <w:rPr>
@@ -7567,7 +7523,7 @@
           <w:szCs w:val="16"/>
           <w:lang w:val="en-US"/>
         </w:rPr>
-        <w:t>11.5.7</w:t>
+        <w:t>17.0.0</w:t>
       </w:r>
       <w:r>
         <w:rPr>
@@ -7612,887 +7568,6 @@
     <w:p>
       <w:pPr>
         <w:rPr>
-          <w:lang w:val="en-US"/>
-        </w:rPr>
-      </w:pPr>
-    </w:p>
-    <w:p>
-      <w:r>
-        <w:rPr>
-          <w:lang w:val="en-US"/>
-        </w:rPr>
-        <w:lastRenderedPageBreak/>
-        <w:t xml:space="preserve">To use docx4j </w:t>
-      </w:r>
-      <w:r>
-        <w:rPr>
-          <w:lang w:val="en-US"/>
-        </w:rPr>
-        <w:t>8.3.</w:t>
-      </w:r>
-      <w:r>
-        <w:rPr>
-          <w:lang w:val="en-US"/>
-        </w:rPr>
-        <w:t>15</w:t>
-      </w:r>
-      <w:r>
-        <w:rPr>
-          <w:lang w:val="en-US"/>
-        </w:rPr>
-        <w:t xml:space="preserve">, add </w:t>
-      </w:r>
-      <w:r>
-        <w:rPr>
-          <w:b/>
-          <w:bCs/>
-          <w:u w:val="single"/>
-        </w:rPr>
-        <w:t>one and only one</w:t>
-      </w:r>
-      <w:r>
-        <w:t xml:space="preserve"> of the following to your project:</w:t>
-      </w:r>
-    </w:p>
-    <w:p>
-      <w:pPr>
-        <w:spacing w:after="0"/>
-        <w:rPr>
-          <w:rFonts w:ascii="Consolas" w:hAnsi="Consolas"/>
-          <w:sz w:val="16"/>
-          <w:szCs w:val="16"/>
-          <w:lang w:val="en-US"/>
-        </w:rPr>
-      </w:pPr>
-      <w:r>
-        <w:rPr>
-          <w:rFonts w:ascii="Consolas" w:hAnsi="Consolas"/>
-          <w:sz w:val="16"/>
-          <w:szCs w:val="16"/>
-          <w:lang w:val="en-US"/>
-        </w:rPr>
-        <w:tab/>
-      </w:r>
-      <w:r>
-        <w:rPr>
-          <w:rFonts w:ascii="Consolas" w:hAnsi="Consolas"/>
-          <w:sz w:val="16"/>
-          <w:szCs w:val="16"/>
-          <w:lang w:val="en-US"/>
-        </w:rPr>
-        <w:tab/>
-        <w:t>&lt;!-- use the JAXB shipped in Java 8 --&gt;</w:t>
-      </w:r>
-    </w:p>
-    <w:p>
-      <w:pPr>
-        <w:spacing w:after="0"/>
-        <w:rPr>
-          <w:rFonts w:ascii="Consolas" w:hAnsi="Consolas"/>
-          <w:sz w:val="16"/>
-          <w:szCs w:val="16"/>
-          <w:lang w:val="en-US"/>
-        </w:rPr>
-      </w:pPr>
-      <w:r>
-        <w:rPr>
-          <w:rFonts w:ascii="Consolas" w:hAnsi="Consolas"/>
-          <w:sz w:val="16"/>
-          <w:szCs w:val="16"/>
-          <w:lang w:val="en-US"/>
-        </w:rPr>
-        <w:tab/>
-      </w:r>
-      <w:r>
-        <w:rPr>
-          <w:rFonts w:ascii="Consolas" w:hAnsi="Consolas"/>
-          <w:sz w:val="16"/>
-          <w:szCs w:val="16"/>
-          <w:lang w:val="en-US"/>
-        </w:rPr>
-        <w:tab/>
-        <w:t>&lt;dependency&gt;</w:t>
-      </w:r>
-    </w:p>
-    <w:p>
-      <w:pPr>
-        <w:spacing w:after="0"/>
-        <w:rPr>
-          <w:rFonts w:ascii="Consolas" w:hAnsi="Consolas"/>
-          <w:sz w:val="16"/>
-          <w:szCs w:val="16"/>
-          <w:lang w:val="en-US"/>
-        </w:rPr>
-      </w:pPr>
-      <w:r>
-        <w:rPr>
-          <w:rFonts w:ascii="Consolas" w:hAnsi="Consolas"/>
-          <w:sz w:val="16"/>
-          <w:szCs w:val="16"/>
-          <w:lang w:val="en-US"/>
-        </w:rPr>
-        <w:tab/>
-      </w:r>
-      <w:r>
-        <w:rPr>
-          <w:rFonts w:ascii="Consolas" w:hAnsi="Consolas"/>
-          <w:sz w:val="16"/>
-          <w:szCs w:val="16"/>
-          <w:lang w:val="en-US"/>
-        </w:rPr>
-        <w:tab/>
-      </w:r>
-      <w:r>
-        <w:rPr>
-          <w:rFonts w:ascii="Consolas" w:hAnsi="Consolas"/>
-          <w:sz w:val="16"/>
-          <w:szCs w:val="16"/>
-          <w:lang w:val="en-US"/>
-        </w:rPr>
-        <w:tab/>
-        <w:t>&lt;groupId&gt;org.docx4j&lt;/groupId&gt;</w:t>
-      </w:r>
-    </w:p>
-    <w:p>
-      <w:pPr>
-        <w:spacing w:after="0"/>
-        <w:rPr>
-          <w:rFonts w:ascii="Consolas" w:hAnsi="Consolas"/>
-          <w:sz w:val="16"/>
-          <w:szCs w:val="16"/>
-          <w:lang w:val="en-US"/>
-        </w:rPr>
-      </w:pPr>
-      <w:r>
-        <w:rPr>
-          <w:rFonts w:ascii="Consolas" w:hAnsi="Consolas"/>
-          <w:sz w:val="16"/>
-          <w:szCs w:val="16"/>
-          <w:lang w:val="en-US"/>
-        </w:rPr>
-        <w:tab/>
-      </w:r>
-      <w:r>
-        <w:rPr>
-          <w:rFonts w:ascii="Consolas" w:hAnsi="Consolas"/>
-          <w:sz w:val="16"/>
-          <w:szCs w:val="16"/>
-          <w:lang w:val="en-US"/>
-        </w:rPr>
-        <w:tab/>
-      </w:r>
-      <w:r>
-        <w:rPr>
-          <w:rFonts w:ascii="Consolas" w:hAnsi="Consolas"/>
-          <w:sz w:val="16"/>
-          <w:szCs w:val="16"/>
-          <w:lang w:val="en-US"/>
-        </w:rPr>
-        <w:tab/>
-        <w:t>&lt;artifactId&gt;</w:t>
-      </w:r>
-      <w:r>
-        <w:rPr>
-          <w:rFonts w:ascii="Consolas" w:hAnsi="Consolas"/>
-          <w:b/>
-          <w:sz w:val="16"/>
-          <w:szCs w:val="16"/>
-          <w:lang w:val="en-US"/>
-        </w:rPr>
-        <w:t>docx4j-JAXB-</w:t>
-      </w:r>
-      <w:r>
-        <w:rPr>
-          <w:rFonts w:ascii="Consolas" w:hAnsi="Consolas"/>
-          <w:b/>
-          <w:sz w:val="16"/>
-          <w:szCs w:val="16"/>
-          <w:u w:val="single"/>
-          <w:lang w:val="en-US"/>
-        </w:rPr>
-        <w:t>Internal</w:t>
-      </w:r>
-      <w:r>
-        <w:rPr>
-          <w:rFonts w:ascii="Consolas" w:hAnsi="Consolas"/>
-          <w:sz w:val="16"/>
-          <w:szCs w:val="16"/>
-          <w:lang w:val="en-US"/>
-        </w:rPr>
-        <w:t>&lt;/artifactId&gt;</w:t>
-      </w:r>
-    </w:p>
-    <w:p>
-      <w:pPr>
-        <w:spacing w:after="0"/>
-        <w:rPr>
-          <w:rFonts w:ascii="Consolas" w:hAnsi="Consolas"/>
-          <w:sz w:val="16"/>
-          <w:szCs w:val="16"/>
-          <w:lang w:val="en-US"/>
-        </w:rPr>
-      </w:pPr>
-      <w:r>
-        <w:rPr>
-          <w:rFonts w:ascii="Consolas" w:hAnsi="Consolas"/>
-          <w:sz w:val="16"/>
-          <w:szCs w:val="16"/>
-          <w:lang w:val="en-US"/>
-        </w:rPr>
-        <w:tab/>
-      </w:r>
-      <w:r>
-        <w:rPr>
-          <w:rFonts w:ascii="Consolas" w:hAnsi="Consolas"/>
-          <w:sz w:val="16"/>
-          <w:szCs w:val="16"/>
-          <w:lang w:val="en-US"/>
-        </w:rPr>
-        <w:tab/>
-      </w:r>
-      <w:r>
-        <w:rPr>
-          <w:rFonts w:ascii="Consolas" w:hAnsi="Consolas"/>
-          <w:sz w:val="16"/>
-          <w:szCs w:val="16"/>
-          <w:lang w:val="en-US"/>
-        </w:rPr>
-        <w:tab/>
-        <w:t>&lt;version&gt;</w:t>
-      </w:r>
-      <w:r>
-        <w:rPr>
-          <w:rFonts w:ascii="Consolas" w:hAnsi="Consolas"/>
-          <w:sz w:val="16"/>
-          <w:szCs w:val="16"/>
-          <w:lang w:val="en-US"/>
-        </w:rPr>
-        <w:t>8.3.</w:t>
-      </w:r>
-      <w:r>
-        <w:rPr>
-          <w:rFonts w:ascii="Consolas" w:hAnsi="Consolas"/>
-          <w:sz w:val="16"/>
-          <w:szCs w:val="16"/>
-          <w:lang w:val="en-US"/>
-        </w:rPr>
-        <w:t>15</w:t>
-      </w:r>
-      <w:r>
-        <w:rPr>
-          <w:rFonts w:ascii="Consolas" w:hAnsi="Consolas"/>
-          <w:sz w:val="16"/>
-          <w:szCs w:val="16"/>
-          <w:lang w:val="en-US"/>
-        </w:rPr>
-        <w:t>&lt;/version&gt;</w:t>
-      </w:r>
-    </w:p>
-    <w:p>
-      <w:pPr>
-        <w:spacing w:after="0"/>
-        <w:rPr>
-          <w:rFonts w:ascii="Consolas" w:hAnsi="Consolas"/>
-          <w:sz w:val="16"/>
-          <w:szCs w:val="16"/>
-          <w:lang w:val="en-US"/>
-        </w:rPr>
-      </w:pPr>
-      <w:r>
-        <w:rPr>
-          <w:rFonts w:ascii="Consolas" w:hAnsi="Consolas"/>
-          <w:sz w:val="16"/>
-          <w:szCs w:val="16"/>
-          <w:lang w:val="en-US"/>
-        </w:rPr>
-        <w:tab/>
-      </w:r>
-      <w:r>
-        <w:rPr>
-          <w:rFonts w:ascii="Consolas" w:hAnsi="Consolas"/>
-          <w:sz w:val="16"/>
-          <w:szCs w:val="16"/>
-          <w:lang w:val="en-US"/>
-        </w:rPr>
-        <w:tab/>
-        <w:t>&lt;/dependency&gt;</w:t>
-      </w:r>
-    </w:p>
-    <w:p>
-      <w:pPr>
-        <w:spacing w:after="0"/>
-        <w:rPr>
-          <w:rFonts w:ascii="Consolas" w:hAnsi="Consolas"/>
-          <w:sz w:val="16"/>
-          <w:szCs w:val="16"/>
-          <w:lang w:val="en-US"/>
-        </w:rPr>
-      </w:pPr>
-      <w:r>
-        <w:rPr>
-          <w:rFonts w:ascii="Consolas" w:hAnsi="Consolas"/>
-          <w:sz w:val="16"/>
-          <w:szCs w:val="16"/>
-          <w:lang w:val="en-US"/>
-        </w:rPr>
-        <w:tab/>
-      </w:r>
-      <w:r>
-        <w:rPr>
-          <w:rFonts w:ascii="Consolas" w:hAnsi="Consolas"/>
-          <w:sz w:val="16"/>
-          <w:szCs w:val="16"/>
-          <w:lang w:val="en-US"/>
-        </w:rPr>
-        <w:tab/>
-      </w:r>
-    </w:p>
-    <w:p>
-      <w:pPr>
-        <w:spacing w:after="0"/>
-        <w:rPr>
-          <w:rFonts w:ascii="Consolas" w:hAnsi="Consolas"/>
-          <w:sz w:val="16"/>
-          <w:szCs w:val="16"/>
-          <w:lang w:val="en-US"/>
-        </w:rPr>
-      </w:pPr>
-      <w:r>
-        <w:rPr>
-          <w:rFonts w:ascii="Consolas" w:hAnsi="Consolas"/>
-          <w:sz w:val="16"/>
-          <w:szCs w:val="16"/>
-          <w:lang w:val="en-US"/>
-        </w:rPr>
-        <w:tab/>
-      </w:r>
-      <w:r>
-        <w:rPr>
-          <w:rFonts w:ascii="Consolas" w:hAnsi="Consolas"/>
-          <w:sz w:val="16"/>
-          <w:szCs w:val="16"/>
-          <w:lang w:val="en-US"/>
-        </w:rPr>
-        <w:tab/>
-        <w:t>&lt;!-- use the JAXB Reference Implementation --&gt;</w:t>
-      </w:r>
-    </w:p>
-    <w:p>
-      <w:pPr>
-        <w:spacing w:after="0"/>
-        <w:rPr>
-          <w:rFonts w:ascii="Consolas" w:hAnsi="Consolas"/>
-          <w:sz w:val="16"/>
-          <w:szCs w:val="16"/>
-          <w:lang w:val="en-US"/>
-        </w:rPr>
-      </w:pPr>
-      <w:r>
-        <w:rPr>
-          <w:rFonts w:ascii="Consolas" w:hAnsi="Consolas"/>
-          <w:sz w:val="16"/>
-          <w:szCs w:val="16"/>
-          <w:lang w:val="en-US"/>
-        </w:rPr>
-        <w:tab/>
-      </w:r>
-      <w:r>
-        <w:rPr>
-          <w:rFonts w:ascii="Consolas" w:hAnsi="Consolas"/>
-          <w:sz w:val="16"/>
-          <w:szCs w:val="16"/>
-          <w:lang w:val="en-US"/>
-        </w:rPr>
-        <w:tab/>
-        <w:t>&lt;dependency&gt;</w:t>
-      </w:r>
-    </w:p>
-    <w:p>
-      <w:pPr>
-        <w:spacing w:after="0"/>
-        <w:rPr>
-          <w:rFonts w:ascii="Consolas" w:hAnsi="Consolas"/>
-          <w:sz w:val="16"/>
-          <w:szCs w:val="16"/>
-          <w:lang w:val="en-US"/>
-        </w:rPr>
-      </w:pPr>
-      <w:r>
-        <w:rPr>
-          <w:rFonts w:ascii="Consolas" w:hAnsi="Consolas"/>
-          <w:sz w:val="16"/>
-          <w:szCs w:val="16"/>
-          <w:lang w:val="en-US"/>
-        </w:rPr>
-        <w:tab/>
-      </w:r>
-      <w:r>
-        <w:rPr>
-          <w:rFonts w:ascii="Consolas" w:hAnsi="Consolas"/>
-          <w:sz w:val="16"/>
-          <w:szCs w:val="16"/>
-          <w:lang w:val="en-US"/>
-        </w:rPr>
-        <w:tab/>
-      </w:r>
-      <w:r>
-        <w:rPr>
-          <w:rFonts w:ascii="Consolas" w:hAnsi="Consolas"/>
-          <w:sz w:val="16"/>
-          <w:szCs w:val="16"/>
-          <w:lang w:val="en-US"/>
-        </w:rPr>
-        <w:tab/>
-        <w:t>&lt;groupId&gt;org.docx4j&lt;/groupId&gt;</w:t>
-      </w:r>
-    </w:p>
-    <w:p>
-      <w:pPr>
-        <w:spacing w:after="0"/>
-        <w:rPr>
-          <w:rFonts w:ascii="Consolas" w:hAnsi="Consolas"/>
-          <w:sz w:val="16"/>
-          <w:szCs w:val="16"/>
-          <w:lang w:val="en-US"/>
-        </w:rPr>
-      </w:pPr>
-      <w:r>
-        <w:rPr>
-          <w:rFonts w:ascii="Consolas" w:hAnsi="Consolas"/>
-          <w:sz w:val="16"/>
-          <w:szCs w:val="16"/>
-          <w:lang w:val="en-US"/>
-        </w:rPr>
-        <w:tab/>
-      </w:r>
-      <w:r>
-        <w:rPr>
-          <w:rFonts w:ascii="Consolas" w:hAnsi="Consolas"/>
-          <w:sz w:val="16"/>
-          <w:szCs w:val="16"/>
-          <w:lang w:val="en-US"/>
-        </w:rPr>
-        <w:tab/>
-      </w:r>
-      <w:r>
-        <w:rPr>
-          <w:rFonts w:ascii="Consolas" w:hAnsi="Consolas"/>
-          <w:sz w:val="16"/>
-          <w:szCs w:val="16"/>
-          <w:lang w:val="en-US"/>
-        </w:rPr>
-        <w:tab/>
-        <w:t>&lt;artifactId&gt;</w:t>
-      </w:r>
-      <w:r>
-        <w:rPr>
-          <w:rFonts w:ascii="Consolas" w:hAnsi="Consolas"/>
-          <w:b/>
-          <w:sz w:val="16"/>
-          <w:szCs w:val="16"/>
-          <w:lang w:val="en-US"/>
-        </w:rPr>
-        <w:t>docx4j-JAXB-</w:t>
-      </w:r>
-      <w:r>
-        <w:rPr>
-          <w:rFonts w:ascii="Consolas" w:hAnsi="Consolas"/>
-          <w:b/>
-          <w:sz w:val="16"/>
-          <w:szCs w:val="16"/>
-          <w:u w:val="single"/>
-          <w:lang w:val="en-US"/>
-        </w:rPr>
-        <w:t>ReferenceImpl</w:t>
-      </w:r>
-      <w:r>
-        <w:rPr>
-          <w:rFonts w:ascii="Consolas" w:hAnsi="Consolas"/>
-          <w:sz w:val="16"/>
-          <w:szCs w:val="16"/>
-          <w:lang w:val="en-US"/>
-        </w:rPr>
-        <w:t>&lt;/artifactId&gt;</w:t>
-      </w:r>
-    </w:p>
-    <w:p>
-      <w:pPr>
-        <w:spacing w:after="0"/>
-        <w:rPr>
-          <w:rFonts w:ascii="Consolas" w:hAnsi="Consolas"/>
-          <w:sz w:val="16"/>
-          <w:szCs w:val="16"/>
-          <w:lang w:val="en-US"/>
-        </w:rPr>
-      </w:pPr>
-      <w:r>
-        <w:rPr>
-          <w:rFonts w:ascii="Consolas" w:hAnsi="Consolas"/>
-          <w:sz w:val="16"/>
-          <w:szCs w:val="16"/>
-          <w:lang w:val="en-US"/>
-        </w:rPr>
-        <w:tab/>
-      </w:r>
-      <w:r>
-        <w:rPr>
-          <w:rFonts w:ascii="Consolas" w:hAnsi="Consolas"/>
-          <w:sz w:val="16"/>
-          <w:szCs w:val="16"/>
-          <w:lang w:val="en-US"/>
-        </w:rPr>
-        <w:tab/>
-      </w:r>
-      <w:r>
-        <w:rPr>
-          <w:rFonts w:ascii="Consolas" w:hAnsi="Consolas"/>
-          <w:sz w:val="16"/>
-          <w:szCs w:val="16"/>
-          <w:lang w:val="en-US"/>
-        </w:rPr>
-        <w:tab/>
-        <w:t>&lt;version&gt;</w:t>
-      </w:r>
-      <w:r>
-        <w:rPr>
-          <w:rFonts w:ascii="Consolas" w:hAnsi="Consolas"/>
-          <w:sz w:val="16"/>
-          <w:szCs w:val="16"/>
-          <w:lang w:val="en-US"/>
-        </w:rPr>
-        <w:t>8.3.15</w:t>
-      </w:r>
-      <w:r>
-        <w:rPr>
-          <w:rFonts w:ascii="Consolas" w:hAnsi="Consolas"/>
-          <w:sz w:val="16"/>
-          <w:szCs w:val="16"/>
-          <w:lang w:val="en-US"/>
-        </w:rPr>
-        <w:t>&lt;/version&gt;</w:t>
-      </w:r>
-    </w:p>
-    <w:p>
-      <w:pPr>
-        <w:spacing w:after="0"/>
-        <w:rPr>
-          <w:rFonts w:ascii="Consolas" w:hAnsi="Consolas"/>
-          <w:sz w:val="16"/>
-          <w:szCs w:val="16"/>
-          <w:lang w:val="en-US"/>
-        </w:rPr>
-      </w:pPr>
-      <w:r>
-        <w:rPr>
-          <w:rFonts w:ascii="Consolas" w:hAnsi="Consolas"/>
-          <w:sz w:val="16"/>
-          <w:szCs w:val="16"/>
-          <w:lang w:val="en-US"/>
-        </w:rPr>
-        <w:tab/>
-      </w:r>
-      <w:r>
-        <w:rPr>
-          <w:rFonts w:ascii="Consolas" w:hAnsi="Consolas"/>
-          <w:sz w:val="16"/>
-          <w:szCs w:val="16"/>
-          <w:lang w:val="en-US"/>
-        </w:rPr>
-        <w:tab/>
-        <w:t>&lt;/dependency&gt;</w:t>
-      </w:r>
-    </w:p>
-    <w:p>
-      <w:pPr>
-        <w:spacing w:after="0"/>
-        <w:rPr>
-          <w:rFonts w:ascii="Consolas" w:hAnsi="Consolas"/>
-          <w:sz w:val="16"/>
-          <w:szCs w:val="16"/>
-          <w:lang w:val="en-US"/>
-        </w:rPr>
-      </w:pPr>
-      <w:r>
-        <w:rPr>
-          <w:rFonts w:ascii="Consolas" w:hAnsi="Consolas"/>
-          <w:sz w:val="16"/>
-          <w:szCs w:val="16"/>
-          <w:lang w:val="en-US"/>
-        </w:rPr>
-        <w:tab/>
-      </w:r>
-      <w:r>
-        <w:rPr>
-          <w:rFonts w:ascii="Consolas" w:hAnsi="Consolas"/>
-          <w:sz w:val="16"/>
-          <w:szCs w:val="16"/>
-          <w:lang w:val="en-US"/>
-        </w:rPr>
-        <w:tab/>
-      </w:r>
-    </w:p>
-    <w:p>
-      <w:pPr>
-        <w:spacing w:after="0"/>
-        <w:rPr>
-          <w:rFonts w:ascii="Consolas" w:hAnsi="Consolas"/>
-          <w:sz w:val="16"/>
-          <w:szCs w:val="16"/>
-          <w:lang w:val="en-US"/>
-        </w:rPr>
-      </w:pPr>
-      <w:r>
-        <w:rPr>
-          <w:rFonts w:ascii="Consolas" w:hAnsi="Consolas"/>
-          <w:sz w:val="16"/>
-          <w:szCs w:val="16"/>
-          <w:lang w:val="en-US"/>
-        </w:rPr>
-        <w:tab/>
-      </w:r>
-      <w:r>
-        <w:rPr>
-          <w:rFonts w:ascii="Consolas" w:hAnsi="Consolas"/>
-          <w:sz w:val="16"/>
-          <w:szCs w:val="16"/>
-          <w:lang w:val="en-US"/>
-        </w:rPr>
-        <w:tab/>
-        <w:t>&lt;!-- use the MOXy JAXB implementation --&gt;</w:t>
-      </w:r>
-    </w:p>
-    <w:p>
-      <w:pPr>
-        <w:spacing w:after="0"/>
-        <w:rPr>
-          <w:rFonts w:ascii="Consolas" w:hAnsi="Consolas"/>
-          <w:sz w:val="16"/>
-          <w:szCs w:val="16"/>
-          <w:lang w:val="en-US"/>
-        </w:rPr>
-      </w:pPr>
-      <w:r>
-        <w:rPr>
-          <w:rFonts w:ascii="Consolas" w:hAnsi="Consolas"/>
-          <w:sz w:val="16"/>
-          <w:szCs w:val="16"/>
-          <w:lang w:val="en-US"/>
-        </w:rPr>
-        <w:tab/>
-      </w:r>
-      <w:r>
-        <w:rPr>
-          <w:rFonts w:ascii="Consolas" w:hAnsi="Consolas"/>
-          <w:sz w:val="16"/>
-          <w:szCs w:val="16"/>
-          <w:lang w:val="en-US"/>
-        </w:rPr>
-        <w:tab/>
-        <w:t>&lt;dependency&gt;</w:t>
-      </w:r>
-    </w:p>
-    <w:p>
-      <w:pPr>
-        <w:spacing w:after="0"/>
-        <w:rPr>
-          <w:rFonts w:ascii="Consolas" w:hAnsi="Consolas"/>
-          <w:sz w:val="16"/>
-          <w:szCs w:val="16"/>
-          <w:lang w:val="en-US"/>
-        </w:rPr>
-      </w:pPr>
-      <w:r>
-        <w:rPr>
-          <w:rFonts w:ascii="Consolas" w:hAnsi="Consolas"/>
-          <w:sz w:val="16"/>
-          <w:szCs w:val="16"/>
-          <w:lang w:val="en-US"/>
-        </w:rPr>
-        <w:tab/>
-      </w:r>
-      <w:r>
-        <w:rPr>
-          <w:rFonts w:ascii="Consolas" w:hAnsi="Consolas"/>
-          <w:sz w:val="16"/>
-          <w:szCs w:val="16"/>
-          <w:lang w:val="en-US"/>
-        </w:rPr>
-        <w:tab/>
-      </w:r>
-      <w:r>
-        <w:rPr>
-          <w:rFonts w:ascii="Consolas" w:hAnsi="Consolas"/>
-          <w:sz w:val="16"/>
-          <w:szCs w:val="16"/>
-          <w:lang w:val="en-US"/>
-        </w:rPr>
-        <w:tab/>
-        <w:t>&lt;groupId&gt;org.docx4j&lt;/groupId&gt;</w:t>
-      </w:r>
-    </w:p>
-    <w:p>
-      <w:pPr>
-        <w:spacing w:after="0"/>
-        <w:rPr>
-          <w:rFonts w:ascii="Consolas" w:hAnsi="Consolas"/>
-          <w:sz w:val="16"/>
-          <w:szCs w:val="16"/>
-          <w:lang w:val="en-US"/>
-        </w:rPr>
-      </w:pPr>
-      <w:r>
-        <w:rPr>
-          <w:rFonts w:ascii="Consolas" w:hAnsi="Consolas"/>
-          <w:sz w:val="16"/>
-          <w:szCs w:val="16"/>
-          <w:lang w:val="en-US"/>
-        </w:rPr>
-        <w:tab/>
-      </w:r>
-      <w:r>
-        <w:rPr>
-          <w:rFonts w:ascii="Consolas" w:hAnsi="Consolas"/>
-          <w:sz w:val="16"/>
-          <w:szCs w:val="16"/>
-          <w:lang w:val="en-US"/>
-        </w:rPr>
-        <w:tab/>
-      </w:r>
-      <w:r>
-        <w:rPr>
-          <w:rFonts w:ascii="Consolas" w:hAnsi="Consolas"/>
-          <w:sz w:val="16"/>
-          <w:szCs w:val="16"/>
-          <w:lang w:val="en-US"/>
-        </w:rPr>
-        <w:tab/>
-        <w:t>&lt;artifactId&gt;</w:t>
-      </w:r>
-      <w:r>
-        <w:rPr>
-          <w:rFonts w:ascii="Consolas" w:hAnsi="Consolas"/>
-          <w:b/>
-          <w:sz w:val="16"/>
-          <w:szCs w:val="16"/>
-          <w:lang w:val="en-US"/>
-        </w:rPr>
-        <w:t>docx4j-JAXB-</w:t>
-      </w:r>
-      <w:r>
-        <w:rPr>
-          <w:rFonts w:ascii="Consolas" w:hAnsi="Consolas"/>
-          <w:b/>
-          <w:sz w:val="16"/>
-          <w:szCs w:val="16"/>
-          <w:u w:val="single"/>
-          <w:lang w:val="en-US"/>
-        </w:rPr>
-        <w:t>MOXy</w:t>
-      </w:r>
-      <w:r>
-        <w:rPr>
-          <w:rFonts w:ascii="Consolas" w:hAnsi="Consolas"/>
-          <w:sz w:val="16"/>
-          <w:szCs w:val="16"/>
-          <w:lang w:val="en-US"/>
-        </w:rPr>
-        <w:t>&lt;/artifactId&gt;</w:t>
-      </w:r>
-    </w:p>
-    <w:p>
-      <w:pPr>
-        <w:spacing w:after="0"/>
-        <w:rPr>
-          <w:rFonts w:ascii="Consolas" w:hAnsi="Consolas"/>
-          <w:sz w:val="16"/>
-          <w:szCs w:val="16"/>
-          <w:lang w:val="en-US"/>
-        </w:rPr>
-      </w:pPr>
-      <w:r>
-        <w:rPr>
-          <w:rFonts w:ascii="Consolas" w:hAnsi="Consolas"/>
-          <w:sz w:val="16"/>
-          <w:szCs w:val="16"/>
-          <w:lang w:val="en-US"/>
-        </w:rPr>
-        <w:tab/>
-      </w:r>
-      <w:r>
-        <w:rPr>
-          <w:rFonts w:ascii="Consolas" w:hAnsi="Consolas"/>
-          <w:sz w:val="16"/>
-          <w:szCs w:val="16"/>
-          <w:lang w:val="en-US"/>
-        </w:rPr>
-        <w:tab/>
-      </w:r>
-      <w:r>
-        <w:rPr>
-          <w:rFonts w:ascii="Consolas" w:hAnsi="Consolas"/>
-          <w:sz w:val="16"/>
-          <w:szCs w:val="16"/>
-          <w:lang w:val="en-US"/>
-        </w:rPr>
-        <w:tab/>
-        <w:t>&lt;version&gt;</w:t>
-      </w:r>
-      <w:r>
-        <w:rPr>
-          <w:rFonts w:ascii="Consolas" w:hAnsi="Consolas"/>
-          <w:sz w:val="16"/>
-          <w:szCs w:val="16"/>
-          <w:lang w:val="en-US"/>
-        </w:rPr>
-        <w:t>8.3.15</w:t>
-      </w:r>
-      <w:r>
-        <w:rPr>
-          <w:rFonts w:ascii="Consolas" w:hAnsi="Consolas"/>
-          <w:sz w:val="16"/>
-          <w:szCs w:val="16"/>
-          <w:lang w:val="en-US"/>
-        </w:rPr>
-        <w:t>&lt;/version&gt;</w:t>
-      </w:r>
-    </w:p>
-    <w:p>
-      <w:pPr>
-        <w:spacing w:after="0"/>
-        <w:rPr>
-          <w:rFonts w:ascii="Consolas" w:hAnsi="Consolas"/>
-          <w:sz w:val="16"/>
-          <w:szCs w:val="16"/>
-          <w:lang w:val="en-US"/>
-        </w:rPr>
-      </w:pPr>
-      <w:r>
-        <w:rPr>
-          <w:rFonts w:ascii="Consolas" w:hAnsi="Consolas"/>
-          <w:sz w:val="16"/>
-          <w:szCs w:val="16"/>
-          <w:lang w:val="en-US"/>
-        </w:rPr>
-        <w:tab/>
-      </w:r>
-      <w:r>
-        <w:rPr>
-          <w:rFonts w:ascii="Consolas" w:hAnsi="Consolas"/>
-          <w:sz w:val="16"/>
-          <w:szCs w:val="16"/>
-          <w:lang w:val="en-US"/>
-        </w:rPr>
-        <w:tab/>
-        <w:t>&lt;/dependency&gt;</w:t>
-      </w:r>
-    </w:p>
-    <w:p>
-      <w:pPr>
-        <w:spacing w:after="0"/>
-        <w:rPr>
-          <w:rFonts w:ascii="Consolas" w:hAnsi="Consolas"/>
-          <w:sz w:val="16"/>
-          <w:szCs w:val="16"/>
           <w:lang w:val="en-US"/>
         </w:rPr>
       </w:pPr>
@@ -8621,6 +7696,7 @@
       </w:pPr>
       <w:bookmarkStart w:id="11" w:name="_Toc217200698"/>
       <w:r>
+        <w:lastRenderedPageBreak/>
         <w:t>docx4j dependencies</w:t>
       </w:r>
       <w:bookmarkEnd w:id="11"/>
@@ -8710,7 +7786,6 @@
     </w:p>
     <w:p>
       <w:r>
-        <w:lastRenderedPageBreak/>
         <w:t>So you need the slf4j api jar on your classpath</w:t>
       </w:r>
       <w:r>
@@ -9291,7 +8366,21 @@
           <w:rFonts w:eastAsia="Times New Roman" w:cstheme="minorHAnsi"/>
           <w:color w:val="000000"/>
         </w:rPr>
-        <w:t>For docx4j v11.4, the version property should be:</w:t>
+        <w:t>For docx4j v11.4</w:t>
+      </w:r>
+      <w:r>
+        <w:rPr>
+          <w:rFonts w:eastAsia="Times New Roman" w:cstheme="minorHAnsi"/>
+          <w:color w:val="000000"/>
+        </w:rPr>
+        <w:t xml:space="preserve"> on</w:t>
+      </w:r>
+      <w:r>
+        <w:rPr>
+          <w:rFonts w:eastAsia="Times New Roman" w:cstheme="minorHAnsi"/>
+          <w:color w:val="000000"/>
+        </w:rPr>
+        <w:t>, the version property should be:</w:t>
       </w:r>
     </w:p>
     <w:p>
@@ -9320,7 +8409,25 @@
           <w:szCs w:val="19"/>
         </w:rPr>
         <w:tab/>
-        <w:t>&lt;version.logback-classic&gt;1.3.0-alpha14&lt;/version.logback-classic&gt;</w:t>
+        <w:t>&lt;version.logback-classic&gt;1.</w:t>
+      </w:r>
+      <w:r>
+        <w:rPr>
+          <w:rFonts w:ascii="Consolas" w:eastAsia="Times New Roman" w:hAnsi="Consolas" w:cs="Times New Roman"/>
+          <w:color w:val="000000"/>
+          <w:sz w:val="19"/>
+          <w:szCs w:val="19"/>
+        </w:rPr>
+        <w:t>5.19</w:t>
+      </w:r>
+      <w:r>
+        <w:rPr>
+          <w:rFonts w:ascii="Consolas" w:eastAsia="Times New Roman" w:hAnsi="Consolas" w:cs="Times New Roman"/>
+          <w:color w:val="000000"/>
+          <w:sz w:val="19"/>
+          <w:szCs w:val="19"/>
+        </w:rPr>
+        <w:t>&lt;/version.logback-classic&gt;</w:t>
       </w:r>
     </w:p>
     <w:p>
@@ -9411,6 +8518,7 @@
     </w:p>
     <w:p>
       <w:r>
+        <w:lastRenderedPageBreak/>
         <w:t>In your development environment, you can do this using Maven, or by physically copying them all to your classpath.</w:t>
       </w:r>
     </w:p>
@@ -9453,7 +8561,6 @@
     </w:p>
     <w:p>
       <w:r>
-        <w:lastRenderedPageBreak/>
         <w:t xml:space="preserve">We accept pull requests; pull requests are presumed to be contributions under ASLv2 per our contributor agreement.  </w:t>
       </w:r>
     </w:p>
@@ -9622,6 +8729,7 @@
     </w:p>
     <w:p>
       <w:r>
+        <w:lastRenderedPageBreak/>
         <w:t>compiler version &amp; system library:</w:t>
       </w:r>
     </w:p>
@@ -9672,7 +8780,6 @@
     </w:p>
     <w:p>
       <w:r>
-        <w:lastRenderedPageBreak/>
         <w:t>The project should now be working in Eclipse without errors</w:t>
       </w:r>
       <w:r>
@@ -9979,6 +9086,7 @@
         <w:spacing w:before="100" w:beforeAutospacing="1" w:after="100" w:afterAutospacing="1" w:line="240" w:lineRule="auto"/>
       </w:pPr>
       <w:r>
+        <w:lastRenderedPageBreak/>
         <w:t>And similarly for xlsx files.</w:t>
       </w:r>
     </w:p>
@@ -9988,7 +9096,6 @@
       </w:pPr>
       <w:bookmarkStart w:id="21" w:name="_Toc217200708"/>
       <w:r>
-        <w:lastRenderedPageBreak/>
         <w:t>OpenXML</w:t>
       </w:r>
       <w:r>
@@ -10316,6 +9423,7 @@
           <w:rFonts w:cs="Arial"/>
           <w:color w:val="000000"/>
         </w:rPr>
+        <w:lastRenderedPageBreak/>
         <w:t>and subsequently .. by the</w:t>
       </w:r>
       <w:r>
@@ -10431,7 +9539,6 @@
         </w:rPr>
       </w:pPr>
       <w:r>
-        <w:lastRenderedPageBreak/>
         <w:t xml:space="preserve">The Ecma-376.htm link also contains the 2nd edition documents (of Dec 2008), which are </w:t>
       </w:r>
       <w:r>
@@ -10913,6 +10020,7 @@
         </w:numPr>
       </w:pPr>
       <w:r>
+        <w:lastRenderedPageBreak/>
         <w:t xml:space="preserve">Parts are generally subclasses of </w:t>
       </w:r>
       <w:r>
@@ -10950,9 +10058,6 @@
       </w:r>
       <w:r>
         <w:br/>
-      </w:r>
-      <w:r>
-        <w:lastRenderedPageBreak/>
         <w:t xml:space="preserve">This (the </w:t>
       </w:r>
       <w:r>
@@ -26834,19 +25939,7 @@
         <w:t>Reusing the FopFactory is slightly more efficient and is also consistent with the Apache FOP project’s recommendation. From docx4j 11.5.14, this is therefore the recommended approach.</w:t>
       </w:r>
       <w:r>
-        <w:t xml:space="preserve"> </w:t>
-      </w:r>
-      <w:r>
-        <w:t xml:space="preserve">You should create a FopFactory </w:t>
-      </w:r>
-      <w:r>
-        <w:t xml:space="preserve">as shown above </w:t>
-      </w:r>
-      <w:r>
-        <w:t>when preparing to render the first document</w:t>
-      </w:r>
-      <w:r>
-        <w:t xml:space="preserve"> only, then re-use it.  See </w:t>
+        <w:t xml:space="preserve"> You should create a FopFactory as shown above when preparing to render the first document only, then re-use it.  See </w:t>
       </w:r>
       <w:hyperlink r:id="rId72" w:history="1">
         <w:r>
@@ -34759,7 +33852,6 @@
                 <w:rFonts w:eastAsia="Times New Roman"/>
                 <w:sz w:val="18"/>
               </w:rPr>
-              <w:lastRenderedPageBreak/>
               <w:t>\z</w:t>
             </w:r>
           </w:p>
@@ -48063,6 +47155,119 @@
     </w:lvl>
   </w:abstractNum>
   <w:abstractNum w:abstractNumId="39" w15:restartNumberingAfterBreak="0">
+    <w:nsid w:val="78812C33"/>
+    <w:multiLevelType w:val="hybridMultilevel"/>
+    <w:tmpl w:val="D5DE5F16"/>
+    <w:lvl w:ilvl="0" w:tplc="0C090001">
+      <w:start w:val="1"/>
+      <w:numFmt w:val="bullet"/>
+      <w:lvlText w:val=""/>
+      <w:lvlJc w:val="left"/>
+      <w:pPr>
+        <w:ind w:left="720" w:hanging="360"/>
+      </w:pPr>
+      <w:rPr>
+        <w:rFonts w:ascii="Symbol" w:hAnsi="Symbol" w:hint="default"/>
+      </w:rPr>
+    </w:lvl>
+    <w:lvl w:ilvl="1" w:tplc="0C090003" w:tentative="1">
+      <w:start w:val="1"/>
+      <w:numFmt w:val="bullet"/>
+      <w:lvlText w:val="o"/>
+      <w:lvlJc w:val="left"/>
+      <w:pPr>
+        <w:ind w:left="1440" w:hanging="360"/>
+      </w:pPr>
+      <w:rPr>
+        <w:rFonts w:ascii="Courier New" w:hAnsi="Courier New" w:cs="Courier New" w:hint="default"/>
+      </w:rPr>
+    </w:lvl>
+    <w:lvl w:ilvl="2" w:tplc="0C090005" w:tentative="1">
+      <w:start w:val="1"/>
+      <w:numFmt w:val="bullet"/>
+      <w:lvlText w:val=""/>
+      <w:lvlJc w:val="left"/>
+      <w:pPr>
+        <w:ind w:left="2160" w:hanging="360"/>
+      </w:pPr>
+      <w:rPr>
+        <w:rFonts w:ascii="Wingdings" w:hAnsi="Wingdings" w:hint="default"/>
+      </w:rPr>
+    </w:lvl>
+    <w:lvl w:ilvl="3" w:tplc="0C090001" w:tentative="1">
+      <w:start w:val="1"/>
+      <w:numFmt w:val="bullet"/>
+      <w:lvlText w:val=""/>
+      <w:lvlJc w:val="left"/>
+      <w:pPr>
+        <w:ind w:left="2880" w:hanging="360"/>
+      </w:pPr>
+      <w:rPr>
+        <w:rFonts w:ascii="Symbol" w:hAnsi="Symbol" w:hint="default"/>
+      </w:rPr>
+    </w:lvl>
+    <w:lvl w:ilvl="4" w:tplc="0C090003" w:tentative="1">
+      <w:start w:val="1"/>
+      <w:numFmt w:val="bullet"/>
+      <w:lvlText w:val="o"/>
+      <w:lvlJc w:val="left"/>
+      <w:pPr>
+        <w:ind w:left="3600" w:hanging="360"/>
+      </w:pPr>
+      <w:rPr>
+        <w:rFonts w:ascii="Courier New" w:hAnsi="Courier New" w:cs="Courier New" w:hint="default"/>
+      </w:rPr>
+    </w:lvl>
+    <w:lvl w:ilvl="5" w:tplc="0C090005" w:tentative="1">
+      <w:start w:val="1"/>
+      <w:numFmt w:val="bullet"/>
+      <w:lvlText w:val=""/>
+      <w:lvlJc w:val="left"/>
+      <w:pPr>
+        <w:ind w:left="4320" w:hanging="360"/>
+      </w:pPr>
+      <w:rPr>
+        <w:rFonts w:ascii="Wingdings" w:hAnsi="Wingdings" w:hint="default"/>
+      </w:rPr>
+    </w:lvl>
+    <w:lvl w:ilvl="6" w:tplc="0C090001" w:tentative="1">
+      <w:start w:val="1"/>
+      <w:numFmt w:val="bullet"/>
+      <w:lvlText w:val=""/>
+      <w:lvlJc w:val="left"/>
+      <w:pPr>
+        <w:ind w:left="5040" w:hanging="360"/>
+      </w:pPr>
+      <w:rPr>
+        <w:rFonts w:ascii="Symbol" w:hAnsi="Symbol" w:hint="default"/>
+      </w:rPr>
+    </w:lvl>
+    <w:lvl w:ilvl="7" w:tplc="0C090003" w:tentative="1">
+      <w:start w:val="1"/>
+      <w:numFmt w:val="bullet"/>
+      <w:lvlText w:val="o"/>
+      <w:lvlJc w:val="left"/>
+      <w:pPr>
+        <w:ind w:left="5760" w:hanging="360"/>
+      </w:pPr>
+      <w:rPr>
+        <w:rFonts w:ascii="Courier New" w:hAnsi="Courier New" w:cs="Courier New" w:hint="default"/>
+      </w:rPr>
+    </w:lvl>
+    <w:lvl w:ilvl="8" w:tplc="0C090005" w:tentative="1">
+      <w:start w:val="1"/>
+      <w:numFmt w:val="bullet"/>
+      <w:lvlText w:val=""/>
+      <w:lvlJc w:val="left"/>
+      <w:pPr>
+        <w:ind w:left="6480" w:hanging="360"/>
+      </w:pPr>
+      <w:rPr>
+        <w:rFonts w:ascii="Wingdings" w:hAnsi="Wingdings" w:hint="default"/>
+      </w:rPr>
+    </w:lvl>
+  </w:abstractNum>
+  <w:abstractNum w:abstractNumId="40" w15:restartNumberingAfterBreak="0">
     <w:nsid w:val="7A5D071C"/>
     <w:multiLevelType w:val="hybridMultilevel"/>
     <w:tmpl w:val="054C9616"/>
@@ -48251,7 +47456,7 @@
     <w:abstractNumId w:val="2"/>
   </w:num>
   <w:num w:numId="26" w16cid:durableId="100760455">
-    <w:abstractNumId w:val="39"/>
+    <w:abstractNumId w:val="40"/>
   </w:num>
   <w:num w:numId="27" w16cid:durableId="98062207">
     <w:abstractNumId w:val="17"/>
@@ -48294,6 +47499,9 @@
   </w:num>
   <w:num w:numId="40" w16cid:durableId="1267467256">
     <w:abstractNumId w:val="0"/>
+  </w:num>
+  <w:num w:numId="41" w16cid:durableId="1235971542">
+    <w:abstractNumId w:val="39"/>
   </w:num>
   <w:numIdMacAtCleanup w:val="26"/>
 </w:numbering>
@@ -48697,7 +47905,7 @@
   <w:style w:type="paragraph" w:default="1" w:styleId="Normal">
     <w:name w:val="Normal"/>
     <w:qFormat/>
-    <w:rsid w:val="009A4A0F"/>
+    <w:rsid w:val="003052CB"/>
   </w:style>
   <w:style w:type="paragraph" w:styleId="Heading1">
     <w:name w:val="heading 1"/>
@@ -49621,7 +48829,7 @@
 </file>
 
 <file path=customXml/item2.xml><?xml version="1.0" encoding="utf-8"?>
-<b:Sources xmlns:b="http://schemas.openxmlformats.org/officeDocument/2006/bibliography" xmlns="http://schemas.openxmlformats.org/officeDocument/2006/bibliography" SelectedStyle="\APA.XSL" StyleName="APA"/>
+<mypart/>
 </file>
 
 <file path=customXml/item3.xml><?xml version="1.0" encoding="utf-8"?>
@@ -49633,25 +48841,23 @@
 </file>
 
 <file path=customXml/item5.xml><?xml version="1.0" encoding="utf-8"?>
-<mypart/>
+<b:Sources xmlns:b="http://schemas.openxmlformats.org/officeDocument/2006/bibliography" xmlns="http://schemas.openxmlformats.org/officeDocument/2006/bibliography" SelectedStyle="\APA.XSL" StyleName="APA"/>
 </file>
 
 <file path=customXml/itemProps1.xml><?xml version="1.0" encoding="utf-8"?>
-<ds:datastoreItem xmlns:ds="http://schemas.openxmlformats.org/officeDocument/2006/customXml" ds:itemID="{129E683B-8798-4998-BC5B-3A6285F3BA66}">
+<ds:datastoreItem xmlns:ds="http://schemas.openxmlformats.org/officeDocument/2006/customXml" ds:itemID="{94DA83E4-30CE-4756-BA31-36A424DCCFFE}">
   <ds:schemaRefs/>
 </ds:datastoreItem>
 </file>
 
 <file path=customXml/itemProps2.xml><?xml version="1.0" encoding="utf-8"?>
-<ds:datastoreItem xmlns:ds="http://schemas.openxmlformats.org/officeDocument/2006/customXml" ds:itemID="{F28D3F12-7B11-41F1-95E4-756843F013A3}">
-  <ds:schemaRefs>
-    <ds:schemaRef ds:uri="http://schemas.openxmlformats.org/officeDocument/2006/bibliography"/>
-  </ds:schemaRefs>
+<ds:datastoreItem xmlns:ds="http://schemas.openxmlformats.org/officeDocument/2006/customXml" ds:itemID="{6993F598-74FB-4621-A242-6BA71A88A180}">
+  <ds:schemaRefs/>
 </ds:datastoreItem>
 </file>
 
 <file path=customXml/itemProps3.xml><?xml version="1.0" encoding="utf-8"?>
-<ds:datastoreItem xmlns:ds="http://schemas.openxmlformats.org/officeDocument/2006/customXml" ds:itemID="{6993F598-74FB-4621-A242-6BA71A88A180}">
+<ds:datastoreItem xmlns:ds="http://schemas.openxmlformats.org/officeDocument/2006/customXml" ds:itemID="{129E683B-8798-4998-BC5B-3A6285F3BA66}">
   <ds:schemaRefs/>
 </ds:datastoreItem>
 </file>
@@ -49665,7 +48871,9 @@
 </file>
 
 <file path=customXml/itemProps5.xml><?xml version="1.0" encoding="utf-8"?>
-<ds:datastoreItem xmlns:ds="http://schemas.openxmlformats.org/officeDocument/2006/customXml" ds:itemID="{94DA83E4-30CE-4756-BA31-36A424DCCFFE}">
-  <ds:schemaRefs/>
+<ds:datastoreItem xmlns:ds="http://schemas.openxmlformats.org/officeDocument/2006/customXml" ds:itemID="{F28D3F12-7B11-41F1-95E4-756843F013A3}">
+  <ds:schemaRefs>
+    <ds:schemaRef ds:uri="http://schemas.openxmlformats.org/officeDocument/2006/bibliography"/>
+  </ds:schemaRefs>
 </ds:datastoreItem>
 </file>
</xml_diff>

<commit_message>
Getting Started guide: pointer section for docx4j-mcp
Three-sentence "docx4j for AI agents (MCP)" section after the Markdown
section: what docx4j-mcp is, the clients it serves, and the repo URL.
Deliberately a pointer only - the tool surface is documented in the
docx4j-mcp README, which releases separately.

Co-Authored-By: Claude Fable 5 <noreply@anthropic.com>
Claude-Session: https://claude.ai/code/session_01KNvDdgutG1UJByi9MbxhF4
</commit_message>
<xml_diff>
--- a/docs/Docx4j_GettingStarted.docx
+++ b/docs/Docx4j_GettingStarted.docx
@@ -24621,6 +24621,23 @@
     <w:p>
       <w:r>
         <w:t>To use it, add docx4j-markdown to your classpath, then use the facade methods Docx4J.fromMarkdown and Docx4J.toMarkdown (or MarkdownImporter / MarkdownExporter directly, for options).  See the module README for details.</w:t>
+      </w:r>
+    </w:p>
+    <w:p>
+      <w:pPr>
+        <w:pStyle w:val="Heading1"/>
+        <w:rPr>
+          <w:rFonts w:eastAsia="Times New Roman"/>
+          <w:kern w:val="36"/>
+        </w:rPr>
+      </w:pPr>
+      <w:r>
+        <w:t>docx4j for AI agents (MCP)</w:t>
+      </w:r>
+    </w:p>
+    <w:p>
+      <w:r>
+        <w:t>If you would rather have an AI agent work with your docx files than write Java yourself, docx4j-mcp is a Model Context Protocol server which exposes docx4j’s engine to Claude Desktop, Claude Code, and any other MCP client: reading, converting (Markdown, HTML, PDF) and filling Word documents.  It is developed and released separately; see https://github.com/plutext/docx4j-mcp for setup and the current tool surface.</w:t>
       </w:r>
     </w:p>
     <w:p>

</xml_diff>

<commit_message>
Getting Started guide: "Using an LLM with docx4j" section
Encourages LLM-assisted coding against docx4j (llms.txt, samples as
pattern material, the two classic failure modes: javax imports and
invented merge APIs), LLM-assisted work on docx4j itself (CLAUDE.md,
change requests), and issues/PRs per CONTRIBUTING.md (DCO sign-off,
AI-assistance conditions and Assisted-by: disclosure).  GitHub links
use blob/HEAD so they survive default-branch changes.

Co-Authored-By: Claude Fable 5 <noreply@anthropic.com>
Claude-Session: https://claude.ai/code/session_01KNvDdgutG1UJByi9MbxhF4
</commit_message>
<xml_diff>
--- a/docs/Docx4j_GettingStarted.docx
+++ b/docs/Docx4j_GettingStarted.docx
@@ -24638,6 +24638,33 @@
     <w:p>
       <w:r>
         <w:t>If you would rather have an AI agent work with your docx files than write Java yourself, docx4j-mcp is a Model Context Protocol server which exposes docx4j’s engine to Claude Desktop, Claude Code, and any other MCP client: reading, converting (Markdown, HTML, PDF) and filling Word documents.  It is developed and released separately; see https://github.com/plutext/docx4j-mcp for setup and the current tool surface.</w:t>
+      </w:r>
+    </w:p>
+    <w:p>
+      <w:pPr>
+        <w:pStyle w:val="Heading1"/>
+        <w:rPr>
+          <w:rFonts w:eastAsia="Times New Roman"/>
+          <w:kern w:val="36"/>
+        </w:rPr>
+      </w:pPr>
+      <w:r>
+        <w:t>Using an LLM with docx4j</w:t>
+      </w:r>
+    </w:p>
+    <w:p>
+      <w:r>
+        <w:t>LLMs and coding agents (Claude Code, Copilot, and similar) are good at writing docx4j code, and you should feel free to use them.  Two things help: docx4j’s documentation is available in LLM-friendly form at https://www.docx4java.org/llms.txt, and the docx4j-samples-* modules give an agent working code to pattern-match against.  The classic failure modes to watch for: javax.xml.bind imports (current docx4j uses jakarta.xml.bind – see the Jaxb section above), and invented APIs for merging documents (merging is a commercial extension; see Merging Documents and Presentations below).</w:t>
+      </w:r>
+    </w:p>
+    <w:p>
+      <w:r>
+        <w:t>The docx4j source tree is set up for AI-assisted development too: CLAUDE.md in the repository root (https://github.com/plutext/docx4j/blob/HEAD/CLAUDE.md) orients a coding agent – build commands, module map, architecture – and docs/developer/change-requests/ records the design history that gives an agent (or a human) context for non-trivial changes.  Much of docx4j 17.0.x was built this way.</w:t>
+      </w:r>
+    </w:p>
+    <w:p>
+      <w:r>
+        <w:t>Contributions – including AI-assisted ones – are welcome.  Please do submit issues (a small docx reproducing the problem is worth a thousand words) and pull requests.  See CONTRIBUTING.md (https://github.com/plutext/docx4j/blob/HEAD/CONTRIBUTING.md) for the ground rules: DCO sign-off, and for AI assistance, that you have reviewed and can stand behind the code, and disclose the assistance with an Assisted-by: trailer.</w:t>
       </w:r>
     </w:p>
     <w:p>

</xml_diff>

<commit_message>
Getting Started guide: for 17.0.5; builds on Linux, macOS and Windows; PDF via XSL FO improvements
- the guide is for docx4j 17.0.5 (Java 11+), most of it applying to 11.5.x
- Maven snippets and the 'To use docx4j' line say 17.0.5
- Building from source: docx4j builds on Linux, macOS and Windows, natively on
  Windows from 17.0.5
- docx to PDF via XSL FO: output quality substantially improved in 17.0.5,
  achieved in part by docx4j's own FOP layout managers (on by default, off
  with docx4j.convert.out.fo.wordLayout=false); points at
  docx4j-export-fo/docs/word-layout-rules.md

Co-Authored-By: Claude Fable 5.1 <noreply@anthropic.com>
Claude-Session: https://claude.ai/code/session_01X5GpYdwigELiETnUnwTu5S
</commit_message>
<xml_diff>
--- a/docs/Docx4j_GettingStarted.docx
+++ b/docs/Docx4j_GettingStarted.docx
@@ -1,6 +1,6 @@
 
 <file path=word/document.xml><?xml version="1.0" encoding="utf-8"?>
-<w:document xmlns:w="http://schemas.openxmlformats.org/wordprocessingml/2006/main" xmlns:w14="http://schemas.microsoft.com/office/word/2010/wordml" xmlns:w15="http://schemas.microsoft.com/office/word/2012/wordml" xmlns:r="http://schemas.openxmlformats.org/officeDocument/2006/relationships" xmlns:m="http://schemas.openxmlformats.org/officeDocument/2006/math" xmlns:wp="http://schemas.openxmlformats.org/drawingml/2006/wordprocessingDrawing" xmlns:a="http://schemas.openxmlformats.org/drawingml/2006/main" xmlns:wp14="http://schemas.microsoft.com/office/word/2010/wordprocessingDrawing" xmlns:mc="http://schemas.openxmlformats.org/markup-compatibility/2006" xmlns:a14="http://schemas.microsoft.com/office/drawing/2010/main" xmlns:sl="http://schemas.openxmlformats.org/schemaLibrary/2006/main" xmlns:wne="http://schemas.microsoft.com/office/word/2006/wordml" xmlns:c="http://schemas.openxmlformats.org/drawingml/2006/chart" xmlns:cdr="http://schemas.openxmlformats.org/drawingml/2006/chartDrawing" xmlns:c14="http://schemas.microsoft.com/office/drawing/2007/8/2/chart" xmlns:dgm="http://schemas.openxmlformats.org/drawingml/2006/diagram" xmlns:pic="http://schemas.openxmlformats.org/drawingml/2006/picture" xmlns:xdr="http://schemas.openxmlformats.org/drawingml/2006/spreadsheetDrawing" xmlns:dsp="http://schemas.microsoft.com/office/drawing/2008/diagram" xmlns:o="urn:schemas-microsoft-com:office:office" xmlns:v="urn:schemas-microsoft-com:vml" xmlns:w10="urn:schemas-microsoft-com:office:word" xmlns:xvml="urn:schemas-microsoft-com:office:excel" xmlns:pvml="urn:schemas-microsoft-com:office:powerpoint" xmlns:ns25="urn:docx4j:vml:root" xmlns:cppr="http://schemas.microsoft.com/office/2006/coverPageProps" xmlns:odx="http://opendope.org/xpaths" xmlns:odc="http://opendope.org/conditions" xmlns:odq="http://opendope.org/questions" xmlns:oda="http://opendope.org/answers" xmlns:odi="http://opendope.org/components" xmlns:odgm="http://opendope.org/SmartArt/DataHierarchy" xmlns:b="http://schemas.openxmlformats.org/officeDocument/2006/bibliography" xmlns:msink="http://schemas.microsoft.com/ink/2010/main" xmlns:cdr14="http://schemas.microsoft.com/office/drawing/2010/chartDrawing" xmlns:c15="http://schemas.microsoft.com/office/drawing/2012/chart" xmlns:cs="http://schemas.microsoft.com/office/drawing/2012/chartStyle" xmlns:ns38="http://www.w3.org/1998/Math/MathML" xmlns:ns39="http://www.w3.org/2003/InkML" xmlns:a13cmd="http://schemas.microsoft.com/office/drawing/2013/main/command" xmlns:cx="http://schemas.microsoft.com/office/drawing/2014/chartex" xmlns:c16="http://schemas.microsoft.com/office/drawing/2014/chart" xmlns:dgm1611="http://schemas.microsoft.com/office/drawing/2016/11/diagram" xmlns:c173="http://schemas.microsoft.com/office/drawing/2017/03/chart" xmlns:am3d="http://schemas.microsoft.com/office/drawing/2017/model3d" xmlns:an18="http://schemas.microsoft.com/office/drawing/2018/animation" xmlns:anam3d="http://schemas.microsoft.com/office/drawing/2018/animation/model3d" xmlns:iact="http://schemas.microsoft.com/office/powerpoint/2014/inkAction" xmlns:thm15="http://schemas.microsoft.com/office/thememl/2012/main" xmlns:wps="http://schemas.microsoft.com/office/word/2010/wordprocessingShape" xmlns:wpc="http://schemas.microsoft.com/office/word/2010/wordprocessingCanvas" xmlns:wpg="http://schemas.microsoft.com/office/word/2010/wordprocessingGroup" xmlns:w16se="http://schemas.microsoft.com/office/word/2015/wordml/symex" xmlns:w16cid="http://schemas.microsoft.com/office/word/2016/wordml/cid" xmlns:wetp="http://schemas.microsoft.com/office/webextensions/taskpanes/2010/11" xmlns:we="http://schemas.microsoft.com/office/webextensions/webextension/2010/11" xmlns:comp="http://schemas.openxmlformats.org/drawingml/2006/compatibility" xmlns:lc="http://schemas.openxmlformats.org/drawingml/2006/lockedCanvas" xmlns:dgm14="http://schemas.microsoft.com/office/drawing/2010/diagram" xmlns:a15="http://schemas.microsoft.com/office/drawing/2012/main" xmlns:pic14="http://schemas.microsoft.com/office/drawing/2010/picture" xmlns:c16ac="http://schemas.microsoft.com/office/drawing/2014/chart/ac" xmlns:a16="http://schemas.microsoft.com/office/drawing/2014/main" xmlns:a1611="http://schemas.microsoft.com/office/drawing/2016/11/main" xmlns:dgm1612="http://schemas.microsoft.com/office/drawing/2016/12/diagram" xmlns:a16svg="http://schemas.microsoft.com/office/drawing/2016/SVG/main" xmlns:adec="http://schemas.microsoft.com/office/drawing/2017/decorative" xmlns:a18hc="http://schemas.microsoft.com/office/drawing/2018/hyperlinkcolor" xmlns:wp15="http://schemas.microsoft.com/office/word/2012/wordprocessingDrawing" xmlns:w16cex="http://schemas.microsoft.com/office/word/2018/wordml/cex" xmlns:w16sdtfl="http://schemas.microsoft.com/office/word/2024/wordml/sdtformatlock" xmlns:w16sdtdh="http://schemas.microsoft.com/office/word/2020/wordml/sdtdatahash" xmlns:w16="http://schemas.microsoft.com/office/word/2018/wordml" xmlns:w16du="http://schemas.microsoft.com/office/word/2023/wordml/word16du" mc:Ignorable="w14 w15 w16se w16cid w16 w16cex w16sdtdh w16sdtfl w16du wp14">
+<w:document xmlns:w="http://schemas.openxmlformats.org/wordprocessingml/2006/main" xmlns:w15="http://schemas.microsoft.com/office/word/2012/wordml" xmlns:w14="http://schemas.microsoft.com/office/word/2010/wordml" xmlns:r="http://schemas.openxmlformats.org/officeDocument/2006/relationships" xmlns:m="http://schemas.openxmlformats.org/officeDocument/2006/math" xmlns:wp="http://schemas.openxmlformats.org/drawingml/2006/wordprocessingDrawing" xmlns:a="http://schemas.openxmlformats.org/drawingml/2006/main" xmlns:wp14="http://schemas.microsoft.com/office/word/2010/wordprocessingDrawing" xmlns:mc="http://schemas.openxmlformats.org/markup-compatibility/2006" xmlns:a14="http://schemas.microsoft.com/office/drawing/2010/main" xmlns:sl="http://schemas.openxmlformats.org/schemaLibrary/2006/main" xmlns:wne="http://schemas.microsoft.com/office/word/2006/wordml" xmlns:c="http://schemas.openxmlformats.org/drawingml/2006/chart" xmlns:cdr="http://schemas.openxmlformats.org/drawingml/2006/chartDrawing" xmlns:c14="http://schemas.microsoft.com/office/drawing/2007/8/2/chart" xmlns:dgm="http://schemas.openxmlformats.org/drawingml/2006/diagram" xmlns:pic="http://schemas.openxmlformats.org/drawingml/2006/picture" xmlns:xdr="http://schemas.openxmlformats.org/drawingml/2006/spreadsheetDrawing" xmlns:dsp="http://schemas.microsoft.com/office/drawing/2008/diagram" xmlns:o="urn:schemas-microsoft-com:office:office" xmlns:v="urn:schemas-microsoft-com:vml" xmlns:w10="urn:schemas-microsoft-com:office:word" xmlns:xvml="urn:schemas-microsoft-com:office:excel" xmlns:pvml="urn:schemas-microsoft-com:office:powerpoint" xmlns:ns25="urn:docx4j:vml:root" xmlns:cppr="http://schemas.microsoft.com/office/2006/coverPageProps" xmlns:odx="http://opendope.org/xpaths" xmlns:odc="http://opendope.org/conditions" xmlns:odq="http://opendope.org/questions" xmlns:oda="http://opendope.org/answers" xmlns:odi="http://opendope.org/components" xmlns:odgm="http://opendope.org/SmartArt/DataHierarchy" xmlns:b="http://schemas.openxmlformats.org/officeDocument/2006/bibliography" xmlns:msink="http://schemas.microsoft.com/ink/2010/main" xmlns:cdr14="http://schemas.microsoft.com/office/drawing/2010/chartDrawing" xmlns:c15="http://schemas.microsoft.com/office/drawing/2012/chart" xmlns:cs="http://schemas.microsoft.com/office/drawing/2012/chartStyle" xmlns:ns38="http://www.w3.org/1998/Math/MathML" xmlns:ns39="http://www.w3.org/2003/InkML" xmlns:a13cmd="http://schemas.microsoft.com/office/drawing/2013/main/command" xmlns:cx="http://schemas.microsoft.com/office/drawing/2014/chartex" xmlns:c16="http://schemas.microsoft.com/office/drawing/2014/chart" xmlns:dgm1611="http://schemas.microsoft.com/office/drawing/2016/11/diagram" xmlns:c173="http://schemas.microsoft.com/office/drawing/2017/03/chart" xmlns:am3d="http://schemas.microsoft.com/office/drawing/2017/model3d" xmlns:an18="http://schemas.microsoft.com/office/drawing/2018/animation" xmlns:anam3d="http://schemas.microsoft.com/office/drawing/2018/animation/model3d" xmlns:iact="http://schemas.microsoft.com/office/powerpoint/2014/inkAction" xmlns:thm15="http://schemas.microsoft.com/office/thememl/2012/main" xmlns:wps="http://schemas.microsoft.com/office/word/2010/wordprocessingShape" xmlns:wpc="http://schemas.microsoft.com/office/word/2010/wordprocessingCanvas" xmlns:wpg="http://schemas.microsoft.com/office/word/2010/wordprocessingGroup" xmlns:w16se="http://schemas.microsoft.com/office/word/2015/wordml/symex" xmlns:w16cid="http://schemas.microsoft.com/office/word/2016/wordml/cid" xmlns:wetp="http://schemas.microsoft.com/office/webextensions/taskpanes/2010/11" xmlns:we="http://schemas.microsoft.com/office/webextensions/webextension/2010/11" xmlns:comp="http://schemas.openxmlformats.org/drawingml/2006/compatibility" xmlns:lc="http://schemas.openxmlformats.org/drawingml/2006/lockedCanvas" xmlns:dgm14="http://schemas.microsoft.com/office/drawing/2010/diagram" xmlns:a15="http://schemas.microsoft.com/office/drawing/2012/main" xmlns:pic14="http://schemas.microsoft.com/office/drawing/2010/picture" xmlns:c16ac="http://schemas.microsoft.com/office/drawing/2014/chart/ac" xmlns:a16="http://schemas.microsoft.com/office/drawing/2014/main" xmlns:a1611="http://schemas.microsoft.com/office/drawing/2016/11/main" xmlns:dgm1612="http://schemas.microsoft.com/office/drawing/2016/12/diagram" xmlns:a16svg="http://schemas.microsoft.com/office/drawing/2016/SVG/main" xmlns:adec="http://schemas.microsoft.com/office/drawing/2017/decorative" xmlns:a18hc="http://schemas.microsoft.com/office/drawing/2018/hyperlinkcolor" xmlns:wp15="http://schemas.microsoft.com/office/word/2012/wordprocessingDrawing" xmlns:w16cex="http://schemas.microsoft.com/office/word/2018/wordml/cex" xmlns:w16sdtfl="http://schemas.microsoft.com/office/word/2024/wordml/sdtformatlock" xmlns:w16sdtdh="http://schemas.microsoft.com/office/word/2020/wordml/sdtdatahash" xmlns:w16="http://schemas.microsoft.com/office/word/2018/wordml" xmlns:w16du="http://schemas.microsoft.com/office/word/2023/wordml/word16du" mc:Ignorable="w14 w15 w16se w16cid w16 w16cex w16sdtdh w16sdtfl w16du wp14">
   <w:body>
     <!-- Modified by docx4j 17.0.5-SNAPSHOT (Apache licensed) using REFERENCE JAXB in Arch Linux Java 21.0.12 on Linux -->
     <w:p>
@@ -5437,55 +5437,10 @@
     <w:p/>
     <w:p>
       <w:r>
-        <w:t xml:space="preserve">This guide </w:t>
-      </w:r>
-      <w:r>
-        <w:t>covers</w:t>
-      </w:r>
-      <w:r>
-        <w:t xml:space="preserve"> docx4j </w:t>
-      </w:r>
-      <w:r>
         <w:rPr>
           <w:b/>
         </w:rPr>
-        <w:t>11.</w:t>
-      </w:r>
-      <w:r>
-        <w:rPr>
-          <w:b/>
-        </w:rPr>
-        <w:t>5</w:t>
-      </w:r>
-      <w:r>
-        <w:rPr>
-          <w:b/>
-        </w:rPr>
-        <w:t>.x</w:t>
-      </w:r>
-      <w:r>
-        <w:rPr>
-          <w:b/>
-        </w:rPr>
-        <w:t xml:space="preserve"> </w:t>
-      </w:r>
-      <w:r>
-        <w:rPr>
-          <w:bCs/>
-        </w:rPr>
-        <w:t>and</w:t>
-      </w:r>
-      <w:r>
-        <w:rPr>
-          <w:b/>
-        </w:rPr>
-        <w:t xml:space="preserve"> 17.x</w:t>
-      </w:r>
-      <w:r>
-        <w:t xml:space="preserve">, both of which are for Java 11 and later. </w:t>
-      </w:r>
-      <w:r>
-        <w:t xml:space="preserve">  </w:t>
+        <w:t xml:space="preserve">This guide is for docx4j 17.0.5 (Java 11 and later); most of it applies to 11.5.x as well.   </w:t>
       </w:r>
     </w:p>
     <w:p>
@@ -6760,7 +6715,7 @@
         <w:rPr>
           <w:lang w:val="en-US"/>
         </w:rPr>
-        <w:t xml:space="preserve">To use docx4j 17.0.4, ensure any code references </w:t>
+        <w:t xml:space="preserve">To use docx4j 17.0.5, ensure any code references </w:t>
       </w:r>
       <w:r>
         <w:rPr>
@@ -7024,7 +6979,7 @@
           <w:szCs w:val="16"/>
           <w:lang w:val="en-US"/>
         </w:rPr>
-        <w:t>17.0.4</w:t>
+        <w:t>17.0.5</w:t>
       </w:r>
       <w:r>
         <w:rPr>
@@ -7309,7 +7264,7 @@
           <w:szCs w:val="16"/>
           <w:lang w:val="en-US"/>
         </w:rPr>
-        <w:t>17.0.4</w:t>
+        <w:t>17.0.5</w:t>
       </w:r>
       <w:r>
         <w:rPr>
@@ -8404,6 +8359,11 @@
       </w:r>
       <w:r>
         <w:t xml:space="preserve"> (you probably want to skip down to the next page, to get it working in Eclipse).</w:t>
+      </w:r>
+    </w:p>
+    <w:p>
+      <w:r>
+        <w:t xml:space="preserve">docx4j builds on Linux, macOS and Windows: from 17.0.5, mvn clean install works natively on Windows as well (no WSL or Cygwin needed).</w:t>
       </w:r>
     </w:p>
     <w:p>
@@ -25360,6 +25320,11 @@
     <w:p>
       <w:r>
         <w:t>From 17.0.4, the visitor (non-XSLT) FO exporter is likewise the default (pass Docx4J.FLAG_EXPORT_PREFER_XSL for the XSLT pathway), and equations in the docx are rendered in the PDF, via the JEuclid FOP plugin which docx4j-export-fo now includes.</w:t>
+      </w:r>
+    </w:p>
+    <w:p>
+      <w:r>
+        <w:t xml:space="preserve">PDF output via XSL FO is substantially improved in 17.0.5: line breaking, line height and placement, tab stops, paragraph spacing, list labels, tables, columns, footnotes and kerning now follow the rules Word applies, measured against Word 365. This is achieved in part by the introduction of docx4j's own FOP layout managers (in docx4j-export-fo, on by default; docx4j.convert.out.fo.wordLayout=false restores plain FOP layout). The rules and the switches are documented in docx4j-export-fo/docs/word-layout-rules.md.</w:t>
       </w:r>
     </w:p>
     <w:p>
@@ -48518,11 +48483,11 @@
 </file>
 
 <file path=customXml/item3.xml><?xml version="1.0" encoding="utf-8"?>
-<b:Sources xmlns:w="http://schemas.openxmlformats.org/wordprocessingml/2006/main" xmlns:w14="http://schemas.microsoft.com/office/word/2010/wordml" xmlns:w15="http://schemas.microsoft.com/office/word/2012/wordml" xmlns:r="http://schemas.openxmlformats.org/officeDocument/2006/relationships" xmlns:m="http://schemas.openxmlformats.org/officeDocument/2006/math" xmlns:wp="http://schemas.openxmlformats.org/drawingml/2006/wordprocessingDrawing" xmlns:a="http://schemas.openxmlformats.org/drawingml/2006/main" xmlns:wp14="http://schemas.microsoft.com/office/word/2010/wordprocessingDrawing" xmlns:mc="http://schemas.openxmlformats.org/markup-compatibility/2006" xmlns:a14="http://schemas.microsoft.com/office/drawing/2010/main" xmlns:sl="http://schemas.openxmlformats.org/schemaLibrary/2006/main" xmlns:wne="http://schemas.microsoft.com/office/word/2006/wordml" xmlns:c="http://schemas.openxmlformats.org/drawingml/2006/chart" xmlns:cdr="http://schemas.openxmlformats.org/drawingml/2006/chartDrawing" xmlns:c14="http://schemas.microsoft.com/office/drawing/2007/8/2/chart" xmlns:dgm="http://schemas.openxmlformats.org/drawingml/2006/diagram" xmlns:pic="http://schemas.openxmlformats.org/drawingml/2006/picture" xmlns:xdr="http://schemas.openxmlformats.org/drawingml/2006/spreadsheetDrawing" xmlns:dsp="http://schemas.microsoft.com/office/drawing/2008/diagram" xmlns:o="urn:schemas-microsoft-com:office:office" xmlns:v="urn:schemas-microsoft-com:vml" xmlns:w10="urn:schemas-microsoft-com:office:word" xmlns:xvml="urn:schemas-microsoft-com:office:excel" xmlns:pvml="urn:schemas-microsoft-com:office:powerpoint" xmlns:ns25="urn:docx4j:vml:root" xmlns:cppr="http://schemas.microsoft.com/office/2006/coverPageProps" xmlns:odx="http://opendope.org/xpaths" xmlns:odc="http://opendope.org/conditions" xmlns:odq="http://opendope.org/questions" xmlns:oda="http://opendope.org/answers" xmlns:odi="http://opendope.org/components" xmlns:odgm="http://opendope.org/SmartArt/DataHierarchy" xmlns:b="http://schemas.openxmlformats.org/officeDocument/2006/bibliography" xmlns:msink="http://schemas.microsoft.com/ink/2010/main" xmlns:cdr14="http://schemas.microsoft.com/office/drawing/2010/chartDrawing" xmlns:c15="http://schemas.microsoft.com/office/drawing/2012/chart" xmlns:cs="http://schemas.microsoft.com/office/drawing/2012/chartStyle" xmlns:ns38="http://www.w3.org/1998/Math/MathML" xmlns:ns39="http://www.w3.org/2003/InkML" xmlns:a13cmd="http://schemas.microsoft.com/office/drawing/2013/main/command" xmlns:cx="http://schemas.microsoft.com/office/drawing/2014/chartex" xmlns:c16="http://schemas.microsoft.com/office/drawing/2014/chart" xmlns:dgm1611="http://schemas.microsoft.com/office/drawing/2016/11/diagram" xmlns:c173="http://schemas.microsoft.com/office/drawing/2017/03/chart" xmlns:am3d="http://schemas.microsoft.com/office/drawing/2017/model3d" xmlns:an18="http://schemas.microsoft.com/office/drawing/2018/animation" xmlns:anam3d="http://schemas.microsoft.com/office/drawing/2018/animation/model3d" xmlns:iact="http://schemas.microsoft.com/office/powerpoint/2014/inkAction" xmlns:thm15="http://schemas.microsoft.com/office/thememl/2012/main" xmlns:wps="http://schemas.microsoft.com/office/word/2010/wordprocessingShape" xmlns:wpc="http://schemas.microsoft.com/office/word/2010/wordprocessingCanvas" xmlns:wpg="http://schemas.microsoft.com/office/word/2010/wordprocessingGroup" xmlns:w16se="http://schemas.microsoft.com/office/word/2015/wordml/symex" xmlns:w16cid="http://schemas.microsoft.com/office/word/2016/wordml/cid" xmlns:wetp="http://schemas.microsoft.com/office/webextensions/taskpanes/2010/11" xmlns:we="http://schemas.microsoft.com/office/webextensions/webextension/2010/11" xmlns:comp="http://schemas.openxmlformats.org/drawingml/2006/compatibility" xmlns:lc="http://schemas.openxmlformats.org/drawingml/2006/lockedCanvas" xmlns:dgm14="http://schemas.microsoft.com/office/drawing/2010/diagram" xmlns:a15="http://schemas.microsoft.com/office/drawing/2012/main" xmlns:pic14="http://schemas.microsoft.com/office/drawing/2010/picture" xmlns:c16ac="http://schemas.microsoft.com/office/drawing/2014/chart/ac" xmlns:a16="http://schemas.microsoft.com/office/drawing/2014/main" xmlns:a1611="http://schemas.microsoft.com/office/drawing/2016/11/main" xmlns:dgm1612="http://schemas.microsoft.com/office/drawing/2016/12/diagram" xmlns:a16svg="http://schemas.microsoft.com/office/drawing/2016/SVG/main" xmlns:adec="http://schemas.microsoft.com/office/drawing/2017/decorative" xmlns:a18hc="http://schemas.microsoft.com/office/drawing/2018/hyperlinkcolor" xmlns:wp15="http://schemas.microsoft.com/office/word/2012/wordprocessingDrawing" SelectedStyle="\APA.XSL" StyleName="APA"/>
+<b:Sources xmlns:w="http://schemas.openxmlformats.org/wordprocessingml/2006/main" xmlns:w15="http://schemas.microsoft.com/office/word/2012/wordml" xmlns:w14="http://schemas.microsoft.com/office/word/2010/wordml" xmlns:r="http://schemas.openxmlformats.org/officeDocument/2006/relationships" xmlns:m="http://schemas.openxmlformats.org/officeDocument/2006/math" xmlns:wp="http://schemas.openxmlformats.org/drawingml/2006/wordprocessingDrawing" xmlns:a="http://schemas.openxmlformats.org/drawingml/2006/main" xmlns:wp14="http://schemas.microsoft.com/office/word/2010/wordprocessingDrawing" xmlns:mc="http://schemas.openxmlformats.org/markup-compatibility/2006" xmlns:a14="http://schemas.microsoft.com/office/drawing/2010/main" xmlns:sl="http://schemas.openxmlformats.org/schemaLibrary/2006/main" xmlns:wne="http://schemas.microsoft.com/office/word/2006/wordml" xmlns:c="http://schemas.openxmlformats.org/drawingml/2006/chart" xmlns:cdr="http://schemas.openxmlformats.org/drawingml/2006/chartDrawing" xmlns:c14="http://schemas.microsoft.com/office/drawing/2007/8/2/chart" xmlns:dgm="http://schemas.openxmlformats.org/drawingml/2006/diagram" xmlns:pic="http://schemas.openxmlformats.org/drawingml/2006/picture" xmlns:xdr="http://schemas.openxmlformats.org/drawingml/2006/spreadsheetDrawing" xmlns:dsp="http://schemas.microsoft.com/office/drawing/2008/diagram" xmlns:o="urn:schemas-microsoft-com:office:office" xmlns:v="urn:schemas-microsoft-com:vml" xmlns:w10="urn:schemas-microsoft-com:office:word" xmlns:xvml="urn:schemas-microsoft-com:office:excel" xmlns:pvml="urn:schemas-microsoft-com:office:powerpoint" xmlns:ns25="urn:docx4j:vml:root" xmlns:cppr="http://schemas.microsoft.com/office/2006/coverPageProps" xmlns:odx="http://opendope.org/xpaths" xmlns:odc="http://opendope.org/conditions" xmlns:odq="http://opendope.org/questions" xmlns:oda="http://opendope.org/answers" xmlns:odi="http://opendope.org/components" xmlns:odgm="http://opendope.org/SmartArt/DataHierarchy" xmlns:b="http://schemas.openxmlformats.org/officeDocument/2006/bibliography" xmlns:msink="http://schemas.microsoft.com/ink/2010/main" xmlns:cdr14="http://schemas.microsoft.com/office/drawing/2010/chartDrawing" xmlns:c15="http://schemas.microsoft.com/office/drawing/2012/chart" xmlns:cs="http://schemas.microsoft.com/office/drawing/2012/chartStyle" xmlns:ns38="http://www.w3.org/1998/Math/MathML" xmlns:ns39="http://www.w3.org/2003/InkML" xmlns:a13cmd="http://schemas.microsoft.com/office/drawing/2013/main/command" xmlns:cx="http://schemas.microsoft.com/office/drawing/2014/chartex" xmlns:c16="http://schemas.microsoft.com/office/drawing/2014/chart" xmlns:dgm1611="http://schemas.microsoft.com/office/drawing/2016/11/diagram" xmlns:c173="http://schemas.microsoft.com/office/drawing/2017/03/chart" xmlns:am3d="http://schemas.microsoft.com/office/drawing/2017/model3d" xmlns:an18="http://schemas.microsoft.com/office/drawing/2018/animation" xmlns:anam3d="http://schemas.microsoft.com/office/drawing/2018/animation/model3d" xmlns:iact="http://schemas.microsoft.com/office/powerpoint/2014/inkAction" xmlns:thm15="http://schemas.microsoft.com/office/thememl/2012/main" xmlns:wps="http://schemas.microsoft.com/office/word/2010/wordprocessingShape" xmlns:wpc="http://schemas.microsoft.com/office/word/2010/wordprocessingCanvas" xmlns:wpg="http://schemas.microsoft.com/office/word/2010/wordprocessingGroup" xmlns:w16se="http://schemas.microsoft.com/office/word/2015/wordml/symex" xmlns:w16cid="http://schemas.microsoft.com/office/word/2016/wordml/cid" xmlns:wetp="http://schemas.microsoft.com/office/webextensions/taskpanes/2010/11" xmlns:we="http://schemas.microsoft.com/office/webextensions/webextension/2010/11" xmlns:comp="http://schemas.openxmlformats.org/drawingml/2006/compatibility" xmlns:lc="http://schemas.openxmlformats.org/drawingml/2006/lockedCanvas" xmlns:dgm14="http://schemas.microsoft.com/office/drawing/2010/diagram" xmlns:a15="http://schemas.microsoft.com/office/drawing/2012/main" xmlns:pic14="http://schemas.microsoft.com/office/drawing/2010/picture" xmlns:c16ac="http://schemas.microsoft.com/office/drawing/2014/chart/ac" xmlns:a16="http://schemas.microsoft.com/office/drawing/2014/main" xmlns:a1611="http://schemas.microsoft.com/office/drawing/2016/11/main" xmlns:dgm1612="http://schemas.microsoft.com/office/drawing/2016/12/diagram" xmlns:a16svg="http://schemas.microsoft.com/office/drawing/2016/SVG/main" xmlns:adec="http://schemas.microsoft.com/office/drawing/2017/decorative" xmlns:a18hc="http://schemas.microsoft.com/office/drawing/2018/hyperlinkcolor" xmlns:wp15="http://schemas.microsoft.com/office/word/2012/wordprocessingDrawing" SelectedStyle="\APA.XSL" StyleName="APA"/>
 </file>
 
 <file path=customXml/item4.xml><?xml version="1.0" encoding="utf-8"?>
-<b:Sources xmlns:w="http://schemas.openxmlformats.org/wordprocessingml/2006/main" xmlns:w14="http://schemas.microsoft.com/office/word/2010/wordml" xmlns:w15="http://schemas.microsoft.com/office/word/2012/wordml" xmlns:r="http://schemas.openxmlformats.org/officeDocument/2006/relationships" xmlns:m="http://schemas.openxmlformats.org/officeDocument/2006/math" xmlns:wp="http://schemas.openxmlformats.org/drawingml/2006/wordprocessingDrawing" xmlns:a="http://schemas.openxmlformats.org/drawingml/2006/main" xmlns:wp14="http://schemas.microsoft.com/office/word/2010/wordprocessingDrawing" xmlns:mc="http://schemas.openxmlformats.org/markup-compatibility/2006" xmlns:a14="http://schemas.microsoft.com/office/drawing/2010/main" xmlns:sl="http://schemas.openxmlformats.org/schemaLibrary/2006/main" xmlns:wne="http://schemas.microsoft.com/office/word/2006/wordml" xmlns:c="http://schemas.openxmlformats.org/drawingml/2006/chart" xmlns:cdr="http://schemas.openxmlformats.org/drawingml/2006/chartDrawing" xmlns:c14="http://schemas.microsoft.com/office/drawing/2007/8/2/chart" xmlns:dgm="http://schemas.openxmlformats.org/drawingml/2006/diagram" xmlns:pic="http://schemas.openxmlformats.org/drawingml/2006/picture" xmlns:xdr="http://schemas.openxmlformats.org/drawingml/2006/spreadsheetDrawing" xmlns:dsp="http://schemas.microsoft.com/office/drawing/2008/diagram" xmlns:o="urn:schemas-microsoft-com:office:office" xmlns:v="urn:schemas-microsoft-com:vml" xmlns:w10="urn:schemas-microsoft-com:office:word" xmlns:xvml="urn:schemas-microsoft-com:office:excel" xmlns:pvml="urn:schemas-microsoft-com:office:powerpoint" xmlns:ns25="urn:docx4j:vml:root" xmlns:cppr="http://schemas.microsoft.com/office/2006/coverPageProps" xmlns:odx="http://opendope.org/xpaths" xmlns:odc="http://opendope.org/conditions" xmlns:odq="http://opendope.org/questions" xmlns:oda="http://opendope.org/answers" xmlns:odi="http://opendope.org/components" xmlns:odgm="http://opendope.org/SmartArt/DataHierarchy" xmlns:b="http://schemas.openxmlformats.org/officeDocument/2006/bibliography" xmlns:msink="http://schemas.microsoft.com/ink/2010/main" xmlns:cdr14="http://schemas.microsoft.com/office/drawing/2010/chartDrawing" xmlns:c15="http://schemas.microsoft.com/office/drawing/2012/chart" xmlns:cs="http://schemas.microsoft.com/office/drawing/2012/chartStyle" xmlns:ns38="http://www.w3.org/1998/Math/MathML" xmlns:ns39="http://www.w3.org/2003/InkML" xmlns:a13cmd="http://schemas.microsoft.com/office/drawing/2013/main/command" xmlns:cx="http://schemas.microsoft.com/office/drawing/2014/chartex" xmlns:c16="http://schemas.microsoft.com/office/drawing/2014/chart" xmlns:dgm1611="http://schemas.microsoft.com/office/drawing/2016/11/diagram" xmlns:c173="http://schemas.microsoft.com/office/drawing/2017/03/chart" xmlns:am3d="http://schemas.microsoft.com/office/drawing/2017/model3d" xmlns:an18="http://schemas.microsoft.com/office/drawing/2018/animation" xmlns:anam3d="http://schemas.microsoft.com/office/drawing/2018/animation/model3d" xmlns:iact="http://schemas.microsoft.com/office/powerpoint/2014/inkAction" xmlns:thm15="http://schemas.microsoft.com/office/thememl/2012/main" xmlns:wps="http://schemas.microsoft.com/office/word/2010/wordprocessingShape" xmlns:wpc="http://schemas.microsoft.com/office/word/2010/wordprocessingCanvas" xmlns:wpg="http://schemas.microsoft.com/office/word/2010/wordprocessingGroup" xmlns:w16se="http://schemas.microsoft.com/office/word/2015/wordml/symex" xmlns:w16cid="http://schemas.microsoft.com/office/word/2016/wordml/cid" xmlns:wetp="http://schemas.microsoft.com/office/webextensions/taskpanes/2010/11" xmlns:we="http://schemas.microsoft.com/office/webextensions/webextension/2010/11" xmlns:comp="http://schemas.openxmlformats.org/drawingml/2006/compatibility" xmlns:lc="http://schemas.openxmlformats.org/drawingml/2006/lockedCanvas" xmlns:dgm14="http://schemas.microsoft.com/office/drawing/2010/diagram" xmlns:a15="http://schemas.microsoft.com/office/drawing/2012/main" xmlns:pic14="http://schemas.microsoft.com/office/drawing/2010/picture" xmlns:c16ac="http://schemas.microsoft.com/office/drawing/2014/chart/ac" xmlns:a16="http://schemas.microsoft.com/office/drawing/2014/main" xmlns:a1611="http://schemas.microsoft.com/office/drawing/2016/11/main" xmlns:dgm1612="http://schemas.microsoft.com/office/drawing/2016/12/diagram" xmlns:a16svg="http://schemas.microsoft.com/office/drawing/2016/SVG/main" xmlns:adec="http://schemas.microsoft.com/office/drawing/2017/decorative" xmlns:a18hc="http://schemas.microsoft.com/office/drawing/2018/hyperlinkcolor" xmlns:wp15="http://schemas.microsoft.com/office/word/2012/wordprocessingDrawing" SelectedStyle="\APA.XSL" StyleName="APA"/>
+<b:Sources xmlns:w="http://schemas.openxmlformats.org/wordprocessingml/2006/main" xmlns:w15="http://schemas.microsoft.com/office/word/2012/wordml" xmlns:w14="http://schemas.microsoft.com/office/word/2010/wordml" xmlns:r="http://schemas.openxmlformats.org/officeDocument/2006/relationships" xmlns:m="http://schemas.openxmlformats.org/officeDocument/2006/math" xmlns:wp="http://schemas.openxmlformats.org/drawingml/2006/wordprocessingDrawing" xmlns:a="http://schemas.openxmlformats.org/drawingml/2006/main" xmlns:wp14="http://schemas.microsoft.com/office/word/2010/wordprocessingDrawing" xmlns:mc="http://schemas.openxmlformats.org/markup-compatibility/2006" xmlns:a14="http://schemas.microsoft.com/office/drawing/2010/main" xmlns:sl="http://schemas.openxmlformats.org/schemaLibrary/2006/main" xmlns:wne="http://schemas.microsoft.com/office/word/2006/wordml" xmlns:c="http://schemas.openxmlformats.org/drawingml/2006/chart" xmlns:cdr="http://schemas.openxmlformats.org/drawingml/2006/chartDrawing" xmlns:c14="http://schemas.microsoft.com/office/drawing/2007/8/2/chart" xmlns:dgm="http://schemas.openxmlformats.org/drawingml/2006/diagram" xmlns:pic="http://schemas.openxmlformats.org/drawingml/2006/picture" xmlns:xdr="http://schemas.openxmlformats.org/drawingml/2006/spreadsheetDrawing" xmlns:dsp="http://schemas.microsoft.com/office/drawing/2008/diagram" xmlns:o="urn:schemas-microsoft-com:office:office" xmlns:v="urn:schemas-microsoft-com:vml" xmlns:w10="urn:schemas-microsoft-com:office:word" xmlns:xvml="urn:schemas-microsoft-com:office:excel" xmlns:pvml="urn:schemas-microsoft-com:office:powerpoint" xmlns:ns25="urn:docx4j:vml:root" xmlns:cppr="http://schemas.microsoft.com/office/2006/coverPageProps" xmlns:odx="http://opendope.org/xpaths" xmlns:odc="http://opendope.org/conditions" xmlns:odq="http://opendope.org/questions" xmlns:oda="http://opendope.org/answers" xmlns:odi="http://opendope.org/components" xmlns:odgm="http://opendope.org/SmartArt/DataHierarchy" xmlns:b="http://schemas.openxmlformats.org/officeDocument/2006/bibliography" xmlns:msink="http://schemas.microsoft.com/ink/2010/main" xmlns:cdr14="http://schemas.microsoft.com/office/drawing/2010/chartDrawing" xmlns:c15="http://schemas.microsoft.com/office/drawing/2012/chart" xmlns:cs="http://schemas.microsoft.com/office/drawing/2012/chartStyle" xmlns:ns38="http://www.w3.org/1998/Math/MathML" xmlns:ns39="http://www.w3.org/2003/InkML" xmlns:a13cmd="http://schemas.microsoft.com/office/drawing/2013/main/command" xmlns:cx="http://schemas.microsoft.com/office/drawing/2014/chartex" xmlns:c16="http://schemas.microsoft.com/office/drawing/2014/chart" xmlns:dgm1611="http://schemas.microsoft.com/office/drawing/2016/11/diagram" xmlns:c173="http://schemas.microsoft.com/office/drawing/2017/03/chart" xmlns:am3d="http://schemas.microsoft.com/office/drawing/2017/model3d" xmlns:an18="http://schemas.microsoft.com/office/drawing/2018/animation" xmlns:anam3d="http://schemas.microsoft.com/office/drawing/2018/animation/model3d" xmlns:iact="http://schemas.microsoft.com/office/powerpoint/2014/inkAction" xmlns:thm15="http://schemas.microsoft.com/office/thememl/2012/main" xmlns:wps="http://schemas.microsoft.com/office/word/2010/wordprocessingShape" xmlns:wpc="http://schemas.microsoft.com/office/word/2010/wordprocessingCanvas" xmlns:wpg="http://schemas.microsoft.com/office/word/2010/wordprocessingGroup" xmlns:w16se="http://schemas.microsoft.com/office/word/2015/wordml/symex" xmlns:w16cid="http://schemas.microsoft.com/office/word/2016/wordml/cid" xmlns:wetp="http://schemas.microsoft.com/office/webextensions/taskpanes/2010/11" xmlns:we="http://schemas.microsoft.com/office/webextensions/webextension/2010/11" xmlns:comp="http://schemas.openxmlformats.org/drawingml/2006/compatibility" xmlns:lc="http://schemas.openxmlformats.org/drawingml/2006/lockedCanvas" xmlns:dgm14="http://schemas.microsoft.com/office/drawing/2010/diagram" xmlns:a15="http://schemas.microsoft.com/office/drawing/2012/main" xmlns:pic14="http://schemas.microsoft.com/office/drawing/2010/picture" xmlns:c16ac="http://schemas.microsoft.com/office/drawing/2014/chart/ac" xmlns:a16="http://schemas.microsoft.com/office/drawing/2014/main" xmlns:a1611="http://schemas.microsoft.com/office/drawing/2016/11/main" xmlns:dgm1612="http://schemas.microsoft.com/office/drawing/2016/12/diagram" xmlns:a16svg="http://schemas.microsoft.com/office/drawing/2016/SVG/main" xmlns:adec="http://schemas.microsoft.com/office/drawing/2017/decorative" xmlns:a18hc="http://schemas.microsoft.com/office/drawing/2018/hyperlinkcolor" xmlns:wp15="http://schemas.microsoft.com/office/word/2012/wordprocessingDrawing" SelectedStyle="\APA.XSL" StyleName="APA"/>
 </file>
 
 <file path=customXml/item5.xml><?xml version="1.0" encoding="utf-8"?>

</xml_diff>

<commit_message>
Getting Started: the guide is for docx4j 17.0.6
The version statement, the dependency instructions and the pom snippets
say 17.0.6; "builds on Linux, macOS and Windows (from 17.0.5)" stays as
history, and the PDF-quality sentence now reads "improved in 17.0.5 and
again in 17.0.6".  Outputs regenerated.

Co-Authored-By: Claude Fable 5.1 <noreply@anthropic.com>
Claude-Session: https://claude.ai/code/session_01X5GpYdwigELiETnUnwTu5S
</commit_message>
<xml_diff>
--- a/docs/Docx4j_GettingStarted.docx
+++ b/docs/Docx4j_GettingStarted.docx
@@ -5445,7 +5445,7 @@
           <w:b/>
         </w:rPr>
         <w:lastRenderedPageBreak/>
-        <w:t xml:space="preserve">This guide is for docx4j 17.0.5 (Java 11 and later); most of it applies to 11.5.x as well.   </w:t>
+        <w:t xml:space="preserve">This guide is for docx4j 17.0.6 (Java 11 and later); most of it applies to 11.5.x as well.   </w:t>
       </w:r>
     </w:p>
     <w:p>
@@ -6719,7 +6719,7 @@
         <w:rPr>
           <w:lang w:val="en-US"/>
         </w:rPr>
-        <w:t xml:space="preserve">To use docx4j 17.0.5, ensure any code references </w:t>
+        <w:t xml:space="preserve">To use docx4j 17.0.6, ensure any code references </w:t>
       </w:r>
       <w:r>
         <w:rPr>
@@ -6983,7 +6983,7 @@
           <w:szCs w:val="16"/>
           <w:lang w:val="en-US"/>
         </w:rPr>
-        <w:t>17.0.5</w:t>
+        <w:t>17.0.6</w:t>
       </w:r>
       <w:r>
         <w:rPr>
@@ -7267,7 +7267,7 @@
           <w:szCs w:val="16"/>
           <w:lang w:val="en-US"/>
         </w:rPr>
-        <w:t>17.0.5</w:t>
+        <w:t>17.0.6</w:t>
       </w:r>
       <w:r>
         <w:rPr>
@@ -25330,7 +25330,7 @@
     </w:p>
     <w:p>
       <w:r>
-        <w:t xml:space="preserve">PDF output via XSL FO is substantially improved in 17.0.5: line breaking, line height and placement, tab stops, paragraph spacing, list labels, tables, columns, footnotes and kerning now follow the rules </w:t>
+        <w:t xml:space="preserve">PDF output via XSL FO is substantially improved in 17.0.5 and again in 17.0.6: line breaking, line height and placement, tab stops, paragraph spacing, list labels, tables, columns, footnotes and kerning now follow the rules </w:t>
       </w:r>
       <w:r>
         <w:lastRenderedPageBreak/>

</xml_diff>

<commit_message>
Getting Started: hyphenation in PDF output via XSL FO (document-driven; net.sf.offo:fop-hyph for patterns)
Under "docx to PDF via XSL FO", before the bullet/symbol note: from
17.0.6 hyphenation follows the document's settings.xml (autoHyphenation,
hyphenationZone, consecutiveHyphenLimit, doNotHyphenateCaps,
suppressAutoHyphens); FOP ships no patterns and the usual set is not
Apache-licensed, so add net.sf.offo:fop-hyph:2.0 (pom snippet in the
guide's style); docx4j.convert.out.fo.hyphenate overrides the document;
the proofing-tools and TeX-pattern caveats.  Outputs regenerated.

Co-Authored-By: Claude Fable 5.1 <noreply@anthropic.com>
Claude-Session: https://claude.ai/code/session_01X5GpYdwigELiETnUnwTu5S
</commit_message>
<xml_diff>
--- a/docs/Docx4j_GettingStarted.docx
+++ b/docs/Docx4j_GettingStarted.docx
@@ -25365,6 +25365,128 @@
     <w:p>
       <w:r>
         <w:t xml:space="preserve">These jars are in the zip file, in dir optional/export-fo  </w:t>
+      </w:r>
+    </w:p>
+    <w:p>
+      <w:r>
+        <w:rPr>
+          <w:b/>
+          <w:bCs/>
+        </w:rPr>
+        <w:t xml:space="preserve">Hyphenation.  </w:t>
+      </w:r>
+      <w:r>
+        <w:t xml:space="preserve">From 17.0.6, hyphenation in PDF output is driven by the document, as in Word: docx4j reads w:autoHyphenation, w:hyphenationZone, w:consecutiveHyphenLimit and w:doNotHyphenateCaps from settings.xml (and w:suppressAutoHyphens on a paragraph), and hyphenates only where the document asks for it.  Nothing needs configuring per document.</w:t>
+      </w:r>
+    </w:p>
+    <w:p>
+      <w:r>
+        <w:t xml:space="preserve">FOP hyphenates from TeX pattern files and ships none, and the usual set is not under the Apache licence, so docx4j-export-fo does not depend on it.  To get hyphenated output, add the patterns to your own classpath:</w:t>
+      </w:r>
+    </w:p>
+    <w:p>
+      <w:pPr>
+        <w:spacing w:after="0"/>
+        <w:rPr>
+          <w:rFonts w:ascii="Consolas" w:hAnsi="Consolas"/>
+          <w:sz w:val="16"/>
+          <w:szCs w:val="16"/>
+          <w:lang w:val="en-US"/>
+        </w:rPr>
+      </w:pPr>
+      <w:r>
+        <w:rPr>
+          <w:rFonts w:ascii="Consolas" w:hAnsi="Consolas"/>
+          <w:sz w:val="16"/>
+          <w:szCs w:val="16"/>
+          <w:lang w:val="en-US"/>
+        </w:rPr>
+        <w:t xml:space="preserve">		&lt;dependency&gt;</w:t>
+      </w:r>
+    </w:p>
+    <w:p>
+      <w:pPr>
+        <w:spacing w:after="0"/>
+        <w:rPr>
+          <w:rFonts w:ascii="Consolas" w:hAnsi="Consolas"/>
+          <w:sz w:val="16"/>
+          <w:szCs w:val="16"/>
+          <w:lang w:val="en-US"/>
+        </w:rPr>
+      </w:pPr>
+      <w:r>
+        <w:rPr>
+          <w:rFonts w:ascii="Consolas" w:hAnsi="Consolas"/>
+          <w:sz w:val="16"/>
+          <w:szCs w:val="16"/>
+          <w:lang w:val="en-US"/>
+        </w:rPr>
+        <w:t xml:space="preserve">			&lt;groupId&gt;net.sf.offo&lt;/groupId&gt;</w:t>
+      </w:r>
+    </w:p>
+    <w:p>
+      <w:pPr>
+        <w:spacing w:after="0"/>
+        <w:rPr>
+          <w:rFonts w:ascii="Consolas" w:hAnsi="Consolas"/>
+          <w:sz w:val="16"/>
+          <w:szCs w:val="16"/>
+          <w:lang w:val="en-US"/>
+        </w:rPr>
+      </w:pPr>
+      <w:r>
+        <w:rPr>
+          <w:rFonts w:ascii="Consolas" w:hAnsi="Consolas"/>
+          <w:sz w:val="16"/>
+          <w:szCs w:val="16"/>
+          <w:lang w:val="en-US"/>
+        </w:rPr>
+        <w:t xml:space="preserve">			&lt;artifactId&gt;fop-hyph&lt;/artifactId&gt;</w:t>
+      </w:r>
+    </w:p>
+    <w:p>
+      <w:pPr>
+        <w:spacing w:after="0"/>
+        <w:rPr>
+          <w:rFonts w:ascii="Consolas" w:hAnsi="Consolas"/>
+          <w:sz w:val="16"/>
+          <w:szCs w:val="16"/>
+          <w:lang w:val="en-US"/>
+        </w:rPr>
+      </w:pPr>
+      <w:r>
+        <w:rPr>
+          <w:rFonts w:ascii="Consolas" w:hAnsi="Consolas"/>
+          <w:sz w:val="16"/>
+          <w:szCs w:val="16"/>
+          <w:lang w:val="en-US"/>
+        </w:rPr>
+        <w:t xml:space="preserve">			&lt;version&gt;2.0&lt;/version&gt;</w:t>
+      </w:r>
+    </w:p>
+    <w:p>
+      <w:pPr>
+        <w:spacing w:after="0"/>
+        <w:rPr>
+          <w:rFonts w:ascii="Consolas" w:hAnsi="Consolas"/>
+          <w:sz w:val="16"/>
+          <w:szCs w:val="16"/>
+          <w:lang w:val="en-US"/>
+        </w:rPr>
+      </w:pPr>
+      <w:r>
+        <w:rPr>
+          <w:rFonts w:ascii="Consolas" w:hAnsi="Consolas"/>
+          <w:sz w:val="16"/>
+          <w:szCs w:val="16"/>
+          <w:lang w:val="en-US"/>
+        </w:rPr>
+        <w:t xml:space="preserve">		&lt;/dependency&gt;</w:t>
+      </w:r>
+    </w:p>
+    <w:p>
+      <w:r>
+        <w:t xml:space="preserve">Without patterns the document's setting is honoured but nothing can be hyphenated (FOP logs that no pattern was found for the language).  The property docx4j.convert.out.fo.hyphenate overrides the document: true or false forces hyphenation on or off; leave it unset to let each document decide.  Two things to know: Word hyphenates a language only where its proofing tools are installed on the machine that laid the document out, which the docx does not record, so Word's PDF and docx4j's can differ for a language the author did not have installed; and the patterns are TeX's rather than Word's dictionary, so an occasional break point differs.</w:t>
       </w:r>
     </w:p>
     <w:p>

</xml_diff>

<commit_message>
Release renamed 17.0.6 -> 17.1.0 (new metafile rendering, layout-fidelity defaults)
Mechanical: pom revision and scm tag, every @since / "since 17.0.6" in source,
properties, layout docs, tests, samples, and the Getting Started guide
(docx edited, md/html/pdf regenerated).  CHANGELOG's section heading is
renamed in the working copy, left for its author to commit with the
condensed notes.

Why a minor bump: new exported packages and API (org.docx4j.org.apache.poi
hwmf/hemf, MetafileRenderer, MetafileSvgProvider, Docx4J.updateToc),
wmf2svg dropped and batik-gvt restored as dependencies, and the Word
layout rules change default PDF output.

Co-Authored-By: Claude Fable 5.1 <noreply@anthropic.com>
Claude-Session: https://claude.ai/code/session_01X5GpYdwigELiETnUnwTu5S
</commit_message>
<xml_diff>
--- a/docs/Docx4j_GettingStarted.docx
+++ b/docs/Docx4j_GettingStarted.docx
@@ -2,7 +2,7 @@
 <file path=word/document.xml><?xml version="1.0" encoding="utf-8"?>
 <w:document xmlns:w="http://schemas.openxmlformats.org/wordprocessingml/2006/main" xmlns:w14="http://schemas.microsoft.com/office/word/2010/wordml" xmlns:w15="http://schemas.microsoft.com/office/word/2012/wordml" xmlns:r="http://schemas.openxmlformats.org/officeDocument/2006/relationships" xmlns:m="http://schemas.openxmlformats.org/officeDocument/2006/math" xmlns:wp="http://schemas.openxmlformats.org/drawingml/2006/wordprocessingDrawing" xmlns:a="http://schemas.openxmlformats.org/drawingml/2006/main" xmlns:wp14="http://schemas.microsoft.com/office/word/2010/wordprocessingDrawing" xmlns:mc="http://schemas.openxmlformats.org/markup-compatibility/2006" xmlns:a14="http://schemas.microsoft.com/office/drawing/2010/main" xmlns:sl="http://schemas.openxmlformats.org/schemaLibrary/2006/main" xmlns:wne="http://schemas.microsoft.com/office/word/2006/wordml" xmlns:c="http://schemas.openxmlformats.org/drawingml/2006/chart" xmlns:cdr="http://schemas.openxmlformats.org/drawingml/2006/chartDrawing" xmlns:c14="http://schemas.microsoft.com/office/drawing/2007/8/2/chart" xmlns:dgm="http://schemas.openxmlformats.org/drawingml/2006/diagram" xmlns:pic="http://schemas.openxmlformats.org/drawingml/2006/picture" xmlns:xdr="http://schemas.openxmlformats.org/drawingml/2006/spreadsheetDrawing" xmlns:dsp="http://schemas.microsoft.com/office/drawing/2008/diagram" xmlns:o="urn:schemas-microsoft-com:office:office" xmlns:v="urn:schemas-microsoft-com:vml" xmlns:w10="urn:schemas-microsoft-com:office:word" xmlns:xvml="urn:schemas-microsoft-com:office:excel" xmlns:pvml="urn:schemas-microsoft-com:office:powerpoint" xmlns:ns25="urn:docx4j:vml:root" xmlns:cppr="http://schemas.microsoft.com/office/2006/coverPageProps" xmlns:odx="http://opendope.org/xpaths" xmlns:odc="http://opendope.org/conditions" xmlns:odq="http://opendope.org/questions" xmlns:oda="http://opendope.org/answers" xmlns:odi="http://opendope.org/components" xmlns:odgm="http://opendope.org/SmartArt/DataHierarchy" xmlns:b="http://schemas.openxmlformats.org/officeDocument/2006/bibliography" xmlns:msink="http://schemas.microsoft.com/ink/2010/main" xmlns:cdr14="http://schemas.microsoft.com/office/drawing/2010/chartDrawing" xmlns:c15="http://schemas.microsoft.com/office/drawing/2012/chart" xmlns:cs="http://schemas.microsoft.com/office/drawing/2012/chartStyle" xmlns:ns38="http://www.w3.org/1998/Math/MathML" xmlns:ns39="http://www.w3.org/2003/InkML" xmlns:a13cmd="http://schemas.microsoft.com/office/drawing/2013/main/command" xmlns:cx="http://schemas.microsoft.com/office/drawing/2014/chartex" xmlns:c16="http://schemas.microsoft.com/office/drawing/2014/chart" xmlns:dgm1611="http://schemas.microsoft.com/office/drawing/2016/11/diagram" xmlns:c173="http://schemas.microsoft.com/office/drawing/2017/03/chart" xmlns:am3d="http://schemas.microsoft.com/office/drawing/2017/model3d" xmlns:an18="http://schemas.microsoft.com/office/drawing/2018/animation" xmlns:anam3d="http://schemas.microsoft.com/office/drawing/2018/animation/model3d" xmlns:iact="http://schemas.microsoft.com/office/powerpoint/2014/inkAction" xmlns:thm15="http://schemas.microsoft.com/office/thememl/2012/main" xmlns:wps="http://schemas.microsoft.com/office/word/2010/wordprocessingShape" xmlns:wpc="http://schemas.microsoft.com/office/word/2010/wordprocessingCanvas" xmlns:wpg="http://schemas.microsoft.com/office/word/2010/wordprocessingGroup" xmlns:w16se="http://schemas.microsoft.com/office/word/2015/wordml/symex" xmlns:w16cid="http://schemas.microsoft.com/office/word/2016/wordml/cid" xmlns:wetp="http://schemas.microsoft.com/office/webextensions/taskpanes/2010/11" xmlns:we="http://schemas.microsoft.com/office/webextensions/webextension/2010/11" xmlns:comp="http://schemas.openxmlformats.org/drawingml/2006/compatibility" xmlns:lc="http://schemas.openxmlformats.org/drawingml/2006/lockedCanvas" xmlns:dgm14="http://schemas.microsoft.com/office/drawing/2010/diagram" xmlns:a15="http://schemas.microsoft.com/office/drawing/2012/main" xmlns:pic14="http://schemas.microsoft.com/office/drawing/2010/picture" xmlns:c16ac="http://schemas.microsoft.com/office/drawing/2014/chart/ac" xmlns:a16="http://schemas.microsoft.com/office/drawing/2014/main" xmlns:a1611="http://schemas.microsoft.com/office/drawing/2016/11/main" xmlns:dgm1612="http://schemas.microsoft.com/office/drawing/2016/12/diagram" xmlns:a16svg="http://schemas.microsoft.com/office/drawing/2016/SVG/main" xmlns:adec="http://schemas.microsoft.com/office/drawing/2017/decorative" xmlns:a18hc="http://schemas.microsoft.com/office/drawing/2018/hyperlinkcolor" xmlns:wp15="http://schemas.microsoft.com/office/word/2012/wordprocessingDrawing" xmlns:w16cex="http://schemas.microsoft.com/office/word/2018/wordml/cex" xmlns:w16sdtfl="http://schemas.microsoft.com/office/word/2024/wordml/sdtformatlock" xmlns:w16sdtdh="http://schemas.microsoft.com/office/word/2020/wordml/sdtdatahash" xmlns:w16="http://schemas.microsoft.com/office/word/2018/wordml" xmlns:w16du="http://schemas.microsoft.com/office/word/2023/wordml/word16du" mc:Ignorable="w14 w15 w16se w16cid w16 w16cex w16sdtdh w16sdtfl w16du wp14">
   <w:body>
-    <!-- Modified by docx4j 17.0.6-SNAPSHOT (Apache licensed) using REFERENCE JAXB in Arch Linux Java 21.0.12 on Linux -->
+    <!-- Modified by docx4j 17.1.0-SNAPSHOT (Apache licensed) using REFERENCE JAXB in Arch Linux Java 21.0.12 on Linux -->
     <w:p>
       <w:pPr>
         <w:pStyle w:val="Title"/>
@@ -5445,7 +5445,7 @@
           <w:b/>
         </w:rPr>
         <w:lastRenderedPageBreak/>
-        <w:t xml:space="preserve">This guide is for docx4j 17.0.6 (Java 11 and later); most of it applies to 11.5.x as well.   </w:t>
+        <w:t xml:space="preserve">This guide is for docx4j 17.1.0 (Java 11 and later); most of it applies to 11.5.x as well.   </w:t>
       </w:r>
     </w:p>
     <w:p>
@@ -6719,7 +6719,7 @@
         <w:rPr>
           <w:lang w:val="en-US"/>
         </w:rPr>
-        <w:t xml:space="preserve">To use docx4j 17.0.6, ensure any code references </w:t>
+        <w:t xml:space="preserve">To use docx4j 17.1.0, ensure any code references </w:t>
       </w:r>
       <w:r>
         <w:rPr>
@@ -6983,7 +6983,7 @@
           <w:szCs w:val="16"/>
           <w:lang w:val="en-US"/>
         </w:rPr>
-        <w:t>17.0.6</w:t>
+        <w:t>17.1.0</w:t>
       </w:r>
       <w:r>
         <w:rPr>
@@ -7267,7 +7267,7 @@
           <w:szCs w:val="16"/>
           <w:lang w:val="en-US"/>
         </w:rPr>
-        <w:t>17.0.6</w:t>
+        <w:t>17.1.0</w:t>
       </w:r>
       <w:r>
         <w:rPr>
@@ -25330,7 +25330,7 @@
     </w:p>
     <w:p>
       <w:r>
-        <w:t xml:space="preserve">PDF output via XSL FO is substantially improved in 17.0.5 and again in 17.0.6: line breaking, line height and placement, tab stops, paragraph spacing, list labels, tables, columns, footnotes and kerning now follow the rules </w:t>
+        <w:t xml:space="preserve">PDF output via XSL FO is substantially improved in 17.0.5 and again in 17.1.0: line breaking, line height and placement, tab stops, paragraph spacing, list labels, tables, columns, footnotes and kerning now follow the rules </w:t>
       </w:r>
       <w:r>
         <w:lastRenderedPageBreak/>
@@ -25376,7 +25376,7 @@
         <w:t xml:space="preserve">Hyphenation.  </w:t>
       </w:r>
       <w:r>
-        <w:t xml:space="preserve">From 17.0.6, hyphenation in PDF output is driven by the document, as in Word: docx4j reads w:autoHyphenation, w:hyphenationZone, w:consecutiveHyphenLimit and w:doNotHyphenateCaps from settings.xml (and w:suppressAutoHyphens on a paragraph), and hyphenates only where the document asks for it.  Nothing needs configuring per document.</w:t>
+        <w:t xml:space="preserve">From 17.1.0, hyphenation in PDF output is driven by the document, as in Word: docx4j reads w:autoHyphenation, w:hyphenationZone, w:consecutiveHyphenLimit and w:doNotHyphenateCaps from settings.xml (and w:suppressAutoHyphens on a paragraph), and hyphenates only where the document asks for it.  Nothing needs configuring per document.</w:t>
       </w:r>
     </w:p>
     <w:p>
@@ -30555,7 +30555,7 @@
     </w:p>
     <w:p>
       <w:r>
-        <w:t xml:space="preserve">From 17.0.6, docx4j draws Windows metafiles itself, in pure Java, by replaying the metafile's recorded GDI calls (Apache POI's HWMF and HEMF, repackaged into org.docx4j.org.apache.poi).  This covers inline and floating pictures, and the previews Word stores for embedded objects (w:object and w:pict): Equation Editor 3 and MathType equations, pasted Excel ranges, OLE icons.</w:t>
+        <w:t xml:space="preserve">From 17.1.0, docx4j draws Windows metafiles itself, in pure Java, by replaying the metafile's recorded GDI calls (Apache POI's HWMF and HEMF, repackaged into org.docx4j.org.apache.poi).  This covers inline and floating pictures, and the previews Word stores for embedded objects (w:object and w:pict): Equation Editor 3 and MathType equations, pasted Excel ranges, OLE icons.</w:t>
       </w:r>
     </w:p>
     <w:p>

</xml_diff>

<commit_message>
Fonts: IdentityPlusMapper is the advice everywhere; BestMatchingMapper kept for compatibility (CR-016 Decisions 7)
Measured on three real-document corpora in six font environments (CR-016
phase 0c), IdentityPlusMapper is ahead of BestMatchingMapper in every one,
including those without any Microsoft font.  The six samples that chose a
mapper - three of them BestMatchingMapper "for Linux" - now all create an
IdentityPlusMapper with one comment saying why; the Getting Started guide's
font-mapping appendix says the same (the canonical docx, both copies, and the
two sentences patched into the derived md and html; the derived formats are
regenerated whole at release); BestMatchingMapper's javadoc points at
IdentityPlusMapper and says it is kept for compatibility.

Co-Authored-By: Claude Fable 5.1 <noreply@anthropic.com>
Claude-Session: https://claude.ai/code/session_01Ae8dWi7jSKijUffjpHWdr4
</commit_message>
<xml_diff>
--- a/docs/Docx4j_GettingStarted.docx
+++ b/docs/Docx4j_GettingStarted.docx
@@ -39230,20 +39230,20 @@
     </w:p>
     <w:p>
       <w:r>
-        <w:t xml:space="preserve">On a Windows computer, font names for installed fonts are mapped 1:1 to the corresponding physical fonts via the IdentityPlusMapper. </w:t>
-      </w:r>
-    </w:p>
-    <w:p>
-      <w:pPr>
-        <w:rPr>
-          <w:rFonts w:ascii="Consolas" w:hAnsi="Consolas" w:cs="Consolas"/>
-          <w:color w:val="000000"/>
-          <w:sz w:val="16"/>
-          <w:szCs w:val="16"/>
-        </w:rPr>
-      </w:pPr>
-      <w:r>
-        <w:t xml:space="preserve">On a Linux computer, common Microsoft fonts are typically not available. </w:t>
+        <w:t xml:space="preserve">Use IdentityPlusMapper, which the package creates for you when you set none: it maps an installed font by its name, uses a font the document embeds, and for a font the machine lacks takes the metrically compatible substitute (appendix 2), the document's own altName, or a face of the same class.  It is the mapper to use on every platform: measured on three real-document corpora in six font environments, it is ahead of BestMatchingMapper, an older panose-based mapper kept for compatibility, in every one of them, Linux without Microsoft's fonts included. </w:t>
+      </w:r>
+    </w:p>
+    <w:p>
+      <w:pPr>
+        <w:rPr>
+          <w:rFonts w:ascii="Consolas" w:hAnsi="Consolas" w:cs="Consolas"/>
+          <w:color w:val="000000"/>
+          <w:sz w:val="16"/>
+          <w:szCs w:val="16"/>
+        </w:rPr>
+      </w:pPr>
+      <w:r>
+        <w:t xml:space="preserve">On a Linux computer, common Microsoft fonts are typically not available; the substitutes docx4j ships stand in for them. </w:t>
       </w:r>
       <w:r>
         <w:t xml:space="preserve">  See appendix 2 for background and solutions.</w:t>

</xml_diff>